<commit_message>
Restore SIGIZI deletion exclusion and update workflow documentation
Add pregnancy-specific SIGIZI exclusion, audit and regression checks.
Update Word guide, raw-source diagrams and scheduler replacement instructions.
BigQuery deployment and schedule changes remain manual.
</commit_message>
<xml_diff>
--- a/docs/Lombok_Barat_v3_Data_Flow_and_Matching.docx
+++ b/docs/Lombok_Barat_v3_Data_Flow_and_Matching.docx
@@ -23,7 +23,7 @@
         <w:pStyle w:val="CaptionText"/>
       </w:pPr>
       <w:r>
-        <w:t>Workflow edition • actual SQL object names • no population totals or dashboard results</w:t>
+        <w:t>Source-group edition | SIGIZI deletion exclusions | workflow and matching logic</w:t>
       </w:r>
     </w:p>
     <w:p>
@@ -36,7 +36,7 @@
     </w:p>
     <w:p>
       <w:r>
-        <w:t>The data move from source tables into cleaning views, then into stored pregnancy and delivery tables. Reporting views read those tables and supply Looker. The following pages show the actual objects along that path.</w:t>
+        <w:t>Raw SIGIZI and EPUS records supply pregnancy and outcome evidence. SIMRS, Kobo and facility reports add birth evidence. Before building the SIGIZI cohort, compare clinical records with the deleted-pregnancy registry. Exclude qualifying matches, retain their audit trail, then correct geography and build pregnancy episodes. The source families meet in matching and feed reporting views and Looker.</w:t>
       </w:r>
     </w:p>
     <w:p>
@@ -44,552 +44,155 @@
         <w:pStyle w:val="CaptionText"/>
       </w:pPr>
       <w:r>
-        <w:t>All objects belong to project spheres-lombok-barat. Unless another dataset is shown, views and tables are in kohort_bumil_v3. A view runs a query when read; a table stores the result of a build script.</w:t>
+        <w:t>Grey = raw input; blue = view; green = stored table; amber = processing. Unqualified objects are in spheres-lombok-barat.kohort_bumil_v3. Exact source-to-view pairs are in the appendix.</w:t>
+      </w:r>
+    </w:p>
+    <w:p>
+      <w:pPr>
+        <w:spacing w:after="120"/>
+        <w:jc w:val="center"/>
+      </w:pPr>
+      <w:r>
+        <w:drawing>
+          <wp:inline xmlns:a="http://schemas.openxmlformats.org/drawingml/2006/main" xmlns:pic="http://schemas.openxmlformats.org/drawingml/2006/picture">
+            <wp:extent cx="3559580" cy="5166359"/>
+            <wp:docPr id="6" name="Picture 6" descr="SIGIZI clinical raw tables and cleaning views meet the separate raw deletion registry and vs_sigizi_bumil_hapus at the exclusion step, before publishing active source records and correcting geography."/>
+            <wp:cNvGraphicFramePr>
+              <a:graphicFrameLocks noChangeAspect="1"/>
+            </wp:cNvGraphicFramePr>
+            <a:graphic>
+              <a:graphicData uri="http://schemas.openxmlformats.org/drawingml/2006/picture">
+                <pic:pic>
+                  <pic:nvPicPr>
+                    <pic:cNvPr id="0" name="sigizi_sources.png"/>
+                    <pic:cNvPicPr/>
+                  </pic:nvPicPr>
+                  <pic:blipFill>
+                    <a:blip r:embed="rId16"/>
+                    <a:stretch>
+                      <a:fillRect/>
+                    </a:stretch>
+                  </pic:blipFill>
+                  <pic:spPr>
+                    <a:xfrm>
+                      <a:off x="0" y="0"/>
+                      <a:ext cx="3559580" cy="5166359"/>
+                    </a:xfrm>
+                    <a:prstGeom prst="rect"/>
+                  </pic:spPr>
+                </pic:pic>
+              </a:graphicData>
+            </a:graphic>
+          </wp:inline>
+        </w:drawing>
       </w:r>
     </w:p>
     <w:p>
       <w:pPr>
         <w:pStyle w:val="Heading2"/>
+        <w:pageBreakBefore/>
       </w:pPr>
       <w:r>
-        <w:t>Where SIGIZI enters</w:t>
+        <w:t>Where EPUS pregnancy and visit records enter</w:t>
       </w:r>
     </w:p>
-    <w:tbl>
-      <w:tblPr>
-        <w:tblStyle w:val="TableGrid"/>
-        <w:tblW w:type="dxa" w:w="9360"/>
-        <w:jc w:val="left"/>
-        <w:tblLayout w:type="fixed"/>
-        <w:tblLook w:firstColumn="1" w:firstRow="1" w:lastColumn="0" w:lastRow="0" w:noHBand="0" w:noVBand="1" w:val="04A0"/>
-        <w:tblInd w:type="dxa" w:w="120"/>
-      </w:tblPr>
-      <w:tblGrid>
-        <w:gridCol w:w="4680"/>
-        <w:gridCol w:w="4680"/>
-      </w:tblGrid>
-      <w:tr>
-        <w:trPr>
-          <w:cantSplit/>
-          <w:tblHeader/>
-        </w:trPr>
-        <w:tc>
-          <w:tcPr>
-            <w:tcW w:type="dxa" w:w="4680"/>
-            <w:shd w:fill="F2F4F7"/>
-            <w:tcMar>
-              <w:top w:w="80" w:type="dxa"/>
-              <w:bottom w:w="80" w:type="dxa"/>
-              <w:start w:w="120" w:type="dxa"/>
-              <w:end w:w="120" w:type="dxa"/>
-            </w:tcMar>
-          </w:tcPr>
-          <w:p>
-            <w:pPr>
-              <w:pStyle w:val="TableText"/>
-            </w:pPr>
-            <w:r>
-              <w:rPr>
-                <w:b/>
-              </w:rPr>
-              <w:t>Source table in raw_data</w:t>
-            </w:r>
-          </w:p>
-        </w:tc>
-        <w:tc>
-          <w:tcPr>
-            <w:tcW w:type="dxa" w:w="4680"/>
-            <w:shd w:fill="F2F4F7"/>
-            <w:tcMar>
-              <w:top w:w="80" w:type="dxa"/>
-              <w:bottom w:w="80" w:type="dxa"/>
-              <w:start w:w="120" w:type="dxa"/>
-              <w:end w:w="120" w:type="dxa"/>
-            </w:tcMar>
-          </w:tcPr>
-          <w:p>
-            <w:pPr>
-              <w:pStyle w:val="TableText"/>
-            </w:pPr>
-            <w:r>
-              <w:rPr>
-                <w:b/>
-              </w:rPr>
-              <w:t>Cleaning view in kohort_bumil_v3</w:t>
-            </w:r>
-          </w:p>
-        </w:tc>
-      </w:tr>
-      <w:tr>
-        <w:trPr>
-          <w:cantSplit/>
-        </w:trPr>
-        <w:tc>
-          <w:tcPr>
-            <w:tcW w:type="dxa" w:w="4680"/>
-            <w:tcMar>
-              <w:top w:w="80" w:type="dxa"/>
-              <w:bottom w:w="80" w:type="dxa"/>
-              <w:start w:w="120" w:type="dxa"/>
-              <w:end w:w="120" w:type="dxa"/>
-            </w:tcMar>
-          </w:tcPr>
-          <w:p>
-            <w:pPr>
-              <w:pStyle w:val="TableText"/>
-            </w:pPr>
-            <w:r>
-              <w:t>sigizi_kesga_bumil_anc</w:t>
-            </w:r>
-          </w:p>
-        </w:tc>
-        <w:tc>
-          <w:tcPr>
-            <w:tcW w:type="dxa" w:w="4680"/>
-            <w:tcMar>
-              <w:top w:w="80" w:type="dxa"/>
-              <w:bottom w:w="80" w:type="dxa"/>
-              <w:start w:w="120" w:type="dxa"/>
-              <w:end w:w="120" w:type="dxa"/>
-            </w:tcMar>
-          </w:tcPr>
-          <w:p>
-            <w:pPr>
-              <w:pStyle w:val="TableText"/>
-            </w:pPr>
-            <w:r>
-              <w:t>vs_sigizi_anc</w:t>
-            </w:r>
-          </w:p>
-        </w:tc>
-      </w:tr>
-      <w:tr>
-        <w:trPr>
-          <w:cantSplit/>
-        </w:trPr>
-        <w:tc>
-          <w:tcPr>
-            <w:tcW w:type="dxa" w:w="4680"/>
-            <w:tcMar>
-              <w:top w:w="80" w:type="dxa"/>
-              <w:bottom w:w="80" w:type="dxa"/>
-              <w:start w:w="120" w:type="dxa"/>
-              <w:end w:w="120" w:type="dxa"/>
-            </w:tcMar>
-          </w:tcPr>
-          <w:p>
-            <w:pPr>
-              <w:pStyle w:val="TableText"/>
-            </w:pPr>
-            <w:r>
-              <w:t>sigizi_daftar_ibu</w:t>
-            </w:r>
-          </w:p>
-        </w:tc>
-        <w:tc>
-          <w:tcPr>
-            <w:tcW w:type="dxa" w:w="4680"/>
-            <w:tcMar>
-              <w:top w:w="80" w:type="dxa"/>
-              <w:bottom w:w="80" w:type="dxa"/>
-              <w:start w:w="120" w:type="dxa"/>
-              <w:end w:w="120" w:type="dxa"/>
-            </w:tcMar>
-          </w:tcPr>
-          <w:p>
-            <w:pPr>
-              <w:pStyle w:val="TableText"/>
-            </w:pPr>
-            <w:r>
-              <w:t>vs_sigizi_daftar_ibu</w:t>
-            </w:r>
-          </w:p>
-        </w:tc>
-      </w:tr>
-      <w:tr>
-        <w:trPr>
-          <w:cantSplit/>
-        </w:trPr>
-        <w:tc>
-          <w:tcPr>
-            <w:tcW w:type="dxa" w:w="4680"/>
-            <w:tcMar>
-              <w:top w:w="80" w:type="dxa"/>
-              <w:bottom w:w="80" w:type="dxa"/>
-              <w:start w:w="120" w:type="dxa"/>
-              <w:end w:w="120" w:type="dxa"/>
-            </w:tcMar>
-          </w:tcPr>
-          <w:p>
-            <w:pPr>
-              <w:pStyle w:val="TableText"/>
-            </w:pPr>
-            <w:r>
-              <w:t>sigizi_daftar_ibu_hamil</w:t>
-            </w:r>
-          </w:p>
-        </w:tc>
-        <w:tc>
-          <w:tcPr>
-            <w:tcW w:type="dxa" w:w="4680"/>
-            <w:tcMar>
-              <w:top w:w="80" w:type="dxa"/>
-              <w:bottom w:w="80" w:type="dxa"/>
-              <w:start w:w="120" w:type="dxa"/>
-              <w:end w:w="120" w:type="dxa"/>
-            </w:tcMar>
-          </w:tcPr>
-          <w:p>
-            <w:pPr>
-              <w:pStyle w:val="TableText"/>
-            </w:pPr>
-            <w:r>
-              <w:t>vs_sigizi_daftar_ibu_hamil</w:t>
-            </w:r>
-          </w:p>
-        </w:tc>
-      </w:tr>
-      <w:tr>
-        <w:trPr>
-          <w:cantSplit/>
-        </w:trPr>
-        <w:tc>
-          <w:tcPr>
-            <w:tcW w:type="dxa" w:w="4680"/>
-            <w:tcMar>
-              <w:top w:w="80" w:type="dxa"/>
-              <w:bottom w:w="80" w:type="dxa"/>
-              <w:start w:w="120" w:type="dxa"/>
-              <w:end w:w="120" w:type="dxa"/>
-            </w:tcMar>
-          </w:tcPr>
-          <w:p>
-            <w:pPr>
-              <w:pStyle w:val="TableText"/>
-            </w:pPr>
-            <w:r>
-              <w:t>sigizi_kohort_ibu</w:t>
-            </w:r>
-          </w:p>
-        </w:tc>
-        <w:tc>
-          <w:tcPr>
-            <w:tcW w:type="dxa" w:w="4680"/>
-            <w:tcMar>
-              <w:top w:w="80" w:type="dxa"/>
-              <w:bottom w:w="80" w:type="dxa"/>
-              <w:start w:w="120" w:type="dxa"/>
-              <w:end w:w="120" w:type="dxa"/>
-            </w:tcMar>
-          </w:tcPr>
-          <w:p>
-            <w:pPr>
-              <w:pStyle w:val="TableText"/>
-            </w:pPr>
-            <w:r>
-              <w:t>vs_sigizi_kohort_ibu</w:t>
-            </w:r>
-          </w:p>
-        </w:tc>
-      </w:tr>
-      <w:tr>
-        <w:trPr>
-          <w:cantSplit/>
-        </w:trPr>
-        <w:tc>
-          <w:tcPr>
-            <w:tcW w:type="dxa" w:w="4680"/>
-            <w:tcMar>
-              <w:top w:w="80" w:type="dxa"/>
-              <w:bottom w:w="80" w:type="dxa"/>
-              <w:start w:w="120" w:type="dxa"/>
-              <w:end w:w="120" w:type="dxa"/>
-            </w:tcMar>
-          </w:tcPr>
-          <w:p>
-            <w:pPr>
-              <w:pStyle w:val="TableText"/>
-            </w:pPr>
-            <w:r>
-              <w:t>sigizi_ibu_nifas</w:t>
-            </w:r>
-          </w:p>
-        </w:tc>
-        <w:tc>
-          <w:tcPr>
-            <w:tcW w:type="dxa" w:w="4680"/>
-            <w:tcMar>
-              <w:top w:w="80" w:type="dxa"/>
-              <w:bottom w:w="80" w:type="dxa"/>
-              <w:start w:w="120" w:type="dxa"/>
-              <w:end w:w="120" w:type="dxa"/>
-            </w:tcMar>
-          </w:tcPr>
-          <w:p>
-            <w:pPr>
-              <w:pStyle w:val="TableText"/>
-            </w:pPr>
-            <w:r>
-              <w:t>vs_sigizi_kohort_nifas</w:t>
-            </w:r>
-          </w:p>
-        </w:tc>
-      </w:tr>
-    </w:tbl>
     <w:p>
+      <w:pPr>
+        <w:pageBreakBefore w:val="0"/>
+      </w:pPr>
       <w:r>
-        <w:t>These cleaning views feed t_sigizi_source_records. The geography correction updates the facility, village and Posyandu fields in that same table before pregnancy episodes are built.</w:t>
+        <w:t>EPUS visits are cleaned, assigned to mothers and pregnancies, and deduplicated as ANC encounters. The pregnancy master also receives INC delivery evidence. A SIGIZI deletion does not automatically remove independent EPUS evidence.</w:t>
+      </w:r>
+    </w:p>
+    <w:p>
+      <w:pPr>
+        <w:pageBreakBefore w:val="0"/>
+        <w:spacing w:after="120"/>
+        <w:jc w:val="center"/>
+      </w:pPr>
+      <w:r>
+        <w:drawing>
+          <wp:inline xmlns:a="http://schemas.openxmlformats.org/drawingml/2006/main" xmlns:pic="http://schemas.openxmlformats.org/drawingml/2006/picture">
+            <wp:extent cx="3902120" cy="6035039"/>
+            <wp:docPr id="7" name="Picture 7" descr="EPUS raw ANC, INC, PNC and pregnancy-visit sources flow through their cleaning views, source table and mother/pregnancy/ANC preparation to the pregnancy master."/>
+            <wp:cNvGraphicFramePr>
+              <a:graphicFrameLocks noChangeAspect="1"/>
+            </wp:cNvGraphicFramePr>
+            <a:graphic>
+              <a:graphicData uri="http://schemas.openxmlformats.org/drawingml/2006/picture">
+                <pic:pic>
+                  <pic:nvPicPr>
+                    <pic:cNvPr id="0" name="epus_sources.png"/>
+                    <pic:cNvPicPr/>
+                  </pic:nvPicPr>
+                  <pic:blipFill>
+                    <a:blip r:embed="rId17"/>
+                    <a:stretch>
+                      <a:fillRect/>
+                    </a:stretch>
+                  </pic:blipFill>
+                  <pic:spPr>
+                    <a:xfrm>
+                      <a:off x="0" y="0"/>
+                      <a:ext cx="3902120" cy="6035039"/>
+                    </a:xfrm>
+                    <a:prstGeom prst="rect"/>
+                  </pic:spPr>
+                </pic:pic>
+              </a:graphicData>
+            </a:graphic>
+          </wp:inline>
+        </w:drawing>
       </w:r>
     </w:p>
     <w:p>
       <w:pPr>
         <w:pStyle w:val="Heading2"/>
+        <w:pageBreakBefore/>
       </w:pPr>
       <w:r>
-        <w:t>Where EPUS enters</w:t>
+        <w:t>Where SIMRS and facility reports enter</w:t>
       </w:r>
     </w:p>
-    <w:tbl>
-      <w:tblPr>
-        <w:tblStyle w:val="TableGrid"/>
-        <w:tblW w:type="dxa" w:w="9360"/>
-        <w:jc w:val="left"/>
-        <w:tblLayout w:type="fixed"/>
-        <w:tblLook w:firstColumn="1" w:firstRow="1" w:lastColumn="0" w:lastRow="0" w:noHBand="0" w:noVBand="1" w:val="04A0"/>
-        <w:tblInd w:type="dxa" w:w="120"/>
-      </w:tblPr>
-      <w:tblGrid>
-        <w:gridCol w:w="4680"/>
-        <w:gridCol w:w="4680"/>
-      </w:tblGrid>
-      <w:tr>
-        <w:trPr>
-          <w:cantSplit/>
-          <w:tblHeader/>
-        </w:trPr>
-        <w:tc>
-          <w:tcPr>
-            <w:tcW w:type="dxa" w:w="4680"/>
-            <w:shd w:fill="F2F4F7"/>
-            <w:tcMar>
-              <w:top w:w="80" w:type="dxa"/>
-              <w:bottom w:w="80" w:type="dxa"/>
-              <w:start w:w="120" w:type="dxa"/>
-              <w:end w:w="120" w:type="dxa"/>
-            </w:tcMar>
-          </w:tcPr>
-          <w:p>
-            <w:pPr>
-              <w:pStyle w:val="TableText"/>
-            </w:pPr>
-            <w:r>
-              <w:rPr>
-                <w:b/>
-              </w:rPr>
-              <w:t>Source table in raw_data</w:t>
-            </w:r>
-          </w:p>
-        </w:tc>
-        <w:tc>
-          <w:tcPr>
-            <w:tcW w:type="dxa" w:w="4680"/>
-            <w:shd w:fill="F2F4F7"/>
-            <w:tcMar>
-              <w:top w:w="80" w:type="dxa"/>
-              <w:bottom w:w="80" w:type="dxa"/>
-              <w:start w:w="120" w:type="dxa"/>
-              <w:end w:w="120" w:type="dxa"/>
-            </w:tcMar>
-          </w:tcPr>
-          <w:p>
-            <w:pPr>
-              <w:pStyle w:val="TableText"/>
-            </w:pPr>
-            <w:r>
-              <w:rPr>
-                <w:b/>
-              </w:rPr>
-              <w:t>Cleaning view in kohort_bumil_v3</w:t>
-            </w:r>
-          </w:p>
-        </w:tc>
-      </w:tr>
-      <w:tr>
-        <w:trPr>
-          <w:cantSplit/>
-        </w:trPr>
-        <w:tc>
-          <w:tcPr>
-            <w:tcW w:type="dxa" w:w="4680"/>
-            <w:tcMar>
-              <w:top w:w="80" w:type="dxa"/>
-              <w:bottom w:w="80" w:type="dxa"/>
-              <w:start w:w="120" w:type="dxa"/>
-              <w:end w:w="120" w:type="dxa"/>
-            </w:tcMar>
-          </w:tcPr>
-          <w:p>
-            <w:pPr>
-              <w:pStyle w:val="TableText"/>
-            </w:pPr>
-            <w:r>
-              <w:t>epus_anc</w:t>
-            </w:r>
-          </w:p>
-        </w:tc>
-        <w:tc>
-          <w:tcPr>
-            <w:tcW w:type="dxa" w:w="4680"/>
-            <w:tcMar>
-              <w:top w:w="80" w:type="dxa"/>
-              <w:bottom w:w="80" w:type="dxa"/>
-              <w:start w:w="120" w:type="dxa"/>
-              <w:end w:w="120" w:type="dxa"/>
-            </w:tcMar>
-          </w:tcPr>
-          <w:p>
-            <w:pPr>
-              <w:pStyle w:val="TableText"/>
-            </w:pPr>
-            <w:r>
-              <w:t>vs_epus_anc</w:t>
-            </w:r>
-          </w:p>
-        </w:tc>
-      </w:tr>
-      <w:tr>
-        <w:trPr>
-          <w:cantSplit/>
-        </w:trPr>
-        <w:tc>
-          <w:tcPr>
-            <w:tcW w:type="dxa" w:w="4680"/>
-            <w:tcMar>
-              <w:top w:w="80" w:type="dxa"/>
-              <w:bottom w:w="80" w:type="dxa"/>
-              <w:start w:w="120" w:type="dxa"/>
-              <w:end w:w="120" w:type="dxa"/>
-            </w:tcMar>
-          </w:tcPr>
-          <w:p>
-            <w:pPr>
-              <w:pStyle w:val="TableText"/>
-            </w:pPr>
-            <w:r>
-              <w:t>epus_inc</w:t>
-            </w:r>
-          </w:p>
-        </w:tc>
-        <w:tc>
-          <w:tcPr>
-            <w:tcW w:type="dxa" w:w="4680"/>
-            <w:tcMar>
-              <w:top w:w="80" w:type="dxa"/>
-              <w:bottom w:w="80" w:type="dxa"/>
-              <w:start w:w="120" w:type="dxa"/>
-              <w:end w:w="120" w:type="dxa"/>
-            </w:tcMar>
-          </w:tcPr>
-          <w:p>
-            <w:pPr>
-              <w:pStyle w:val="TableText"/>
-            </w:pPr>
-            <w:r>
-              <w:t>vs_epus_inc</w:t>
-            </w:r>
-          </w:p>
-        </w:tc>
-      </w:tr>
-      <w:tr>
-        <w:trPr>
-          <w:cantSplit/>
-        </w:trPr>
-        <w:tc>
-          <w:tcPr>
-            <w:tcW w:type="dxa" w:w="4680"/>
-            <w:tcMar>
-              <w:top w:w="80" w:type="dxa"/>
-              <w:bottom w:w="80" w:type="dxa"/>
-              <w:start w:w="120" w:type="dxa"/>
-              <w:end w:w="120" w:type="dxa"/>
-            </w:tcMar>
-          </w:tcPr>
-          <w:p>
-            <w:pPr>
-              <w:pStyle w:val="TableText"/>
-            </w:pPr>
-            <w:r>
-              <w:t>epus_pnc</w:t>
-            </w:r>
-          </w:p>
-        </w:tc>
-        <w:tc>
-          <w:tcPr>
-            <w:tcW w:type="dxa" w:w="4680"/>
-            <w:tcMar>
-              <w:top w:w="80" w:type="dxa"/>
-              <w:bottom w:w="80" w:type="dxa"/>
-              <w:start w:w="120" w:type="dxa"/>
-              <w:end w:w="120" w:type="dxa"/>
-            </w:tcMar>
-          </w:tcPr>
-          <w:p>
-            <w:pPr>
-              <w:pStyle w:val="TableText"/>
-            </w:pPr>
-            <w:r>
-              <w:t>vs_epus_pnc</w:t>
-            </w:r>
-          </w:p>
-        </w:tc>
-      </w:tr>
-      <w:tr>
-        <w:trPr>
-          <w:cantSplit/>
-        </w:trPr>
-        <w:tc>
-          <w:tcPr>
-            <w:tcW w:type="dxa" w:w="4680"/>
-            <w:tcMar>
-              <w:top w:w="80" w:type="dxa"/>
-              <w:bottom w:w="80" w:type="dxa"/>
-              <w:start w:w="120" w:type="dxa"/>
-              <w:end w:w="120" w:type="dxa"/>
-            </w:tcMar>
-          </w:tcPr>
-          <w:p>
-            <w:pPr>
-              <w:pStyle w:val="TableText"/>
-            </w:pPr>
-            <w:r>
-              <w:t>epus_kunjungan_ibu_hamil</w:t>
-            </w:r>
-          </w:p>
-        </w:tc>
-        <w:tc>
-          <w:tcPr>
-            <w:tcW w:type="dxa" w:w="4680"/>
-            <w:tcMar>
-              <w:top w:w="80" w:type="dxa"/>
-              <w:bottom w:w="80" w:type="dxa"/>
-              <w:start w:w="120" w:type="dxa"/>
-              <w:end w:w="120" w:type="dxa"/>
-            </w:tcMar>
-          </w:tcPr>
-          <w:p>
-            <w:pPr>
-              <w:pStyle w:val="TableText"/>
-            </w:pPr>
-            <w:r>
-              <w:t>vs_kohort_epus_kunjungan_ibu_hamil</w:t>
-            </w:r>
-          </w:p>
-        </w:tc>
-      </w:tr>
-    </w:tbl>
     <w:p>
       <w:r>
-        <w:t>These cleaning views feed t_epus_source_records. EPUS preparation then assigns mother and pregnancy identities and combines duplicate ANC visits before producing the pregnancy master.</w:t>
+        <w:t>These branches add delivery and neonatal evidence. They do not construct the SIGIZI/EPUS pregnancy spine; their reports are matched to that spine later.</w:t>
+      </w:r>
+    </w:p>
+    <w:p>
+      <w:r>
+        <w:drawing>
+          <wp:inline xmlns:a="http://schemas.openxmlformats.org/drawingml/2006/main" xmlns:pic="http://schemas.openxmlformats.org/drawingml/2006/picture">
+            <wp:extent cx="5943600" cy="3190959"/>
+            <wp:docPr id="2" name="Picture 2"/>
+            <wp:cNvGraphicFramePr>
+              <a:graphicFrameLocks noChangeAspect="1"/>
+            </wp:cNvGraphicFramePr>
+            <a:graphic>
+              <a:graphicData uri="http://schemas.openxmlformats.org/drawingml/2006/picture">
+                <pic:pic>
+                  <pic:nvPicPr>
+                    <pic:cNvPr id="0" name="simrs_facility_sources.png"/>
+                    <pic:cNvPicPr/>
+                  </pic:nvPicPr>
+                  <pic:blipFill>
+                    <a:blip r:embed="rId12"/>
+                    <a:stretch>
+                      <a:fillRect/>
+                    </a:stretch>
+                  </pic:blipFill>
+                  <pic:spPr>
+                    <a:xfrm>
+                      <a:off x="0" y="0"/>
+                      <a:ext cx="5943600" cy="3190959"/>
+                    </a:xfrm>
+                    <a:prstGeom prst="rect"/>
+                  </pic:spPr>
+                </pic:pic>
+              </a:graphicData>
+            </a:graphic>
+          </wp:inline>
+        </w:drawing>
       </w:r>
     </w:p>
     <w:p>
@@ -597,7 +200,65 @@
         <w:pStyle w:val="CaptionText"/>
       </w:pPr>
       <w:r>
-        <w:t>Builders: 01_source_adapter_views.sql, 03_sigizi_source.sql, 03a_sigizi_geography.sql and 04_epus_source.sql.</w:t>
+        <w:t>The dashed facility path marks an external boundary. The repository reads the existing tracker view; its raw ingestion and internal build are not defined here.</w:t>
+      </w:r>
+    </w:p>
+    <w:p>
+      <w:pPr>
+        <w:pStyle w:val="Heading2"/>
+        <w:pageBreakBefore/>
+      </w:pPr>
+      <w:r>
+        <w:t>Where Kobo and adjudication enter</w:t>
+      </w:r>
+    </w:p>
+    <w:p>
+      <w:r>
+        <w:t>INC submissions are cleaned, then combined with adjudication in the case-master view. Neonatal records follow their own cleaning view. Both routes contribute to the same outcome-evidence table.</w:t>
+      </w:r>
+    </w:p>
+    <w:p>
+      <w:r>
+        <w:drawing>
+          <wp:inline xmlns:a="http://schemas.openxmlformats.org/drawingml/2006/main" xmlns:pic="http://schemas.openxmlformats.org/drawingml/2006/picture">
+            <wp:extent cx="5943600" cy="4578178"/>
+            <wp:docPr id="3" name="Picture 3"/>
+            <wp:cNvGraphicFramePr>
+              <a:graphicFrameLocks noChangeAspect="1"/>
+            </wp:cNvGraphicFramePr>
+            <a:graphic>
+              <a:graphicData uri="http://schemas.openxmlformats.org/drawingml/2006/picture">
+                <pic:pic>
+                  <pic:nvPicPr>
+                    <pic:cNvPr id="0" name="kobo_sources.png"/>
+                    <pic:cNvPicPr/>
+                  </pic:nvPicPr>
+                  <pic:blipFill>
+                    <a:blip r:embed="rId13"/>
+                    <a:stretch>
+                      <a:fillRect/>
+                    </a:stretch>
+                  </pic:blipFill>
+                  <pic:spPr>
+                    <a:xfrm>
+                      <a:off x="0" y="0"/>
+                      <a:ext cx="5943600" cy="4578178"/>
+                    </a:xfrm>
+                    <a:prstGeom prst="rect"/>
+                  </pic:spPr>
+                </pic:pic>
+              </a:graphicData>
+            </a:graphic>
+          </wp:inline>
+        </w:drawing>
+      </w:r>
+    </w:p>
+    <w:p>
+      <w:pPr>
+        <w:pStyle w:val="CaptionText"/>
+      </w:pPr>
+      <w:r>
+        <w:t>The repeated outcome-table box is the same t_pregnancy_outcome_events_v3_3, not separate tables. It also receives the corrected SIGIZI source records and the EPUS pregnancy master shown earlier.</w:t>
       </w:r>
     </w:p>
     <w:p>
@@ -611,7 +272,7 @@
     </w:p>
     <w:p>
       <w:r>
-        <w:t>Read each branch downward. The branches meet when matching concludes that a SIGIZI episode and an EPUS episode describe the same pregnancy. Unmatched episodes remain in the final pregnancy spine.</w:t>
+        <w:t>The SIGIZI branch now starts from retained source records after deletion exclusion and geography correction. The branches meet when matching concludes that SIGIZI and EPUS episodes describe the same pregnancy. Unmatched episodes remain in the pregnancy spine.</w:t>
       </w:r>
     </w:p>
     <w:p>
@@ -619,7 +280,7 @@
         <w:drawing>
           <wp:inline xmlns:a="http://schemas.openxmlformats.org/drawingml/2006/main" xmlns:pic="http://schemas.openxmlformats.org/drawingml/2006/picture">
             <wp:extent cx="5943600" cy="5545946"/>
-            <wp:docPr id="1" name="Picture 1"/>
+            <wp:docPr id="4" name="Picture 4"/>
             <wp:cNvGraphicFramePr>
               <a:graphicFrameLocks noChangeAspect="1"/>
             </wp:cNvGraphicFramePr>
@@ -631,7 +292,7 @@
                     <pic:cNvPicPr/>
                   </pic:nvPicPr>
                   <pic:blipFill>
-                    <a:blip r:embed="rId11"/>
+                    <a:blip r:embed="rId14"/>
                     <a:stretch>
                       <a:fillRect/>
                     </a:stretch>
@@ -655,7 +316,7 @@
         <w:pStyle w:val="CaptionText"/>
       </w:pPr>
       <w:r>
-        <w:t>The geography step rewrites t_sigizi_source_records; it does not create a second production source table. The EPUS master reads both pregnancy records and canonical ANC events, and also uses vs_epus_inc for delivery evidence.</w:t>
+        <w:t>The deletion gate runs inside 03_sigizi_source.sql before this panel. Geography then rewrites the same source table. The EPUS master reads pregnancy records, canonical ANC events and vs_epus_inc delivery evidence.</w:t>
       </w:r>
     </w:p>
     <w:p>
@@ -669,306 +330,20 @@
         <w:pageBreakBefore/>
       </w:pPr>
       <w:r>
-        <w:t>How delivery evidence reaches the dashboard</w:t>
-      </w:r>
-    </w:p>
-    <w:tbl>
-      <w:tblPr>
-        <w:tblStyle w:val="TableGrid"/>
-        <w:tblW w:type="dxa" w:w="9360"/>
-        <w:jc w:val="left"/>
-        <w:tblLayout w:type="fixed"/>
-        <w:tblLook w:firstColumn="1" w:firstRow="1" w:lastColumn="0" w:lastRow="0" w:noHBand="0" w:noVBand="1" w:val="04A0"/>
-        <w:tblInd w:type="dxa" w:w="120"/>
-      </w:tblPr>
-      <w:tblGrid>
-        <w:gridCol w:w="4680"/>
-        <w:gridCol w:w="4680"/>
-      </w:tblGrid>
-      <w:tr>
-        <w:trPr>
-          <w:cantSplit/>
-          <w:tblHeader/>
-        </w:trPr>
-        <w:tc>
-          <w:tcPr>
-            <w:tcW w:type="dxa" w:w="4680"/>
-            <w:shd w:fill="F2F4F7"/>
-            <w:tcMar>
-              <w:top w:w="80" w:type="dxa"/>
-              <w:bottom w:w="80" w:type="dxa"/>
-              <w:start w:w="120" w:type="dxa"/>
-              <w:end w:w="120" w:type="dxa"/>
-            </w:tcMar>
-          </w:tcPr>
-          <w:p>
-            <w:pPr>
-              <w:pStyle w:val="TableText"/>
-            </w:pPr>
-            <w:r>
-              <w:rPr>
-                <w:b/>
-              </w:rPr>
-              <w:t>Additional input</w:t>
-            </w:r>
-          </w:p>
-        </w:tc>
-        <w:tc>
-          <w:tcPr>
-            <w:tcW w:type="dxa" w:w="4680"/>
-            <w:shd w:fill="F2F4F7"/>
-            <w:tcMar>
-              <w:top w:w="80" w:type="dxa"/>
-              <w:bottom w:w="80" w:type="dxa"/>
-              <w:start w:w="120" w:type="dxa"/>
-              <w:end w:w="120" w:type="dxa"/>
-            </w:tcMar>
-          </w:tcPr>
-          <w:p>
-            <w:pPr>
-              <w:pStyle w:val="TableText"/>
-            </w:pPr>
-            <w:r>
-              <w:rPr>
-                <w:b/>
-              </w:rPr>
-              <w:t>Entry view</w:t>
-            </w:r>
-          </w:p>
-        </w:tc>
-      </w:tr>
-      <w:tr>
-        <w:trPr>
-          <w:cantSplit/>
-        </w:trPr>
-        <w:tc>
-          <w:tcPr>
-            <w:tcW w:type="dxa" w:w="4680"/>
-            <w:tcMar>
-              <w:top w:w="80" w:type="dxa"/>
-              <w:bottom w:w="80" w:type="dxa"/>
-              <w:start w:w="120" w:type="dxa"/>
-              <w:end w:w="120" w:type="dxa"/>
-            </w:tcMar>
-          </w:tcPr>
-          <w:p>
-            <w:pPr>
-              <w:pStyle w:val="TableText"/>
-            </w:pPr>
-            <w:r>
-              <w:t>raw_data.simrs_patut_patuh_inc</w:t>
-            </w:r>
-          </w:p>
-        </w:tc>
-        <w:tc>
-          <w:tcPr>
-            <w:tcW w:type="dxa" w:w="4680"/>
-            <w:tcMar>
-              <w:top w:w="80" w:type="dxa"/>
-              <w:bottom w:w="80" w:type="dxa"/>
-              <w:start w:w="120" w:type="dxa"/>
-              <w:end w:w="120" w:type="dxa"/>
-            </w:tcMar>
-          </w:tcPr>
-          <w:p>
-            <w:pPr>
-              <w:pStyle w:val="TableText"/>
-            </w:pPr>
-            <w:r>
-              <w:t>vs_simrs_patut_patuh_inc</w:t>
-            </w:r>
-          </w:p>
-        </w:tc>
-      </w:tr>
-      <w:tr>
-        <w:trPr>
-          <w:cantSplit/>
-        </w:trPr>
-        <w:tc>
-          <w:tcPr>
-            <w:tcW w:type="dxa" w:w="4680"/>
-            <w:tcMar>
-              <w:top w:w="80" w:type="dxa"/>
-              <w:bottom w:w="80" w:type="dxa"/>
-              <w:start w:w="120" w:type="dxa"/>
-              <w:end w:w="120" w:type="dxa"/>
-            </w:tcMar>
-          </w:tcPr>
-          <w:p>
-            <w:pPr>
-              <w:pStyle w:val="TableText"/>
-            </w:pPr>
-            <w:r>
-              <w:t>data_kobo_form.e-form_pencatatan_pelayanan_intranatal_care</w:t>
-            </w:r>
-          </w:p>
-        </w:tc>
-        <w:tc>
-          <w:tcPr>
-            <w:tcW w:type="dxa" w:w="4680"/>
-            <w:tcMar>
-              <w:top w:w="80" w:type="dxa"/>
-              <w:bottom w:w="80" w:type="dxa"/>
-              <w:start w:w="120" w:type="dxa"/>
-              <w:end w:w="120" w:type="dxa"/>
-            </w:tcMar>
-          </w:tcPr>
-          <w:p>
-            <w:pPr>
-              <w:pStyle w:val="TableText"/>
-            </w:pPr>
-            <w:r>
-              <w:t>vs_kobo_inc_submission_clean → vs_kobo_inc_case_master</w:t>
-            </w:r>
-          </w:p>
-        </w:tc>
-      </w:tr>
-      <w:tr>
-        <w:trPr>
-          <w:cantSplit/>
-        </w:trPr>
-        <w:tc>
-          <w:tcPr>
-            <w:tcW w:type="dxa" w:w="4680"/>
-            <w:tcMar>
-              <w:top w:w="80" w:type="dxa"/>
-              <w:bottom w:w="80" w:type="dxa"/>
-              <w:start w:w="120" w:type="dxa"/>
-              <w:end w:w="120" w:type="dxa"/>
-            </w:tcMar>
-          </w:tcPr>
-          <w:p>
-            <w:pPr>
-              <w:pStyle w:val="TableText"/>
-            </w:pPr>
-            <w:r>
-              <w:t>data_adjudication.adj_final</w:t>
-            </w:r>
-          </w:p>
-        </w:tc>
-        <w:tc>
-          <w:tcPr>
-            <w:tcW w:type="dxa" w:w="4680"/>
-            <w:tcMar>
-              <w:top w:w="80" w:type="dxa"/>
-              <w:bottom w:w="80" w:type="dxa"/>
-              <w:start w:w="120" w:type="dxa"/>
-              <w:end w:w="120" w:type="dxa"/>
-            </w:tcMar>
-          </w:tcPr>
-          <w:p>
-            <w:pPr>
-              <w:pStyle w:val="TableText"/>
-            </w:pPr>
-            <w:r>
-              <w:t>Also feeds vs_kobo_inc_case_master</w:t>
-            </w:r>
-          </w:p>
-        </w:tc>
-      </w:tr>
-      <w:tr>
-        <w:trPr>
-          <w:cantSplit/>
-        </w:trPr>
-        <w:tc>
-          <w:tcPr>
-            <w:tcW w:type="dxa" w:w="4680"/>
-            <w:tcMar>
-              <w:top w:w="80" w:type="dxa"/>
-              <w:bottom w:w="80" w:type="dxa"/>
-              <w:start w:w="120" w:type="dxa"/>
-              <w:end w:w="120" w:type="dxa"/>
-            </w:tcMar>
-          </w:tcPr>
-          <w:p>
-            <w:pPr>
-              <w:pStyle w:val="TableText"/>
-            </w:pPr>
-            <w:r>
-              <w:t>data_kobo_form.neonatus_outcome_v2</w:t>
-            </w:r>
-          </w:p>
-        </w:tc>
-        <w:tc>
-          <w:tcPr>
-            <w:tcW w:type="dxa" w:w="4680"/>
-            <w:tcMar>
-              <w:top w:w="80" w:type="dxa"/>
-              <w:bottom w:w="80" w:type="dxa"/>
-              <w:start w:w="120" w:type="dxa"/>
-              <w:end w:w="120" w:type="dxa"/>
-            </w:tcMar>
-          </w:tcPr>
-          <w:p>
-            <w:pPr>
-              <w:pStyle w:val="TableText"/>
-            </w:pPr>
-            <w:r>
-              <w:t>vs_kobo_neonatus_outcome_v2_baby</w:t>
-            </w:r>
-          </w:p>
-        </w:tc>
-      </w:tr>
-      <w:tr>
-        <w:trPr>
-          <w:cantSplit/>
-        </w:trPr>
-        <w:tc>
-          <w:tcPr>
-            <w:tcW w:type="dxa" w:w="4680"/>
-            <w:tcMar>
-              <w:top w:w="80" w:type="dxa"/>
-              <w:bottom w:w="80" w:type="dxa"/>
-              <w:start w:w="120" w:type="dxa"/>
-              <w:end w:w="120" w:type="dxa"/>
-            </w:tcMar>
-          </w:tcPr>
-          <w:p>
-            <w:pPr>
-              <w:pStyle w:val="TableText"/>
-            </w:pPr>
-            <w:r>
-              <w:t>Facility birth reporting</w:t>
-            </w:r>
-          </w:p>
-        </w:tc>
-        <w:tc>
-          <w:tcPr>
-            <w:tcW w:type="dxa" w:w="4680"/>
-            <w:tcMar>
-              <w:top w:w="80" w:type="dxa"/>
-              <w:bottom w:w="80" w:type="dxa"/>
-              <w:start w:w="120" w:type="dxa"/>
-              <w:end w:w="120" w:type="dxa"/>
-            </w:tcMar>
-          </w:tcPr>
-          <w:p>
-            <w:pPr>
-              <w:pStyle w:val="TableText"/>
-            </w:pPr>
-            <w:r>
-              <w:t>birth_report_faskes.v_inc_report_tracker (external reporting view)</w:t>
-            </w:r>
-          </w:p>
-        </w:tc>
-      </w:tr>
-    </w:tbl>
-    <w:p>
-      <w:r>
-        <w:t>These inputs are combined with SIGIZI source records and the EPUS pregnancy master in t_pregnancy_outcome_events_v3_3. This is the common collection of outcome evidence.</w:t>
+        <w:t>Where the branches meet and reach Looker</w:t>
       </w:r>
     </w:p>
     <w:p>
       <w:r>
-        <w:t>The pregnancy spine, matched USG evidence and matched outcome evidence produce t_pregnancy_outcome_tracking_v3_3. Separately, dated birth evidence becomes t_delivery_source_records, then t_delivery_dedup_base, then t_delivery_event_master_unlinked. After matching those events to the pregnancy spine and checking competing links, the final result is t_delivery_event_master_v3.</w:t>
+        <w:t>The pregnancy spine supplies the pregnancy identity; the outcome table supplies reports of what happened. Pregnancy tracking and delivery deduplication use these inputs for different purposes, then converge in the reporting layer.</w:t>
       </w:r>
     </w:p>
     <w:p>
       <w:r>
         <w:drawing>
           <wp:inline xmlns:a="http://schemas.openxmlformats.org/drawingml/2006/main" xmlns:pic="http://schemas.openxmlformats.org/drawingml/2006/picture">
-            <wp:extent cx="5943600" cy="3838686"/>
-            <wp:docPr id="2" name="Picture 2"/>
+            <wp:extent cx="5943600" cy="5889306"/>
+            <wp:docPr id="5" name="Picture 5"/>
             <wp:cNvGraphicFramePr>
               <a:graphicFrameLocks noChangeAspect="1"/>
             </wp:cNvGraphicFramePr>
@@ -976,11 +351,11 @@
               <a:graphicData uri="http://schemas.openxmlformats.org/drawingml/2006/picture">
                 <pic:pic>
                   <pic:nvPicPr>
-                    <pic:cNvPr id="0" name="reporting_exact_flow.png"/>
+                    <pic:cNvPr id="0" name="core_reporting.png"/>
                     <pic:cNvPicPr/>
                   </pic:nvPicPr>
                   <pic:blipFill>
-                    <a:blip r:embed="rId12"/>
+                    <a:blip r:embed="rId15"/>
                     <a:stretch>
                       <a:fillRect/>
                     </a:stretch>
@@ -988,7 +363,7 @@
                   <pic:spPr>
                     <a:xfrm>
                       <a:off x="0" y="0"/>
-                      <a:ext cx="5943600" cy="3838686"/>
+                      <a:ext cx="5943600" cy="5889306"/>
                     </a:xfrm>
                     <a:prstGeom prst="rect"/>
                   </pic:spPr>
@@ -1004,7 +379,7 @@
         <w:pStyle w:val="CaptionText"/>
       </w:pPr>
       <w:r>
-        <w:t>The diagram shows the actual main reporting dependencies. The facility tracker is consumed as an existing upstream view; its internal build is outside the supplied independent-core package.</w:t>
+        <w:t>Main reporting path, not every SQL reference. Source maps, rescue evidence and audit tables support the matching steps; the appendix lists direct reporting dependencies. Pregnancy monitoring uses expected delivery dates; delivery reporting uses actual delivery events.</w:t>
       </w:r>
     </w:p>
     <w:p>
@@ -1382,6 +757,270 @@
       </w:pPr>
       <w:r>
         <w:t>Source: adapter/preparation SQL, geography patch and 40_outcome_tracking.sql. Matching checks and final contact validation are distinct stages.</w:t>
+      </w:r>
+    </w:p>
+    <w:p>
+      <w:pPr>
+        <w:pStyle w:val="Heading2"/>
+        <w:pageBreakBefore/>
+      </w:pPr>
+      <w:commentRangeStart w:id="0"/>
+      <w:r>
+        <w:t>Excluding deleted SIGIZI pregnancies</w:t>
+      </w:r>
+      <w:commentRangeEnd w:id="0"/>
+      <w:r>
+        <w:rPr>
+          <w:rStyle w:val="CommentReference"/>
+        </w:rPr>
+        <w:commentReference w:id="0"/>
+      </w:r>
+    </w:p>
+    <w:p>
+      <w:pPr>
+        <w:pageBreakBefore w:val="0"/>
+      </w:pPr>
+      <w:r>
+        <w:t>vs_sigizi_bumil_hapus is a deletion reference, not a clinical source. The source builder checks each standardized SIGIZI record against it before publishing the records that feed pregnancy and outcome construction.</w:t>
+      </w:r>
+    </w:p>
+    <w:p>
+      <w:pPr>
+        <w:pageBreakBefore w:val="0"/>
+        <w:spacing w:after="120"/>
+        <w:jc w:val="center"/>
+      </w:pPr>
+      <w:r>
+        <w:drawing>
+          <wp:inline xmlns:a="http://schemas.openxmlformats.org/drawingml/2006/main" xmlns:pic="http://schemas.openxmlformats.org/drawingml/2006/picture">
+            <wp:extent cx="4509201" cy="3246119"/>
+            <wp:docPr id="8" name="Picture 8" descr="Clinical records and deletion notices are compared by identity and pregnancy anchor. Matches go to the excluded-record audit, while records without a qualifying match continue to geography and the core pipeline."/>
+            <wp:cNvGraphicFramePr>
+              <a:graphicFrameLocks noChangeAspect="1"/>
+            </wp:cNvGraphicFramePr>
+            <a:graphic>
+              <a:graphicData uri="http://schemas.openxmlformats.org/drawingml/2006/picture">
+                <pic:pic>
+                  <pic:nvPicPr>
+                    <pic:cNvPr id="0" name="sigizi_deletion_exclusion.png"/>
+                    <pic:cNvPicPr/>
+                  </pic:nvPicPr>
+                  <pic:blipFill>
+                    <a:blip r:embed="rId18"/>
+                    <a:stretch>
+                      <a:fillRect/>
+                    </a:stretch>
+                  </pic:blipFill>
+                  <pic:spPr>
+                    <a:xfrm>
+                      <a:off x="0" y="0"/>
+                      <a:ext cx="4509201" cy="3246119"/>
+                    </a:xfrm>
+                    <a:prstGeom prst="rect"/>
+                  </pic:spPr>
+                </pic:pic>
+              </a:graphicData>
+            </a:graphic>
+          </wp:inline>
+        </w:drawing>
+      </w:r>
+    </w:p>
+    <w:tbl>
+      <w:tblPr>
+        <w:tblStyle w:val="TableGrid"/>
+        <w:tblW w:type="dxa" w:w="9360"/>
+        <w:tblLayout w:type="fixed"/>
+        <w:tblLook w:firstColumn="1" w:firstRow="1" w:lastColumn="0" w:lastRow="0" w:noHBand="0" w:noVBand="1" w:val="04A0"/>
+        <w:tblInd w:type="dxa" w:w="120"/>
+        <w:tblCellMar>
+          <w:top w:w="90" w:type="dxa"/>
+          <w:bottom w:w="90" w:type="dxa"/>
+          <w:left w:w="120" w:type="dxa"/>
+          <w:right w:w="120" w:type="dxa"/>
+        </w:tblCellMar>
+      </w:tblPr>
+      <w:tblGrid>
+        <w:gridCol w:w="2700"/>
+        <w:gridCol w:w="6660"/>
+      </w:tblGrid>
+      <w:tr>
+        <w:trPr>
+          <w:tblHeader/>
+        </w:trPr>
+        <w:tc>
+          <w:tcPr>
+            <w:tcW w:type="dxa" w:w="2700"/>
+            <w:shd w:fill="E8EFF8"/>
+          </w:tcPr>
+          <w:p>
+            <w:pPr>
+              <w:pStyle w:val="TableText"/>
+              <w:spacing w:after="60" w:before="60"/>
+            </w:pPr>
+            <w:r>
+              <w:rPr>
+                <w:b/>
+              </w:rPr>
+              <w:t>Rule</w:t>
+            </w:r>
+          </w:p>
+        </w:tc>
+        <w:tc>
+          <w:tcPr>
+            <w:tcW w:type="dxa" w:w="6660"/>
+            <w:shd w:fill="E8EFF8"/>
+          </w:tcPr>
+          <w:p>
+            <w:pPr>
+              <w:pStyle w:val="TableText"/>
+              <w:spacing w:after="60" w:before="60"/>
+            </w:pPr>
+            <w:r>
+              <w:rPr>
+                <w:b/>
+              </w:rPr>
+              <w:t>Decision</w:t>
+            </w:r>
+          </w:p>
+        </w:tc>
+      </w:tr>
+      <w:tr>
+        <w:tc>
+          <w:tcPr>
+            <w:tcW w:type="dxa" w:w="2700"/>
+          </w:tcPr>
+          <w:p>
+            <w:pPr>
+              <w:pStyle w:val="TableText"/>
+              <w:spacing w:after="60" w:before="60"/>
+            </w:pPr>
+            <w:r>
+              <w:t>Usable NIK + same pregnancy</w:t>
+            </w:r>
+          </w:p>
+        </w:tc>
+        <w:tc>
+          <w:tcPr>
+            <w:tcW w:type="dxa" w:w="6660"/>
+          </w:tcPr>
+          <w:p>
+            <w:pPr>
+              <w:pStyle w:val="TableText"/>
+              <w:spacing w:after="60" w:before="60"/>
+            </w:pPr>
+            <w:r>
+              <w:t>Exclude when the cleaned NIK and pregnancy anchor both agree with the registry.</w:t>
+            </w:r>
+          </w:p>
+        </w:tc>
+      </w:tr>
+      <w:tr>
+        <w:tc>
+          <w:tcPr>
+            <w:tcW w:type="dxa" w:w="2700"/>
+          </w:tcPr>
+          <w:p>
+            <w:pPr>
+              <w:pStyle w:val="TableText"/>
+              <w:spacing w:after="60" w:before="60"/>
+            </w:pPr>
+            <w:r>
+              <w:t>NIK unavailable on either side</w:t>
+            </w:r>
+          </w:p>
+        </w:tc>
+        <w:tc>
+          <w:tcPr>
+            <w:tcW w:type="dxa" w:w="6660"/>
+          </w:tcPr>
+          <w:p>
+            <w:pPr>
+              <w:pStyle w:val="TableText"/>
+              <w:spacing w:after="60" w:before="60"/>
+            </w:pPr>
+            <w:r>
+              <w:t>Require exact normalized name, maternal birth date and pregnancy anchor.</w:t>
+            </w:r>
+          </w:p>
+        </w:tc>
+      </w:tr>
+      <w:tr>
+        <w:tc>
+          <w:tcPr>
+            <w:tcW w:type="dxa" w:w="2700"/>
+          </w:tcPr>
+          <w:p>
+            <w:pPr>
+              <w:pStyle w:val="TableText"/>
+              <w:spacing w:after="60" w:before="60"/>
+            </w:pPr>
+            <w:r>
+              <w:t>Conflicting usable NIKs</w:t>
+            </w:r>
+          </w:p>
+        </w:tc>
+        <w:tc>
+          <w:tcPr>
+            <w:tcW w:type="dxa" w:w="6660"/>
+          </w:tcPr>
+          <w:p>
+            <w:pPr>
+              <w:pStyle w:val="TableText"/>
+              <w:spacing w:after="60" w:before="60"/>
+            </w:pPr>
+            <w:r>
+              <w:t>Do not override the conflict with name matching.</w:t>
+            </w:r>
+          </w:p>
+        </w:tc>
+      </w:tr>
+      <w:tr>
+        <w:tc>
+          <w:tcPr>
+            <w:tcW w:type="dxa" w:w="2700"/>
+          </w:tcPr>
+          <w:p>
+            <w:pPr>
+              <w:pStyle w:val="TableText"/>
+              <w:spacing w:after="60" w:before="60"/>
+            </w:pPr>
+            <w:r>
+              <w:t>Different pregnancy or insufficient evidence</w:t>
+            </w:r>
+          </w:p>
+        </w:tc>
+        <w:tc>
+          <w:tcPr>
+            <w:tcW w:type="dxa" w:w="6660"/>
+          </w:tcPr>
+          <w:p>
+            <w:pPr>
+              <w:pStyle w:val="TableText"/>
+              <w:spacing w:after="60" w:before="60"/>
+            </w:pPr>
+            <w:r>
+              <w:t>Do not exclude the mother broadly. Retain unmatched records and review missing identity or dates.</w:t>
+            </w:r>
+          </w:p>
+        </w:tc>
+      </w:tr>
+    </w:tbl>
+    <w:p>
+      <w:pPr>
+        <w:pStyle w:val="CaptionText"/>
+        <w:pageBreakBefore w:val="0"/>
+      </w:pPr>
+      <w:r>
+        <w:t>The source anchor is HPHT; only when HPHT is absent, use HPL minus the assumed gestation interval. It must exactly equal registry HPHT. This exclusion is not fuzzy matching and does not use the wider tolerances of pregnancy canonicalization.</w:t>
+      </w:r>
+    </w:p>
+    <w:p>
+      <w:pPr>
+        <w:pStyle w:val="CaptionText"/>
+        <w:pageBreakBefore w:val="0"/>
+      </w:pPr>
+      <w:r>
+        <w:t>Independent EPUS or hospital evidence can still support the integrated episode. The gate excludes matching SIGIZI source records, not the mother from every system.</w:t>
       </w:r>
     </w:p>
     <w:p>
@@ -3433,7 +3072,7 @@
               <w:pStyle w:val="TableText"/>
             </w:pPr>
             <w:r>
-              <w:t>SIGIZI cleaning views</w:t>
+              <w:t>SIGIZI clinical cleaning views + vs_sigizi_bumil_hapus</w:t>
             </w:r>
           </w:p>
         </w:tc>
@@ -3452,7 +3091,7 @@
               <w:pStyle w:val="TableText"/>
             </w:pPr>
             <w:r>
-              <w:t>t_sigizi_source_records</w:t>
+              <w:t>t_sigizi_source_records; deletion exclusion audit and summary</w:t>
             </w:r>
           </w:p>
         </w:tc>
@@ -4266,7 +3905,7 @@
     </w:tbl>
     <w:p>
       <w:r>
-        <w:t>Create adapter and reporting views when their definitions change. Seed the geography reference before first use and maintain it deliberately. Run integrity and schema checks after builds. Older adapter builders targeting the same output should not also be scheduled.</w:t>
+        <w:t>Create adapter and reporting views when definitions change. Deploy 01a_sigizi_deleted_registry.sql before the updated source builder. Seed and maintain geography references deliberately. Replace the existing scheduled source-builder SQL in place; do not leave the old builder running alongside it.</w:t>
       </w:r>
     </w:p>
     <w:p>
@@ -6122,12 +5761,12 @@
     </w:p>
     <w:p>
       <w:r>
-        <w:t>Finish each dependency before starting its consumers and stop the chain on failure. Source preparation and geography correction must complete together before SIGIZI episodes are refreshed. Keep the SQL, reference data and reporting contracts under version control, with the reason for each rule change.</w:t>
+        <w:t>Finish each dependency before starting its consumers and stop on failure. Raw deletion exports must finish loading before SIGIZI source preparation. The deletion gate and geography correction must complete before SIGIZI episodes are refreshed. Keep SQL, references and reporting contracts under version control.</w:t>
       </w:r>
     </w:p>
     <w:p>
       <w:r>
-        <w:t>Validate unique canonical IDs, source membership, accepted-link conflicts, geography exceptions and reporting schemas. For a changed rule, compare the affected rows and their source evidence; a deterministic selection is repeatable, but is not by itself proof of a correct match.</w:t>
+        <w:t>Validate source exclusion, audit reconciliation, downstream source membership, unique canonical IDs, accepted-link conflicts, geography and reporting schemas. Compare affected source evidence when a rule changes. Deterministic selection is repeatable, but is not proof of a correct match.</w:t>
       </w:r>
     </w:p>
     <w:p>
@@ -6140,7 +5779,499 @@
     </w:p>
     <w:p>
       <w:r>
-        <w:t>This guide describes the SQL in the Source Preparation, Independent Core and Geography Patch packages available for this review. The raw ingestion schedules and the internal definition of the external facility tracker are outside those packages. No live BigQuery execution or clinical adjudication was performed for this documentation revision.</w:t>
+        <w:t>This guide describes the repository SQL, including the restored SIGIZI deletion gate. Raw ingestion schedules and the external facility tracker build remain outside this repository. Local matching regression checks passed; the supplied BigQuery-native tests and live-data validations must be run in the approved environment. This revision does not certify BigQuery deployment or clinical adjudication.</w:t>
+      </w:r>
+    </w:p>
+    <w:p>
+      <w:pPr>
+        <w:pStyle w:val="Heading2"/>
+        <w:pageBreakBefore/>
+      </w:pPr>
+      <w:r>
+        <w:t>Appendix: deploying and scheduling the deletion update</w:t>
+      </w:r>
+    </w:p>
+    <w:p>
+      <w:pPr>
+        <w:pageBreakBefore w:val="0"/>
+      </w:pPr>
+      <w:r>
+        <w:t>Running the new SQL once does not update a saved BigQuery schedule. The old source builder also replaces t_sigizi_source_records and can reintroduce excluded records on its next run. Save its previous text for rollback and replace the existing scheduled query, rather than adding a competing source job.</w:t>
+      </w:r>
+    </w:p>
+    <w:tbl>
+      <w:tblPr>
+        <w:tblStyle w:val="TableGrid"/>
+        <w:tblW w:type="dxa" w:w="9360"/>
+        <w:tblLayout w:type="fixed"/>
+        <w:tblLook w:firstColumn="1" w:firstRow="1" w:lastColumn="0" w:lastRow="0" w:noHBand="0" w:noVBand="1" w:val="04A0"/>
+        <w:tblInd w:type="dxa" w:w="120"/>
+        <w:tblCellMar>
+          <w:top w:w="90" w:type="dxa"/>
+          <w:bottom w:w="90" w:type="dxa"/>
+          <w:left w:w="120" w:type="dxa"/>
+          <w:right w:w="120" w:type="dxa"/>
+        </w:tblCellMar>
+      </w:tblPr>
+      <w:tblGrid>
+        <w:gridCol w:w="2300"/>
+        <w:gridCol w:w="7060"/>
+      </w:tblGrid>
+      <w:tr>
+        <w:trPr>
+          <w:tblHeader/>
+        </w:trPr>
+        <w:tc>
+          <w:tcPr>
+            <w:tcW w:type="dxa" w:w="2300"/>
+            <w:shd w:fill="E8EFF8"/>
+          </w:tcPr>
+          <w:p>
+            <w:pPr>
+              <w:pStyle w:val="TableText"/>
+              <w:spacing w:after="60" w:before="60"/>
+            </w:pPr>
+            <w:r>
+              <w:rPr>
+                <w:b/>
+              </w:rPr>
+              <w:t>When</w:t>
+            </w:r>
+          </w:p>
+        </w:tc>
+        <w:tc>
+          <w:tcPr>
+            <w:tcW w:type="dxa" w:w="7060"/>
+            <w:shd w:fill="E8EFF8"/>
+          </w:tcPr>
+          <w:p>
+            <w:pPr>
+              <w:pStyle w:val="TableText"/>
+              <w:spacing w:after="60" w:before="60"/>
+            </w:pPr>
+            <w:r>
+              <w:rPr>
+                <w:b/>
+              </w:rPr>
+              <w:t>Action</w:t>
+            </w:r>
+          </w:p>
+        </w:tc>
+      </w:tr>
+      <w:tr>
+        <w:tc>
+          <w:tcPr>
+            <w:tcW w:type="dxa" w:w="2300"/>
+          </w:tcPr>
+          <w:p>
+            <w:pPr>
+              <w:pStyle w:val="TableText"/>
+              <w:spacing w:after="60" w:before="60"/>
+            </w:pPr>
+            <w:r>
+              <w:t>Before deployment</w:t>
+            </w:r>
+          </w:p>
+        </w:tc>
+        <w:tc>
+          <w:tcPr>
+            <w:tcW w:type="dxa" w:w="7060"/>
+          </w:tcPr>
+          <w:p>
+            <w:pPr>
+              <w:pStyle w:val="TableText"/>
+              <w:spacing w:after="60" w:before="60"/>
+            </w:pPr>
+            <w:r>
+              <w:t>Pause overlapping refreshes and preserve approved rollback copies. Confirm the raw deletion registry is available.</w:t>
+            </w:r>
+          </w:p>
+        </w:tc>
+      </w:tr>
+      <w:tr>
+        <w:tc>
+          <w:tcPr>
+            <w:tcW w:type="dxa" w:w="2300"/>
+          </w:tcPr>
+          <w:p>
+            <w:pPr>
+              <w:pStyle w:val="TableText"/>
+              <w:spacing w:after="60" w:before="60"/>
+            </w:pPr>
+            <w:r>
+              <w:t>One-time setup</w:t>
+            </w:r>
+          </w:p>
+        </w:tc>
+        <w:tc>
+          <w:tcPr>
+            <w:tcW w:type="dxa" w:w="7060"/>
+          </w:tcPr>
+          <w:p>
+            <w:pPr>
+              <w:pStyle w:val="TableText"/>
+              <w:spacing w:after="60" w:before="60"/>
+            </w:pPr>
+            <w:r>
+              <w:t>Run 01a_sigizi_deleted_registry.sql and the synthetic deletion regression script.</w:t>
+            </w:r>
+          </w:p>
+        </w:tc>
+      </w:tr>
+      <w:tr>
+        <w:tc>
+          <w:tcPr>
+            <w:tcW w:type="dxa" w:w="2300"/>
+          </w:tcPr>
+          <w:p>
+            <w:pPr>
+              <w:pStyle w:val="TableText"/>
+              <w:spacing w:after="60" w:before="60"/>
+            </w:pPr>
+            <w:r>
+              <w:t>Existing source schedule</w:t>
+            </w:r>
+          </w:p>
+        </w:tc>
+        <w:tc>
+          <w:tcPr>
+            <w:tcW w:type="dxa" w:w="7060"/>
+          </w:tcPr>
+          <w:p>
+            <w:pPr>
+              <w:pStyle w:val="TableText"/>
+              <w:spacing w:after="60" w:before="60"/>
+            </w:pPr>
+            <w:r>
+              <w:t>Replace its full query text with the updated 03_sigizi_source.sql. Retain the approved execution identity and processing location.</w:t>
+            </w:r>
+          </w:p>
+        </w:tc>
+      </w:tr>
+      <w:tr>
+        <w:tc>
+          <w:tcPr>
+            <w:tcW w:type="dxa" w:w="2300"/>
+          </w:tcPr>
+          <w:p>
+            <w:pPr>
+              <w:pStyle w:val="TableText"/>
+              <w:spacing w:after="60" w:before="60"/>
+            </w:pPr>
+            <w:r>
+              <w:t>Each source refresh</w:t>
+            </w:r>
+          </w:p>
+        </w:tc>
+        <w:tc>
+          <w:tcPr>
+            <w:tcW w:type="dxa" w:w="7060"/>
+          </w:tcPr>
+          <w:p>
+            <w:pPr>
+              <w:pStyle w:val="TableText"/>
+              <w:spacing w:after="60" w:before="60"/>
+            </w:pPr>
+            <w:r>
+              <w:t>Finish raw clinical and deletion ingestion; run updated 03, then unchanged 03a geography, then 91 deletion checks.</w:t>
+            </w:r>
+          </w:p>
+        </w:tc>
+      </w:tr>
+      <w:tr>
+        <w:tc>
+          <w:tcPr>
+            <w:tcW w:type="dxa" w:w="2300"/>
+          </w:tcPr>
+          <w:p>
+            <w:pPr>
+              <w:pStyle w:val="TableText"/>
+              <w:spacing w:after="60" w:before="60"/>
+            </w:pPr>
+            <w:r>
+              <w:t>Downstream refresh</w:t>
+            </w:r>
+          </w:p>
+        </w:tc>
+        <w:tc>
+          <w:tcPr>
+            <w:tcW w:type="dxa" w:w="7060"/>
+          </w:tcPr>
+          <w:p>
+            <w:pPr>
+              <w:pStyle w:val="TableText"/>
+              <w:spacing w:after="60" w:before="60"/>
+            </w:pPr>
+            <w:r>
+              <w:t>Rebuild the existing Independent Core sequence. Run 92 downstream deletion checks and the existing integrity/reporting checks.</w:t>
+            </w:r>
+          </w:p>
+        </w:tc>
+      </w:tr>
+      <w:tr>
+        <w:tc>
+          <w:tcPr>
+            <w:tcW w:type="dxa" w:w="2300"/>
+          </w:tcPr>
+          <w:p>
+            <w:pPr>
+              <w:pStyle w:val="TableText"/>
+              <w:spacing w:after="60" w:before="60"/>
+            </w:pPr>
+            <w:r>
+              <w:t>View maintenance</w:t>
+            </w:r>
+          </w:p>
+        </w:tc>
+        <w:tc>
+          <w:tcPr>
+            <w:tcW w:type="dxa" w:w="7060"/>
+          </w:tcPr>
+          <w:p>
+            <w:pPr>
+              <w:pStyle w:val="TableText"/>
+              <w:spacing w:after="60" w:before="60"/>
+            </w:pPr>
+            <w:r>
+              <w:t>No daily recreation of the deletion or reporting views is required solely for refreshed underlying data.</w:t>
+            </w:r>
+          </w:p>
+        </w:tc>
+      </w:tr>
+    </w:tbl>
+    <w:p>
+      <w:pPr>
+        <w:pStyle w:val="CaptionText"/>
+        <w:pageBreakBefore w:val="0"/>
+      </w:pPr>
+      <w:r>
+        <w:t>The Independent Core definitions do not need rewriting for this source gate, but their stored tables must be rebuilt. Retain EPUS preparation and adapter jobs when EPUS inputs also refresh. Jobs must wait for successful dependencies; fixed clock offsets alone do not enforce this.</w:t>
+      </w:r>
+    </w:p>
+    <w:p>
+      <w:pPr>
+        <w:pStyle w:val="CaptionText"/>
+        <w:pageBreakBefore w:val="0"/>
+      </w:pPr>
+      <w:r>
+        <w:t>In BigQuery, open the existing schedule, select Edit, replace the SQL, then choose Schedule query &gt; Update scheduled query. Repository commits do not update BigQuery jobs automatically.</w:t>
+      </w:r>
+    </w:p>
+    <w:p>
+      <w:pPr>
+        <w:pStyle w:val="Heading2"/>
+        <w:pageBreakBefore/>
+      </w:pPr>
+      <w:r>
+        <w:t>Appendix: deletion audit and unresolved evidence</w:t>
+      </w:r>
+    </w:p>
+    <w:tbl>
+      <w:tblPr>
+        <w:tblStyle w:val="TableGrid"/>
+        <w:tblW w:type="dxa" w:w="9360"/>
+        <w:tblLayout w:type="fixed"/>
+        <w:tblLook w:firstColumn="1" w:firstRow="1" w:lastColumn="0" w:lastRow="0" w:noHBand="0" w:noVBand="1" w:val="04A0"/>
+        <w:tblInd w:type="dxa" w:w="120"/>
+        <w:tblCellMar>
+          <w:top w:w="90" w:type="dxa"/>
+          <w:bottom w:w="90" w:type="dxa"/>
+          <w:left w:w="120" w:type="dxa"/>
+          <w:right w:w="120" w:type="dxa"/>
+        </w:tblCellMar>
+      </w:tblPr>
+      <w:tblGrid>
+        <w:gridCol w:w="4100"/>
+        <w:gridCol w:w="5260"/>
+      </w:tblGrid>
+      <w:tr>
+        <w:trPr>
+          <w:tblHeader/>
+        </w:trPr>
+        <w:tc>
+          <w:tcPr>
+            <w:tcW w:type="dxa" w:w="4100"/>
+            <w:shd w:fill="E8EFF8"/>
+          </w:tcPr>
+          <w:p>
+            <w:pPr>
+              <w:pStyle w:val="TableText"/>
+              <w:spacing w:after="60" w:before="60"/>
+            </w:pPr>
+            <w:r>
+              <w:rPr>
+                <w:b/>
+              </w:rPr>
+              <w:t>Object</w:t>
+            </w:r>
+          </w:p>
+        </w:tc>
+        <w:tc>
+          <w:tcPr>
+            <w:tcW w:type="dxa" w:w="5260"/>
+            <w:shd w:fill="E8EFF8"/>
+          </w:tcPr>
+          <w:p>
+            <w:pPr>
+              <w:pStyle w:val="TableText"/>
+              <w:spacing w:after="60" w:before="60"/>
+            </w:pPr>
+            <w:r>
+              <w:rPr>
+                <w:b/>
+              </w:rPr>
+              <w:t>Meaning</w:t>
+            </w:r>
+          </w:p>
+        </w:tc>
+      </w:tr>
+      <w:tr>
+        <w:tc>
+          <w:tcPr>
+            <w:tcW w:type="dxa" w:w="4100"/>
+          </w:tcPr>
+          <w:p>
+            <w:pPr>
+              <w:pStyle w:val="TableText"/>
+              <w:spacing w:after="60" w:before="60"/>
+            </w:pPr>
+            <w:r>
+              <w:t>vs_sigizi_bumil_hapus</w:t>
+            </w:r>
+          </w:p>
+        </w:tc>
+        <w:tc>
+          <w:tcPr>
+            <w:tcW w:type="dxa" w:w="5260"/>
+          </w:tcPr>
+          <w:p>
+            <w:pPr>
+              <w:pStyle w:val="TableText"/>
+              <w:spacing w:after="60" w:before="60"/>
+            </w:pPr>
+            <w:r>
+              <w:t>Parsed, deduplicated deletion reference read from raw_data.sigizi_bumil_hapus_new.</w:t>
+            </w:r>
+          </w:p>
+        </w:tc>
+      </w:tr>
+      <w:tr>
+        <w:tc>
+          <w:tcPr>
+            <w:tcW w:type="dxa" w:w="4100"/>
+          </w:tcPr>
+          <w:p>
+            <w:pPr>
+              <w:pStyle w:val="TableText"/>
+              <w:spacing w:after="60" w:before="60"/>
+            </w:pPr>
+            <w:r>
+              <w:t>t_sigizi_deletion_exclusion_audit</w:t>
+            </w:r>
+          </w:p>
+        </w:tc>
+        <w:tc>
+          <w:tcPr>
+            <w:tcW w:type="dxa" w:w="5260"/>
+          </w:tcPr>
+          <w:p>
+            <w:pPr>
+              <w:pStyle w:val="TableText"/>
+              <w:spacing w:after="60" w:before="60"/>
+            </w:pPr>
+            <w:r>
+              <w:t>Excluded source rows, original payload, anchor method, matching registry references and run identity.</w:t>
+            </w:r>
+          </w:p>
+        </w:tc>
+      </w:tr>
+      <w:tr>
+        <w:tc>
+          <w:tcPr>
+            <w:tcW w:type="dxa" w:w="4100"/>
+          </w:tcPr>
+          <w:p>
+            <w:pPr>
+              <w:pStyle w:val="TableText"/>
+              <w:spacing w:after="60" w:before="60"/>
+            </w:pPr>
+            <w:r>
+              <w:t>t_sigizi_deletion_exclusion_summary</w:t>
+            </w:r>
+          </w:p>
+        </w:tc>
+        <w:tc>
+          <w:tcPr>
+            <w:tcW w:type="dxa" w:w="5260"/>
+          </w:tcPr>
+          <w:p>
+            <w:pPr>
+              <w:pStyle w:val="TableText"/>
+              <w:spacing w:after="60" w:before="60"/>
+            </w:pPr>
+            <w:r>
+              <w:t>Latest-run reconciliation of input, excluded, retained and unresolved source records.</w:t>
+            </w:r>
+          </w:p>
+        </w:tc>
+      </w:tr>
+    </w:tbl>
+    <w:p>
+      <w:pPr>
+        <w:pageBreakBefore w:val="0"/>
+      </w:pPr>
+      <w:r>
+        <w:t>The audit and summary are replaced on each build; they are not append-only history. Retain historical deletion notices upstream and archive audit snapshots inside the approved environment if historical review is required. No raw patient record is physically deleted by this exclusion step.</w:t>
+      </w:r>
+    </w:p>
+    <w:p>
+      <w:pPr>
+        <w:pageBreakBefore w:val="0"/>
+      </w:pPr>
+      <w:r>
+        <w:t>A registry row without HPHT cannot trigger an exact pregnancy exclusion. A source record without HPHT or usable HPL, or without sufficient identity, remains unmatched unless another registry entry qualifies. Do not convert these gaps into a mother-wide blacklist. Restored/reinstated records would require an explicit approved rule; the current gate treats registry membership as deletion evidence.</w:t>
+      </w:r>
+    </w:p>
+    <w:p>
+      <w:pPr>
+        <w:pageBreakBefore w:val="0"/>
+      </w:pPr>
+      <w:r>
+        <w:t>The production builder uses HPHT first, otherwise HPL minus 280 days. Name-only matching is never sufficient. The exact-name fallback also requires maternal birth date and matching pregnancy anchor, and is blocked if both usable NIKs disagree.</w:t>
+      </w:r>
+    </w:p>
+    <w:p>
+      <w:pPr>
+        <w:pageBreakBefore w:val="0"/>
+      </w:pPr>
+      <w:r>
+        <w:t>Run 91_sigizi_deletion_checks.sql after source and geography preparation to detect active matches and reconcile the audit. Run 92_sigizi_deletion_downstream_checks.sql after core rebuilding to detect excluded references still present in SIGIZI episode members or outcome evidence. The episode-ID check is conservative because the membership array does not qualify IDs by source table.</w:t>
+      </w:r>
+    </w:p>
+    <w:p>
+      <w:pPr>
+        <w:pageBreakBefore w:val="0"/>
+      </w:pPr>
+      <w:r>
+        <w:t>Multi-statement source publishing is not an atomic transaction across the full pipeline. If a statement fails, the audit, source and summary may represent different states. Stop downstream work, resolve the error and rerun the complete source builder before continuing.</w:t>
+      </w:r>
+    </w:p>
+    <w:p>
+      <w:pPr>
+        <w:pStyle w:val="CaptionText"/>
+        <w:pageBreakBefore w:val="0"/>
+      </w:pPr>
+      <w:r>
+        <w:t>Traceability: locate an excluded source row by source_table and source_record_id in the exclusion audit; inspect its deletion_matches array, pregnancy anchor and match rule. Keep patient-level diagnostics and registry exports out of GitHub.</w:t>
+      </w:r>
+    </w:p>
+    <w:p>
+      <w:pPr>
+        <w:pStyle w:val="Heading2"/>
+        <w:pageBreakBefore/>
+      </w:pPr>
+      <w:r>
+        <w:t>Appendix: exact raw-source and entry-view pairs</w:t>
       </w:r>
     </w:p>
     <w:p>
@@ -6148,7 +6279,871 @@
         <w:pStyle w:val="CaptionText"/>
       </w:pPr>
       <w:r>
-        <w:t>The first section explains the named data path. The detailed section explains why records join, merge or remain separate. This appendix supplies the object-to-object references for maintenance.</w:t>
+        <w:t>All objects belong to spheres-lombok-barat. Cleaning views are in kohort_bumil_v3 unless another dataset is written. Each row expands a connection within a source group in the diagrams.</w:t>
+      </w:r>
+    </w:p>
+    <w:tbl>
+      <w:tblPr>
+        <w:tblStyle w:val="TableGrid"/>
+        <w:tblW w:type="dxa" w:w="9360"/>
+        <w:jc w:val="left"/>
+        <w:tblLayout w:type="fixed"/>
+        <w:tblLook w:firstColumn="1" w:firstRow="1" w:lastColumn="0" w:lastRow="0" w:noHBand="0" w:noVBand="1" w:val="04A0"/>
+        <w:tblInd w:type="dxa" w:w="120"/>
+      </w:tblPr>
+      <w:tblGrid>
+        <w:gridCol w:w="4680"/>
+        <w:gridCol w:w="4680"/>
+      </w:tblGrid>
+      <w:tr>
+        <w:trPr>
+          <w:cantSplit/>
+          <w:tblHeader/>
+        </w:trPr>
+        <w:tc>
+          <w:tcPr>
+            <w:tcW w:type="dxa" w:w="4680"/>
+            <w:shd w:fill="F2F4F7"/>
+            <w:tcMar>
+              <w:top w:w="80" w:type="dxa"/>
+              <w:bottom w:w="80" w:type="dxa"/>
+              <w:start w:w="120" w:type="dxa"/>
+              <w:end w:w="120" w:type="dxa"/>
+            </w:tcMar>
+          </w:tcPr>
+          <w:p>
+            <w:pPr>
+              <w:pStyle w:val="TableText"/>
+            </w:pPr>
+            <w:r>
+              <w:rPr>
+                <w:b/>
+              </w:rPr>
+              <w:t>SIGIZI source in raw_data</w:t>
+            </w:r>
+          </w:p>
+        </w:tc>
+        <w:tc>
+          <w:tcPr>
+            <w:tcW w:type="dxa" w:w="4680"/>
+            <w:shd w:fill="F2F4F7"/>
+            <w:tcMar>
+              <w:top w:w="80" w:type="dxa"/>
+              <w:bottom w:w="80" w:type="dxa"/>
+              <w:start w:w="120" w:type="dxa"/>
+              <w:end w:w="120" w:type="dxa"/>
+            </w:tcMar>
+          </w:tcPr>
+          <w:p>
+            <w:pPr>
+              <w:pStyle w:val="TableText"/>
+            </w:pPr>
+            <w:r>
+              <w:rPr>
+                <w:b/>
+              </w:rPr>
+              <w:t>Cleaning view</w:t>
+            </w:r>
+          </w:p>
+        </w:tc>
+      </w:tr>
+      <w:tr>
+        <w:trPr>
+          <w:cantSplit/>
+        </w:trPr>
+        <w:tc>
+          <w:tcPr>
+            <w:tcW w:type="dxa" w:w="4680"/>
+            <w:tcMar>
+              <w:top w:w="80" w:type="dxa"/>
+              <w:bottom w:w="80" w:type="dxa"/>
+              <w:start w:w="120" w:type="dxa"/>
+              <w:end w:w="120" w:type="dxa"/>
+            </w:tcMar>
+          </w:tcPr>
+          <w:p>
+            <w:pPr>
+              <w:pStyle w:val="TableText"/>
+            </w:pPr>
+            <w:r>
+              <w:t>sigizi_kesga_bumil_anc</w:t>
+            </w:r>
+          </w:p>
+        </w:tc>
+        <w:tc>
+          <w:tcPr>
+            <w:tcW w:type="dxa" w:w="4680"/>
+            <w:tcMar>
+              <w:top w:w="80" w:type="dxa"/>
+              <w:bottom w:w="80" w:type="dxa"/>
+              <w:start w:w="120" w:type="dxa"/>
+              <w:end w:w="120" w:type="dxa"/>
+            </w:tcMar>
+          </w:tcPr>
+          <w:p>
+            <w:pPr>
+              <w:pStyle w:val="TableText"/>
+            </w:pPr>
+            <w:r>
+              <w:t>vs_sigizi_anc</w:t>
+            </w:r>
+          </w:p>
+        </w:tc>
+      </w:tr>
+      <w:tr>
+        <w:trPr>
+          <w:cantSplit/>
+        </w:trPr>
+        <w:tc>
+          <w:tcPr>
+            <w:tcW w:type="dxa" w:w="4680"/>
+            <w:tcMar>
+              <w:top w:w="80" w:type="dxa"/>
+              <w:bottom w:w="80" w:type="dxa"/>
+              <w:start w:w="120" w:type="dxa"/>
+              <w:end w:w="120" w:type="dxa"/>
+            </w:tcMar>
+          </w:tcPr>
+          <w:p>
+            <w:pPr>
+              <w:pStyle w:val="TableText"/>
+            </w:pPr>
+            <w:r>
+              <w:t>sigizi_daftar_ibu</w:t>
+            </w:r>
+          </w:p>
+        </w:tc>
+        <w:tc>
+          <w:tcPr>
+            <w:tcW w:type="dxa" w:w="4680"/>
+            <w:tcMar>
+              <w:top w:w="80" w:type="dxa"/>
+              <w:bottom w:w="80" w:type="dxa"/>
+              <w:start w:w="120" w:type="dxa"/>
+              <w:end w:w="120" w:type="dxa"/>
+            </w:tcMar>
+          </w:tcPr>
+          <w:p>
+            <w:pPr>
+              <w:pStyle w:val="TableText"/>
+            </w:pPr>
+            <w:r>
+              <w:t>vs_sigizi_daftar_ibu</w:t>
+            </w:r>
+          </w:p>
+        </w:tc>
+      </w:tr>
+      <w:tr>
+        <w:trPr>
+          <w:cantSplit/>
+        </w:trPr>
+        <w:tc>
+          <w:tcPr>
+            <w:tcW w:type="dxa" w:w="4680"/>
+            <w:tcMar>
+              <w:top w:w="80" w:type="dxa"/>
+              <w:bottom w:w="80" w:type="dxa"/>
+              <w:start w:w="120" w:type="dxa"/>
+              <w:end w:w="120" w:type="dxa"/>
+            </w:tcMar>
+          </w:tcPr>
+          <w:p>
+            <w:pPr>
+              <w:pStyle w:val="TableText"/>
+            </w:pPr>
+            <w:r>
+              <w:t>sigizi_daftar_ibu_hamil</w:t>
+            </w:r>
+          </w:p>
+        </w:tc>
+        <w:tc>
+          <w:tcPr>
+            <w:tcW w:type="dxa" w:w="4680"/>
+            <w:tcMar>
+              <w:top w:w="80" w:type="dxa"/>
+              <w:bottom w:w="80" w:type="dxa"/>
+              <w:start w:w="120" w:type="dxa"/>
+              <w:end w:w="120" w:type="dxa"/>
+            </w:tcMar>
+          </w:tcPr>
+          <w:p>
+            <w:pPr>
+              <w:pStyle w:val="TableText"/>
+            </w:pPr>
+            <w:r>
+              <w:t>vs_sigizi_daftar_ibu_hamil</w:t>
+            </w:r>
+          </w:p>
+        </w:tc>
+      </w:tr>
+      <w:tr>
+        <w:trPr>
+          <w:cantSplit/>
+        </w:trPr>
+        <w:tc>
+          <w:tcPr>
+            <w:tcW w:type="dxa" w:w="4680"/>
+            <w:tcMar>
+              <w:top w:w="80" w:type="dxa"/>
+              <w:bottom w:w="80" w:type="dxa"/>
+              <w:start w:w="120" w:type="dxa"/>
+              <w:end w:w="120" w:type="dxa"/>
+            </w:tcMar>
+          </w:tcPr>
+          <w:p>
+            <w:pPr>
+              <w:pStyle w:val="TableText"/>
+            </w:pPr>
+            <w:r>
+              <w:t>sigizi_kohort_ibu</w:t>
+            </w:r>
+          </w:p>
+        </w:tc>
+        <w:tc>
+          <w:tcPr>
+            <w:tcW w:type="dxa" w:w="4680"/>
+            <w:tcMar>
+              <w:top w:w="80" w:type="dxa"/>
+              <w:bottom w:w="80" w:type="dxa"/>
+              <w:start w:w="120" w:type="dxa"/>
+              <w:end w:w="120" w:type="dxa"/>
+            </w:tcMar>
+          </w:tcPr>
+          <w:p>
+            <w:pPr>
+              <w:pStyle w:val="TableText"/>
+            </w:pPr>
+            <w:r>
+              <w:t>vs_sigizi_kohort_ibu</w:t>
+            </w:r>
+          </w:p>
+        </w:tc>
+      </w:tr>
+      <w:tr>
+        <w:trPr>
+          <w:cantSplit/>
+        </w:trPr>
+        <w:tc>
+          <w:tcPr>
+            <w:tcW w:type="dxa" w:w="4680"/>
+            <w:tcMar>
+              <w:top w:w="80" w:type="dxa"/>
+              <w:bottom w:w="80" w:type="dxa"/>
+              <w:start w:w="120" w:type="dxa"/>
+              <w:end w:w="120" w:type="dxa"/>
+            </w:tcMar>
+          </w:tcPr>
+          <w:p>
+            <w:pPr>
+              <w:pStyle w:val="TableText"/>
+            </w:pPr>
+            <w:r>
+              <w:t>sigizi_ibu_nifas</w:t>
+            </w:r>
+          </w:p>
+        </w:tc>
+        <w:tc>
+          <w:tcPr>
+            <w:tcW w:type="dxa" w:w="4680"/>
+            <w:tcMar>
+              <w:top w:w="80" w:type="dxa"/>
+              <w:bottom w:w="80" w:type="dxa"/>
+              <w:start w:w="120" w:type="dxa"/>
+              <w:end w:w="120" w:type="dxa"/>
+            </w:tcMar>
+          </w:tcPr>
+          <w:p>
+            <w:pPr>
+              <w:pStyle w:val="TableText"/>
+            </w:pPr>
+            <w:r>
+              <w:t>vs_sigizi_kohort_nifas</w:t>
+            </w:r>
+          </w:p>
+        </w:tc>
+      </w:tr>
+      <w:tr>
+        <w:trPr>
+          <w:cantSplit/>
+        </w:trPr>
+        <w:tc>
+          <w:tcPr>
+            <w:tcW w:type="dxa" w:w="4680"/>
+            <w:tcMar>
+              <w:top w:w="80" w:type="dxa"/>
+              <w:bottom w:w="80" w:type="dxa"/>
+              <w:start w:w="120" w:type="dxa"/>
+              <w:end w:w="120" w:type="dxa"/>
+            </w:tcMar>
+          </w:tcPr>
+          <w:p>
+            <w:pPr>
+              <w:pStyle w:val="TableText"/>
+            </w:pPr>
+            <w:r>
+              <w:t>sigizi_bumil_hapus_new</w:t>
+            </w:r>
+          </w:p>
+        </w:tc>
+        <w:tc>
+          <w:tcPr>
+            <w:tcW w:type="dxa" w:w="4680"/>
+            <w:tcMar>
+              <w:top w:w="80" w:type="dxa"/>
+              <w:bottom w:w="80" w:type="dxa"/>
+              <w:start w:w="120" w:type="dxa"/>
+              <w:end w:w="120" w:type="dxa"/>
+            </w:tcMar>
+          </w:tcPr>
+          <w:p>
+            <w:pPr>
+              <w:pStyle w:val="TableText"/>
+            </w:pPr>
+            <w:r>
+              <w:t>vs_sigizi_bumil_hapus (exclusion reference)</w:t>
+            </w:r>
+          </w:p>
+        </w:tc>
+      </w:tr>
+    </w:tbl>
+    <w:p>
+      <w:pPr>
+        <w:pStyle w:val="Heading2"/>
+      </w:pPr>
+      <w:r>
+        <w:t>EPUS</w:t>
+      </w:r>
+    </w:p>
+    <w:tbl>
+      <w:tblPr>
+        <w:tblStyle w:val="TableGrid"/>
+        <w:tblW w:type="dxa" w:w="9360"/>
+        <w:jc w:val="left"/>
+        <w:tblLayout w:type="fixed"/>
+        <w:tblLook w:firstColumn="1" w:firstRow="1" w:lastColumn="0" w:lastRow="0" w:noHBand="0" w:noVBand="1" w:val="04A0"/>
+        <w:tblInd w:type="dxa" w:w="120"/>
+      </w:tblPr>
+      <w:tblGrid>
+        <w:gridCol w:w="4680"/>
+        <w:gridCol w:w="4680"/>
+      </w:tblGrid>
+      <w:tr>
+        <w:trPr>
+          <w:cantSplit/>
+          <w:tblHeader/>
+        </w:trPr>
+        <w:tc>
+          <w:tcPr>
+            <w:tcW w:type="dxa" w:w="4680"/>
+            <w:shd w:fill="F2F4F7"/>
+            <w:tcMar>
+              <w:top w:w="80" w:type="dxa"/>
+              <w:bottom w:w="80" w:type="dxa"/>
+              <w:start w:w="120" w:type="dxa"/>
+              <w:end w:w="120" w:type="dxa"/>
+            </w:tcMar>
+          </w:tcPr>
+          <w:p>
+            <w:pPr>
+              <w:pStyle w:val="TableText"/>
+            </w:pPr>
+            <w:r>
+              <w:rPr>
+                <w:b/>
+              </w:rPr>
+              <w:t>EPUS source in raw_data</w:t>
+            </w:r>
+          </w:p>
+        </w:tc>
+        <w:tc>
+          <w:tcPr>
+            <w:tcW w:type="dxa" w:w="4680"/>
+            <w:shd w:fill="F2F4F7"/>
+            <w:tcMar>
+              <w:top w:w="80" w:type="dxa"/>
+              <w:bottom w:w="80" w:type="dxa"/>
+              <w:start w:w="120" w:type="dxa"/>
+              <w:end w:w="120" w:type="dxa"/>
+            </w:tcMar>
+          </w:tcPr>
+          <w:p>
+            <w:pPr>
+              <w:pStyle w:val="TableText"/>
+            </w:pPr>
+            <w:r>
+              <w:rPr>
+                <w:b/>
+              </w:rPr>
+              <w:t>Cleaning view</w:t>
+            </w:r>
+          </w:p>
+        </w:tc>
+      </w:tr>
+      <w:tr>
+        <w:trPr>
+          <w:cantSplit/>
+        </w:trPr>
+        <w:tc>
+          <w:tcPr>
+            <w:tcW w:type="dxa" w:w="4680"/>
+            <w:tcMar>
+              <w:top w:w="80" w:type="dxa"/>
+              <w:bottom w:w="80" w:type="dxa"/>
+              <w:start w:w="120" w:type="dxa"/>
+              <w:end w:w="120" w:type="dxa"/>
+            </w:tcMar>
+          </w:tcPr>
+          <w:p>
+            <w:pPr>
+              <w:pStyle w:val="TableText"/>
+            </w:pPr>
+            <w:r>
+              <w:t>epus_anc</w:t>
+            </w:r>
+          </w:p>
+        </w:tc>
+        <w:tc>
+          <w:tcPr>
+            <w:tcW w:type="dxa" w:w="4680"/>
+            <w:tcMar>
+              <w:top w:w="80" w:type="dxa"/>
+              <w:bottom w:w="80" w:type="dxa"/>
+              <w:start w:w="120" w:type="dxa"/>
+              <w:end w:w="120" w:type="dxa"/>
+            </w:tcMar>
+          </w:tcPr>
+          <w:p>
+            <w:pPr>
+              <w:pStyle w:val="TableText"/>
+            </w:pPr>
+            <w:r>
+              <w:t>vs_epus_anc</w:t>
+            </w:r>
+          </w:p>
+        </w:tc>
+      </w:tr>
+      <w:tr>
+        <w:trPr>
+          <w:cantSplit/>
+        </w:trPr>
+        <w:tc>
+          <w:tcPr>
+            <w:tcW w:type="dxa" w:w="4680"/>
+            <w:tcMar>
+              <w:top w:w="80" w:type="dxa"/>
+              <w:bottom w:w="80" w:type="dxa"/>
+              <w:start w:w="120" w:type="dxa"/>
+              <w:end w:w="120" w:type="dxa"/>
+            </w:tcMar>
+          </w:tcPr>
+          <w:p>
+            <w:pPr>
+              <w:pStyle w:val="TableText"/>
+            </w:pPr>
+            <w:r>
+              <w:t>epus_inc</w:t>
+            </w:r>
+          </w:p>
+        </w:tc>
+        <w:tc>
+          <w:tcPr>
+            <w:tcW w:type="dxa" w:w="4680"/>
+            <w:tcMar>
+              <w:top w:w="80" w:type="dxa"/>
+              <w:bottom w:w="80" w:type="dxa"/>
+              <w:start w:w="120" w:type="dxa"/>
+              <w:end w:w="120" w:type="dxa"/>
+            </w:tcMar>
+          </w:tcPr>
+          <w:p>
+            <w:pPr>
+              <w:pStyle w:val="TableText"/>
+            </w:pPr>
+            <w:r>
+              <w:t>vs_epus_inc</w:t>
+            </w:r>
+          </w:p>
+        </w:tc>
+      </w:tr>
+      <w:tr>
+        <w:trPr>
+          <w:cantSplit/>
+        </w:trPr>
+        <w:tc>
+          <w:tcPr>
+            <w:tcW w:type="dxa" w:w="4680"/>
+            <w:tcMar>
+              <w:top w:w="80" w:type="dxa"/>
+              <w:bottom w:w="80" w:type="dxa"/>
+              <w:start w:w="120" w:type="dxa"/>
+              <w:end w:w="120" w:type="dxa"/>
+            </w:tcMar>
+          </w:tcPr>
+          <w:p>
+            <w:pPr>
+              <w:pStyle w:val="TableText"/>
+            </w:pPr>
+            <w:r>
+              <w:t>epus_pnc</w:t>
+            </w:r>
+          </w:p>
+        </w:tc>
+        <w:tc>
+          <w:tcPr>
+            <w:tcW w:type="dxa" w:w="4680"/>
+            <w:tcMar>
+              <w:top w:w="80" w:type="dxa"/>
+              <w:bottom w:w="80" w:type="dxa"/>
+              <w:start w:w="120" w:type="dxa"/>
+              <w:end w:w="120" w:type="dxa"/>
+            </w:tcMar>
+          </w:tcPr>
+          <w:p>
+            <w:pPr>
+              <w:pStyle w:val="TableText"/>
+            </w:pPr>
+            <w:r>
+              <w:t>vs_epus_pnc</w:t>
+            </w:r>
+          </w:p>
+        </w:tc>
+      </w:tr>
+      <w:tr>
+        <w:trPr>
+          <w:cantSplit/>
+        </w:trPr>
+        <w:tc>
+          <w:tcPr>
+            <w:tcW w:type="dxa" w:w="4680"/>
+            <w:tcMar>
+              <w:top w:w="80" w:type="dxa"/>
+              <w:bottom w:w="80" w:type="dxa"/>
+              <w:start w:w="120" w:type="dxa"/>
+              <w:end w:w="120" w:type="dxa"/>
+            </w:tcMar>
+          </w:tcPr>
+          <w:p>
+            <w:pPr>
+              <w:pStyle w:val="TableText"/>
+            </w:pPr>
+            <w:r>
+              <w:t>epus_kunjungan_ibu_hamil</w:t>
+            </w:r>
+          </w:p>
+        </w:tc>
+        <w:tc>
+          <w:tcPr>
+            <w:tcW w:type="dxa" w:w="4680"/>
+            <w:tcMar>
+              <w:top w:w="80" w:type="dxa"/>
+              <w:bottom w:w="80" w:type="dxa"/>
+              <w:start w:w="120" w:type="dxa"/>
+              <w:end w:w="120" w:type="dxa"/>
+            </w:tcMar>
+          </w:tcPr>
+          <w:p>
+            <w:pPr>
+              <w:pStyle w:val="TableText"/>
+            </w:pPr>
+            <w:r>
+              <w:t>vs_kohort_epus_kunjungan_ibu_hamil</w:t>
+            </w:r>
+          </w:p>
+        </w:tc>
+      </w:tr>
+    </w:tbl>
+    <w:p>
+      <w:pPr>
+        <w:pStyle w:val="Heading2"/>
+      </w:pPr>
+      <w:r>
+        <w:t>SIMRS, Kobo and facility reporting</w:t>
+      </w:r>
+    </w:p>
+    <w:tbl>
+      <w:tblPr>
+        <w:tblStyle w:val="TableGrid"/>
+        <w:tblW w:type="dxa" w:w="9360"/>
+        <w:jc w:val="left"/>
+        <w:tblLayout w:type="fixed"/>
+        <w:tblLook w:firstColumn="1" w:firstRow="1" w:lastColumn="0" w:lastRow="0" w:noHBand="0" w:noVBand="1" w:val="04A0"/>
+        <w:tblInd w:type="dxa" w:w="120"/>
+      </w:tblPr>
+      <w:tblGrid>
+        <w:gridCol w:w="4680"/>
+        <w:gridCol w:w="4680"/>
+      </w:tblGrid>
+      <w:tr>
+        <w:trPr>
+          <w:cantSplit/>
+          <w:tblHeader/>
+        </w:trPr>
+        <w:tc>
+          <w:tcPr>
+            <w:tcW w:type="dxa" w:w="4680"/>
+            <w:shd w:fill="F2F4F7"/>
+            <w:tcMar>
+              <w:top w:w="80" w:type="dxa"/>
+              <w:bottom w:w="80" w:type="dxa"/>
+              <w:start w:w="120" w:type="dxa"/>
+              <w:end w:w="120" w:type="dxa"/>
+            </w:tcMar>
+          </w:tcPr>
+          <w:p>
+            <w:pPr>
+              <w:pStyle w:val="TableText"/>
+            </w:pPr>
+            <w:r>
+              <w:rPr>
+                <w:b/>
+              </w:rPr>
+              <w:t>Source / external boundary</w:t>
+            </w:r>
+          </w:p>
+        </w:tc>
+        <w:tc>
+          <w:tcPr>
+            <w:tcW w:type="dxa" w:w="4680"/>
+            <w:shd w:fill="F2F4F7"/>
+            <w:tcMar>
+              <w:top w:w="80" w:type="dxa"/>
+              <w:bottom w:w="80" w:type="dxa"/>
+              <w:start w:w="120" w:type="dxa"/>
+              <w:end w:w="120" w:type="dxa"/>
+            </w:tcMar>
+          </w:tcPr>
+          <w:p>
+            <w:pPr>
+              <w:pStyle w:val="TableText"/>
+            </w:pPr>
+            <w:r>
+              <w:rPr>
+                <w:b/>
+              </w:rPr>
+              <w:t>Entry view</w:t>
+            </w:r>
+          </w:p>
+        </w:tc>
+      </w:tr>
+      <w:tr>
+        <w:trPr>
+          <w:cantSplit/>
+        </w:trPr>
+        <w:tc>
+          <w:tcPr>
+            <w:tcW w:type="dxa" w:w="4680"/>
+            <w:tcMar>
+              <w:top w:w="80" w:type="dxa"/>
+              <w:bottom w:w="80" w:type="dxa"/>
+              <w:start w:w="120" w:type="dxa"/>
+              <w:end w:w="120" w:type="dxa"/>
+            </w:tcMar>
+          </w:tcPr>
+          <w:p>
+            <w:pPr>
+              <w:pStyle w:val="TableText"/>
+            </w:pPr>
+            <w:r>
+              <w:t>raw_data.simrs_patut_patuh_inc</w:t>
+            </w:r>
+          </w:p>
+        </w:tc>
+        <w:tc>
+          <w:tcPr>
+            <w:tcW w:type="dxa" w:w="4680"/>
+            <w:tcMar>
+              <w:top w:w="80" w:type="dxa"/>
+              <w:bottom w:w="80" w:type="dxa"/>
+              <w:start w:w="120" w:type="dxa"/>
+              <w:end w:w="120" w:type="dxa"/>
+            </w:tcMar>
+          </w:tcPr>
+          <w:p>
+            <w:pPr>
+              <w:pStyle w:val="TableText"/>
+            </w:pPr>
+            <w:r>
+              <w:t>vs_simrs_patut_patuh_inc</w:t>
+            </w:r>
+          </w:p>
+        </w:tc>
+      </w:tr>
+      <w:tr>
+        <w:trPr>
+          <w:cantSplit/>
+        </w:trPr>
+        <w:tc>
+          <w:tcPr>
+            <w:tcW w:type="dxa" w:w="4680"/>
+            <w:tcMar>
+              <w:top w:w="80" w:type="dxa"/>
+              <w:bottom w:w="80" w:type="dxa"/>
+              <w:start w:w="120" w:type="dxa"/>
+              <w:end w:w="120" w:type="dxa"/>
+            </w:tcMar>
+          </w:tcPr>
+          <w:p>
+            <w:pPr>
+              <w:pStyle w:val="TableText"/>
+            </w:pPr>
+            <w:r>
+              <w:t>data_kobo_form.e-form_pencatatan_pelayanan_intranatal_care</w:t>
+            </w:r>
+          </w:p>
+        </w:tc>
+        <w:tc>
+          <w:tcPr>
+            <w:tcW w:type="dxa" w:w="4680"/>
+            <w:tcMar>
+              <w:top w:w="80" w:type="dxa"/>
+              <w:bottom w:w="80" w:type="dxa"/>
+              <w:start w:w="120" w:type="dxa"/>
+              <w:end w:w="120" w:type="dxa"/>
+            </w:tcMar>
+          </w:tcPr>
+          <w:p>
+            <w:pPr>
+              <w:pStyle w:val="TableText"/>
+            </w:pPr>
+            <w:r>
+              <w:t>vs_kobo_inc_submission_clean → vs_kobo_inc_case_master</w:t>
+            </w:r>
+          </w:p>
+        </w:tc>
+      </w:tr>
+      <w:tr>
+        <w:trPr>
+          <w:cantSplit/>
+        </w:trPr>
+        <w:tc>
+          <w:tcPr>
+            <w:tcW w:type="dxa" w:w="4680"/>
+            <w:tcMar>
+              <w:top w:w="80" w:type="dxa"/>
+              <w:bottom w:w="80" w:type="dxa"/>
+              <w:start w:w="120" w:type="dxa"/>
+              <w:end w:w="120" w:type="dxa"/>
+            </w:tcMar>
+          </w:tcPr>
+          <w:p>
+            <w:pPr>
+              <w:pStyle w:val="TableText"/>
+            </w:pPr>
+            <w:r>
+              <w:t>data_adjudication.adj_final</w:t>
+            </w:r>
+          </w:p>
+        </w:tc>
+        <w:tc>
+          <w:tcPr>
+            <w:tcW w:type="dxa" w:w="4680"/>
+            <w:tcMar>
+              <w:top w:w="80" w:type="dxa"/>
+              <w:bottom w:w="80" w:type="dxa"/>
+              <w:start w:w="120" w:type="dxa"/>
+              <w:end w:w="120" w:type="dxa"/>
+            </w:tcMar>
+          </w:tcPr>
+          <w:p>
+            <w:pPr>
+              <w:pStyle w:val="TableText"/>
+            </w:pPr>
+            <w:r>
+              <w:t>Also feeds vs_kobo_inc_case_master</w:t>
+            </w:r>
+          </w:p>
+        </w:tc>
+      </w:tr>
+      <w:tr>
+        <w:trPr>
+          <w:cantSplit/>
+        </w:trPr>
+        <w:tc>
+          <w:tcPr>
+            <w:tcW w:type="dxa" w:w="4680"/>
+            <w:tcMar>
+              <w:top w:w="80" w:type="dxa"/>
+              <w:bottom w:w="80" w:type="dxa"/>
+              <w:start w:w="120" w:type="dxa"/>
+              <w:end w:w="120" w:type="dxa"/>
+            </w:tcMar>
+          </w:tcPr>
+          <w:p>
+            <w:pPr>
+              <w:pStyle w:val="TableText"/>
+            </w:pPr>
+            <w:r>
+              <w:t>data_kobo_form.neonatus_outcome_v2</w:t>
+            </w:r>
+          </w:p>
+        </w:tc>
+        <w:tc>
+          <w:tcPr>
+            <w:tcW w:type="dxa" w:w="4680"/>
+            <w:tcMar>
+              <w:top w:w="80" w:type="dxa"/>
+              <w:bottom w:w="80" w:type="dxa"/>
+              <w:start w:w="120" w:type="dxa"/>
+              <w:end w:w="120" w:type="dxa"/>
+            </w:tcMar>
+          </w:tcPr>
+          <w:p>
+            <w:pPr>
+              <w:pStyle w:val="TableText"/>
+            </w:pPr>
+            <w:r>
+              <w:t>vs_kobo_neonatus_outcome_v2_baby</w:t>
+            </w:r>
+          </w:p>
+        </w:tc>
+      </w:tr>
+      <w:tr>
+        <w:trPr>
+          <w:cantSplit/>
+        </w:trPr>
+        <w:tc>
+          <w:tcPr>
+            <w:tcW w:type="dxa" w:w="4680"/>
+            <w:tcMar>
+              <w:top w:w="80" w:type="dxa"/>
+              <w:bottom w:w="80" w:type="dxa"/>
+              <w:start w:w="120" w:type="dxa"/>
+              <w:end w:w="120" w:type="dxa"/>
+            </w:tcMar>
+          </w:tcPr>
+          <w:p>
+            <w:pPr>
+              <w:pStyle w:val="TableText"/>
+            </w:pPr>
+            <w:r>
+              <w:t>Facility birth reporting (upstream build outside repository)</w:t>
+            </w:r>
+          </w:p>
+        </w:tc>
+        <w:tc>
+          <w:tcPr>
+            <w:tcW w:type="dxa" w:w="4680"/>
+            <w:tcMar>
+              <w:top w:w="80" w:type="dxa"/>
+              <w:bottom w:w="80" w:type="dxa"/>
+              <w:start w:w="120" w:type="dxa"/>
+              <w:end w:w="120" w:type="dxa"/>
+            </w:tcMar>
+          </w:tcPr>
+          <w:p>
+            <w:pPr>
+              <w:pStyle w:val="TableText"/>
+            </w:pPr>
+            <w:r>
+              <w:t>birth_report_faskes.v_inc_report_tracker</w:t>
+            </w:r>
+          </w:p>
+        </w:tc>
+      </w:tr>
+    </w:tbl>
+    <w:p>
+      <w:r>
+        <w:t>The source-group diagrams describe the primary production path. They do not imply that every view in a bundled box reads every raw table. The pairs above preserve the exact adapter relationships; the reporting-dependency appendix documents additional source reads for timing, weight and audit analyses.</w:t>
       </w:r>
     </w:p>
     <w:sectPr>
@@ -6161,6 +7156,27 @@
     </w:sectPr>
   </w:body>
 </w:document>
+</file>
+
+<file path=word/comments.xml><?xml version="1.0" encoding="utf-8"?>
+<w:comments xmlns:a="http://schemas.openxmlformats.org/drawingml/2006/main" xmlns:pic="http://schemas.openxmlformats.org/drawingml/2006/picture" xmlns:r="http://schemas.openxmlformats.org/officeDocument/2006/relationships" xmlns:w="http://schemas.openxmlformats.org/wordprocessingml/2006/main" xmlns:wp="http://schemas.openxmlformats.org/drawingml/2006/wordprocessingDrawing" xmlns:mc="http://schemas.openxmlformats.org/markup-compatibility/2006" xmlns:a14="http://schemas.microsoft.com/office/drawing/2010/main" xmlns:w14="http://schemas.microsoft.com/office/word/2010/wordml" xmlns:wpc="http://schemas.microsoft.com/office/word/2010/wordprocessingCanvas">
+  <w:comment w:id="0" w:author="Documentation review" w:initials="DR" w:date="2026-09-03T21:21:00Z">
+    <w:p>
+      <w:pPr>
+        <w:pStyle w:val="CommentText"/>
+      </w:pPr>
+      <w:r>
+        <w:rPr>
+          <w:rStyle w:val="CommentReference"/>
+        </w:rPr>
+        <w:annotationRef/>
+      </w:r>
+      <w:r>
+        <w:t>Revision: adds the restored SIGIZI deletion registry before source publication. This is pregnancy-specific exclusion, not a global patient blacklist.</w:t>
+      </w:r>
+    </w:p>
+  </w:comment>
+</w:comments>
 </file>
 
 <file path=word/footer1.xml><?xml version="1.0" encoding="utf-8"?>

</xml_diff>

<commit_message>
Add worked pipeline examples to Word guide
Document fictional examples of source cleaning, SIGIZI deletion exclusion, pregnancy and ANC deduplication, cross-source matching, delivery linkage, and reporting joins.
</commit_message>
<xml_diff>
--- a/docs/Lombok_Barat_v3_Data_Flow_and_Matching.docx
+++ b/docs/Lombok_Barat_v3_Data_Flow_and_Matching.docx
@@ -23,7 +23,7 @@
         <w:pStyle w:val="CaptionText"/>
       </w:pPr>
       <w:r>
-        <w:t>Source-group edition | SIGIZI deletion exclusions | workflow and matching logic</w:t>
+        <w:t>Worked-example edition | fictional records | SIGIZI deletion exclusions</w:t>
       </w:r>
     </w:p>
     <w:p>
@@ -384,6 +384,483 @@
     </w:p>
     <w:p>
       <w:pPr>
+        <w:pStyle w:val="Heading2"/>
+        <w:pageBreakBefore/>
+      </w:pPr>
+      <w:commentRangeStart w:id="1"/>
+      <w:r>
+        <w:t>A simple story: follow Siti Aminah through the pipeline</w:t>
+      </w:r>
+      <w:commentRangeEnd w:id="1"/>
+      <w:r>
+        <w:rPr>
+          <w:rStyle w:val="CommentReference"/>
+        </w:rPr>
+        <w:commentReference w:id="1"/>
+      </w:r>
+    </w:p>
+    <w:p>
+      <w:pPr>
+        <w:pageBreakBefore w:val="0"/>
+      </w:pPr>
+      <w:r>
+        <w:t>Siti Aminah is a fictional mother. Her pregnancy appears in several systems because different staff record registration, ANC visits and delivery. These are not automatically different pregnancies.</w:t>
+      </w:r>
+    </w:p>
+    <w:p>
+      <w:pPr>
+        <w:pStyle w:val="CaptionText"/>
+        <w:pageBreakBefore w:val="0"/>
+      </w:pPr>
+      <w:r>
+        <w:t>All examples in this guide are invented. NIK-A and PHONE-A represent usable cleaned values, not literal values to paste into SQL. Short IDs such as P-A are teaching labels, not production hashes. Dates and row quantities below describe examples, not dashboard results.</w:t>
+      </w:r>
+    </w:p>
+    <w:tbl>
+      <w:tblPr>
+        <w:tblStyle w:val="TableGrid"/>
+        <w:tblW w:type="dxa" w:w="9360"/>
+        <w:tblLayout w:type="fixed"/>
+        <w:tblLook w:firstColumn="1" w:firstRow="1" w:lastColumn="0" w:lastRow="0" w:noHBand="0" w:noVBand="1" w:val="04A0"/>
+        <w:tblInd w:w="120" w:type="dxa"/>
+        <w:tblCellMar>
+          <w:top w:w="85" w:type="dxa"/>
+          <w:bottom w:w="85" w:type="dxa"/>
+          <w:left w:w="120" w:type="dxa"/>
+          <w:right w:w="120" w:type="dxa"/>
+        </w:tblCellMar>
+      </w:tblPr>
+      <w:tblGrid>
+        <w:gridCol w:w="2500"/>
+        <w:gridCol w:w="3300"/>
+        <w:gridCol w:w="3560"/>
+      </w:tblGrid>
+      <w:tr>
+        <w:trPr>
+          <w:cantSplit/>
+          <w:tblHeader/>
+        </w:trPr>
+        <w:tc>
+          <w:tcPr>
+            <w:tcW w:type="dxa" w:w="2500"/>
+            <w:vAlign w:val="center"/>
+            <w:shd w:fill="E8EFF8"/>
+          </w:tcPr>
+          <w:p>
+            <w:pPr>
+              <w:pStyle w:val="ExampleTableText"/>
+            </w:pPr>
+            <w:r>
+              <w:rPr>
+                <w:b/>
+              </w:rPr>
+              <w:t>Where a record starts</w:t>
+            </w:r>
+          </w:p>
+        </w:tc>
+        <w:tc>
+          <w:tcPr>
+            <w:tcW w:type="dxa" w:w="3300"/>
+            <w:vAlign w:val="center"/>
+            <w:shd w:fill="E8EFF8"/>
+          </w:tcPr>
+          <w:p>
+            <w:pPr>
+              <w:pStyle w:val="ExampleTableText"/>
+            </w:pPr>
+            <w:r>
+              <w:rPr>
+                <w:b/>
+              </w:rPr>
+              <w:t>What it says</w:t>
+            </w:r>
+          </w:p>
+        </w:tc>
+        <w:tc>
+          <w:tcPr>
+            <w:tcW w:type="dxa" w:w="3560"/>
+            <w:vAlign w:val="center"/>
+            <w:shd w:fill="E8EFF8"/>
+          </w:tcPr>
+          <w:p>
+            <w:pPr>
+              <w:pStyle w:val="ExampleTableText"/>
+            </w:pPr>
+            <w:r>
+              <w:rPr>
+                <w:b/>
+              </w:rPr>
+              <w:t>What happens next</w:t>
+            </w:r>
+          </w:p>
+        </w:tc>
+      </w:tr>
+      <w:tr>
+        <w:trPr>
+          <w:cantSplit/>
+        </w:trPr>
+        <w:tc>
+          <w:tcPr>
+            <w:tcW w:type="dxa" w:w="2500"/>
+            <w:vAlign w:val="center"/>
+          </w:tcPr>
+          <w:p>
+            <w:pPr>
+              <w:pStyle w:val="ExampleTableText"/>
+            </w:pPr>
+            <w:r>
+              <w:t>SIGIZI registration and ANC</w:t>
+            </w:r>
+          </w:p>
+        </w:tc>
+        <w:tc>
+          <w:tcPr>
+            <w:tcW w:type="dxa" w:w="3300"/>
+            <w:vAlign w:val="center"/>
+          </w:tcPr>
+          <w:p>
+            <w:pPr>
+              <w:pStyle w:val="ExampleTableText"/>
+            </w:pPr>
+            <w:r>
+              <w:t>Siti Aminah; NIK-A; HPHT 2025-12-01</w:t>
+            </w:r>
+          </w:p>
+        </w:tc>
+        <w:tc>
+          <w:tcPr>
+            <w:tcW w:type="dxa" w:w="3560"/>
+            <w:vAlign w:val="center"/>
+          </w:tcPr>
+          <w:p>
+            <w:pPr>
+              <w:pStyle w:val="ExampleTableText"/>
+            </w:pPr>
+            <w:r>
+              <w:t>Clean records, check bumil hapus, correct geography, then group the same pregnancy.</w:t>
+            </w:r>
+          </w:p>
+        </w:tc>
+      </w:tr>
+      <w:tr>
+        <w:trPr>
+          <w:cantSplit/>
+        </w:trPr>
+        <w:tc>
+          <w:tcPr>
+            <w:tcW w:type="dxa" w:w="2500"/>
+            <w:vAlign w:val="center"/>
+          </w:tcPr>
+          <w:p>
+            <w:pPr>
+              <w:pStyle w:val="ExampleTableText"/>
+            </w:pPr>
+            <w:r>
+              <w:t>EPUS ANC and pregnancy visit</w:t>
+            </w:r>
+          </w:p>
+        </w:tc>
+        <w:tc>
+          <w:tcPr>
+            <w:tcW w:type="dxa" w:w="3300"/>
+            <w:vAlign w:val="center"/>
+          </w:tcPr>
+          <w:p>
+            <w:pPr>
+              <w:pStyle w:val="ExampleTableText"/>
+            </w:pPr>
+            <w:r>
+              <w:t>SITI AMINAH; NIK-A; HPHT 2025-12-03</w:t>
+            </w:r>
+          </w:p>
+        </w:tc>
+        <w:tc>
+          <w:tcPr>
+            <w:tcW w:type="dxa" w:w="3560"/>
+            <w:vAlign w:val="center"/>
+          </w:tcPr>
+          <w:p>
+            <w:pPr>
+              <w:pStyle w:val="ExampleTableText"/>
+            </w:pPr>
+            <w:r>
+              <w:t>Assign the mother and pregnancy; combine duplicate representations of an ANC encounter.</w:t>
+            </w:r>
+          </w:p>
+        </w:tc>
+      </w:tr>
+      <w:tr>
+        <w:trPr>
+          <w:cantSplit/>
+        </w:trPr>
+        <w:tc>
+          <w:tcPr>
+            <w:tcW w:type="dxa" w:w="2500"/>
+            <w:vAlign w:val="center"/>
+          </w:tcPr>
+          <w:p>
+            <w:pPr>
+              <w:pStyle w:val="ExampleTableText"/>
+            </w:pPr>
+            <w:r>
+              <w:t>Pregnancy matching</w:t>
+            </w:r>
+          </w:p>
+        </w:tc>
+        <w:tc>
+          <w:tcPr>
+            <w:tcW w:type="dxa" w:w="3300"/>
+            <w:vAlign w:val="center"/>
+          </w:tcPr>
+          <w:p>
+            <w:pPr>
+              <w:pStyle w:val="ExampleTableText"/>
+            </w:pPr>
+            <w:r>
+              <w:t>Same NIK; pregnancy anchors differ by two days</w:t>
+            </w:r>
+          </w:p>
+        </w:tc>
+        <w:tc>
+          <w:tcPr>
+            <w:tcW w:type="dxa" w:w="3560"/>
+            <w:vAlign w:val="center"/>
+          </w:tcPr>
+          <w:p>
+            <w:pPr>
+              <w:pStyle w:val="ExampleTableText"/>
+            </w:pPr>
+            <w:r>
+              <w:t>The SIGIZI and EPUS episodes qualify for NIK + anchor matching.</w:t>
+            </w:r>
+          </w:p>
+        </w:tc>
+      </w:tr>
+      <w:tr>
+        <w:trPr>
+          <w:cantSplit/>
+        </w:trPr>
+        <w:tc>
+          <w:tcPr>
+            <w:tcW w:type="dxa" w:w="2500"/>
+            <w:vAlign w:val="center"/>
+          </w:tcPr>
+          <w:p>
+            <w:pPr>
+              <w:pStyle w:val="ExampleTableText"/>
+            </w:pPr>
+            <w:r>
+              <w:t>SIGIZI / EPUS / SIMRS delivery evidence</w:t>
+            </w:r>
+          </w:p>
+        </w:tc>
+        <w:tc>
+          <w:tcPr>
+            <w:tcW w:type="dxa" w:w="3300"/>
+            <w:vAlign w:val="center"/>
+          </w:tcPr>
+          <w:p>
+            <w:pPr>
+              <w:pStyle w:val="ExampleTableText"/>
+            </w:pPr>
+            <w:r>
+              <w:t>Same mother; delivery 2026-08-31</w:t>
+            </w:r>
+          </w:p>
+        </w:tc>
+        <w:tc>
+          <w:tcPr>
+            <w:tcW w:type="dxa" w:w="3560"/>
+            <w:vAlign w:val="center"/>
+          </w:tcPr>
+          <w:p>
+            <w:pPr>
+              <w:pStyle w:val="ExampleTableText"/>
+            </w:pPr>
+            <w:r>
+              <w:t>Deduplicate reports into a delivery event, then link that event to the pregnancy.</w:t>
+            </w:r>
+          </w:p>
+        </w:tc>
+      </w:tr>
+    </w:tbl>
+    <w:p>
+      <w:pPr>
+        <w:pStyle w:val="CaptionText"/>
+        <w:pageBreakBefore w:val="0"/>
+        <w:spacing w:after="20"/>
+      </w:pPr>
+    </w:p>
+    <w:p>
+      <w:pPr>
+        <w:pStyle w:val="Heading3"/>
+        <w:pageBreakBefore w:val="0"/>
+      </w:pPr>
+      <w:r>
+        <w:t>What the reader sees at the end</w:t>
+      </w:r>
+    </w:p>
+    <w:tbl>
+      <w:tblPr>
+        <w:tblStyle w:val="TableGrid"/>
+        <w:tblW w:type="dxa" w:w="9360"/>
+        <w:tblLayout w:type="fixed"/>
+        <w:tblLook w:firstColumn="1" w:firstRow="1" w:lastColumn="0" w:lastRow="0" w:noHBand="0" w:noVBand="1" w:val="04A0"/>
+        <w:tblInd w:w="120" w:type="dxa"/>
+        <w:tblCellMar>
+          <w:top w:w="85" w:type="dxa"/>
+          <w:bottom w:w="85" w:type="dxa"/>
+          <w:left w:w="120" w:type="dxa"/>
+          <w:right w:w="120" w:type="dxa"/>
+        </w:tblCellMar>
+      </w:tblPr>
+      <w:tblGrid>
+        <w:gridCol w:w="1900"/>
+        <w:gridCol w:w="3260"/>
+        <w:gridCol w:w="4200"/>
+      </w:tblGrid>
+      <w:tr>
+        <w:trPr>
+          <w:cantSplit/>
+          <w:tblHeader/>
+        </w:trPr>
+        <w:tc>
+          <w:tcPr>
+            <w:tcW w:type="dxa" w:w="1900"/>
+            <w:vAlign w:val="center"/>
+            <w:shd w:fill="E8EFF8"/>
+          </w:tcPr>
+          <w:p>
+            <w:pPr>
+              <w:pStyle w:val="ExampleTableText"/>
+            </w:pPr>
+            <w:r>
+              <w:rPr>
+                <w:b/>
+              </w:rPr>
+              <w:t>Pregnancy</w:t>
+            </w:r>
+          </w:p>
+        </w:tc>
+        <w:tc>
+          <w:tcPr>
+            <w:tcW w:type="dxa" w:w="3260"/>
+            <w:vAlign w:val="center"/>
+            <w:shd w:fill="E8EFF8"/>
+          </w:tcPr>
+          <w:p>
+            <w:pPr>
+              <w:pStyle w:val="ExampleTableText"/>
+            </w:pPr>
+            <w:r>
+              <w:rPr>
+                <w:b/>
+              </w:rPr>
+              <w:t>Source combination</w:t>
+            </w:r>
+          </w:p>
+        </w:tc>
+        <w:tc>
+          <w:tcPr>
+            <w:tcW w:type="dxa" w:w="4200"/>
+            <w:vAlign w:val="center"/>
+            <w:shd w:fill="E8EFF8"/>
+          </w:tcPr>
+          <w:p>
+            <w:pPr>
+              <w:pStyle w:val="ExampleTableText"/>
+            </w:pPr>
+            <w:r>
+              <w:rPr>
+                <w:b/>
+              </w:rPr>
+              <w:t>Accepted delivery</w:t>
+            </w:r>
+          </w:p>
+        </w:tc>
+      </w:tr>
+      <w:tr>
+        <w:trPr>
+          <w:cantSplit/>
+        </w:trPr>
+        <w:tc>
+          <w:tcPr>
+            <w:tcW w:type="dxa" w:w="1900"/>
+            <w:vAlign w:val="center"/>
+          </w:tcPr>
+          <w:p>
+            <w:pPr>
+              <w:pStyle w:val="ExampleTableText"/>
+            </w:pPr>
+            <w:r>
+              <w:t>P-A</w:t>
+            </w:r>
+          </w:p>
+        </w:tc>
+        <w:tc>
+          <w:tcPr>
+            <w:tcW w:type="dxa" w:w="3260"/>
+            <w:vAlign w:val="center"/>
+          </w:tcPr>
+          <w:p>
+            <w:pPr>
+              <w:pStyle w:val="ExampleTableText"/>
+            </w:pPr>
+            <w:r>
+              <w:t>SIGIZI + EPUS</w:t>
+            </w:r>
+          </w:p>
+        </w:tc>
+        <w:tc>
+          <w:tcPr>
+            <w:tcW w:type="dxa" w:w="4200"/>
+            <w:vAlign w:val="center"/>
+          </w:tcPr>
+          <w:p>
+            <w:pPr>
+              <w:pStyle w:val="ExampleTableText"/>
+            </w:pPr>
+            <w:r>
+              <w:t>D-A, delivered 2026-08-31</w:t>
+            </w:r>
+          </w:p>
+        </w:tc>
+      </w:tr>
+    </w:tbl>
+    <w:p>
+      <w:pPr>
+        <w:pStyle w:val="CaptionText"/>
+        <w:pageBreakBefore w:val="0"/>
+        <w:spacing w:after="20"/>
+      </w:pPr>
+    </w:p>
+    <w:p>
+      <w:pPr>
+        <w:pageBreakBefore w:val="0"/>
+      </w:pPr>
+      <w:r>
+        <w:t>P-A means the integrated pregnancy, while D-A means the delivery event. Source maps retain the contributing records. The original raw rows are not physically deleted simply because the integrated table has one pregnancy row.</w:t>
+      </w:r>
+    </w:p>
+    <w:p>
+      <w:pPr>
+        <w:pageBreakBefore w:val="0"/>
+      </w:pPr>
+      <w:r>
+        <w:t>If a qualifying bumil hapus notice applies to this pregnancy, matching SIGIZI records leave the active source table and enter the exclusion audit. Independent EPUS or hospital evidence is not automatically removed.</w:t>
+      </w:r>
+    </w:p>
+    <w:p>
+      <w:pPr>
+        <w:pStyle w:val="CaptionText"/>
+        <w:pageBreakBefore w:val="0"/>
+      </w:pPr>
+      <w:r>
+        <w:t>Reading route: the worked cases at the end of Detailed logic unpack cleaning, exclusion, episode grouping, match types, delivery linkage and joins. The appendix retains exact object names and scheduling guidance.</w:t>
+      </w:r>
+    </w:p>
+    <w:p>
+      <w:pPr>
         <w:pStyle w:val="Heading1"/>
         <w:pageBreakBefore/>
       </w:pPr>
@@ -2922,6 +3399,3657 @@
     </w:p>
     <w:p>
       <w:pPr>
+        <w:pStyle w:val="Heading2"/>
+        <w:pageBreakBefore/>
+      </w:pPr>
+      <w:r>
+        <w:t>Worked case A: cleaning is not the same as matching</w:t>
+      </w:r>
+    </w:p>
+    <w:p>
+      <w:pPr>
+        <w:pageBreakBefore w:val="0"/>
+      </w:pPr>
+      <w:r>
+        <w:t>Before comparing people, the pipeline makes comparable keys. A raw display value, an adapter-normalized value and a later matching key can differ. The table names the stage so that uppercase/core-name rules are not mistaken for every source adapter’s exact output.</w:t>
+      </w:r>
+    </w:p>
+    <w:tbl>
+      <w:tblPr>
+        <w:tblStyle w:val="TableGrid"/>
+        <w:tblW w:type="dxa" w:w="9360"/>
+        <w:tblLayout w:type="fixed"/>
+        <w:tblLook w:firstColumn="1" w:firstRow="1" w:lastColumn="0" w:lastRow="0" w:noHBand="0" w:noVBand="1" w:val="04A0"/>
+        <w:tblInd w:w="120" w:type="dxa"/>
+        <w:tblCellMar>
+          <w:top w:w="85" w:type="dxa"/>
+          <w:bottom w:w="85" w:type="dxa"/>
+          <w:left w:w="120" w:type="dxa"/>
+          <w:right w:w="120" w:type="dxa"/>
+        </w:tblCellMar>
+      </w:tblPr>
+      <w:tblGrid>
+        <w:gridCol w:w="3000"/>
+        <w:gridCol w:w="3660"/>
+        <w:gridCol w:w="2700"/>
+      </w:tblGrid>
+      <w:tr>
+        <w:trPr>
+          <w:cantSplit/>
+          <w:tblHeader/>
+        </w:trPr>
+        <w:tc>
+          <w:tcPr>
+            <w:tcW w:type="dxa" w:w="3000"/>
+            <w:vAlign w:val="center"/>
+            <w:shd w:fill="E8EFF8"/>
+          </w:tcPr>
+          <w:p>
+            <w:pPr>
+              <w:pStyle w:val="ExampleTableText"/>
+            </w:pPr>
+            <w:r>
+              <w:rPr>
+                <w:b/>
+              </w:rPr>
+              <w:t>Input value</w:t>
+            </w:r>
+          </w:p>
+        </w:tc>
+        <w:tc>
+          <w:tcPr>
+            <w:tcW w:type="dxa" w:w="3660"/>
+            <w:vAlign w:val="center"/>
+            <w:shd w:fill="E8EFF8"/>
+          </w:tcPr>
+          <w:p>
+            <w:pPr>
+              <w:pStyle w:val="ExampleTableText"/>
+            </w:pPr>
+            <w:r>
+              <w:rPr>
+                <w:b/>
+              </w:rPr>
+              <w:t>Stage / treatment</w:t>
+            </w:r>
+          </w:p>
+        </w:tc>
+        <w:tc>
+          <w:tcPr>
+            <w:tcW w:type="dxa" w:w="2700"/>
+            <w:vAlign w:val="center"/>
+            <w:shd w:fill="E8EFF8"/>
+          </w:tcPr>
+          <w:p>
+            <w:pPr>
+              <w:pStyle w:val="ExampleTableText"/>
+            </w:pPr>
+            <w:r>
+              <w:rPr>
+                <w:b/>
+              </w:rPr>
+              <w:t>Comparable result</w:t>
+            </w:r>
+          </w:p>
+        </w:tc>
+      </w:tr>
+      <w:tr>
+        <w:trPr>
+          <w:cantSplit/>
+        </w:trPr>
+        <w:tc>
+          <w:tcPr>
+            <w:tcW w:type="dxa" w:w="3000"/>
+            <w:vAlign w:val="center"/>
+          </w:tcPr>
+          <w:p>
+            <w:pPr>
+              <w:pStyle w:val="ExampleTableText"/>
+            </w:pPr>
+            <w:r>
+              <w:t>"  siti   aminah  "</w:t>
+            </w:r>
+          </w:p>
+        </w:tc>
+        <w:tc>
+          <w:tcPr>
+            <w:tcW w:type="dxa" w:w="3660"/>
+            <w:vAlign w:val="center"/>
+          </w:tcPr>
+          <w:p>
+            <w:pPr>
+              <w:pStyle w:val="ExampleTableText"/>
+            </w:pPr>
+            <w:r>
+              <w:t>Core name normalization: trim, standardize spacing and case</w:t>
+            </w:r>
+          </w:p>
+        </w:tc>
+        <w:tc>
+          <w:tcPr>
+            <w:tcW w:type="dxa" w:w="2700"/>
+            <w:vAlign w:val="center"/>
+          </w:tcPr>
+          <w:p>
+            <w:pPr>
+              <w:pStyle w:val="ExampleTableText"/>
+            </w:pPr>
+            <w:r>
+              <w:t>SITI AMINAH</w:t>
+            </w:r>
+          </w:p>
+        </w:tc>
+      </w:tr>
+      <w:tr>
+        <w:trPr>
+          <w:cantSplit/>
+        </w:trPr>
+        <w:tc>
+          <w:tcPr>
+            <w:tcW w:type="dxa" w:w="3000"/>
+            <w:vAlign w:val="center"/>
+          </w:tcPr>
+          <w:p>
+            <w:pPr>
+              <w:pStyle w:val="ExampleTableText"/>
+            </w:pPr>
+            <w:r>
+              <w:t>SITI AMINAH / SITIAMINAH</w:t>
+            </w:r>
+          </w:p>
+        </w:tc>
+        <w:tc>
+          <w:tcPr>
+            <w:tcW w:type="dxa" w:w="3660"/>
+            <w:vAlign w:val="center"/>
+          </w:tcPr>
+          <w:p>
+            <w:pPr>
+              <w:pStyle w:val="ExampleTableText"/>
+            </w:pPr>
+            <w:r>
+              <w:t>Compact-name comparison removes spacing</w:t>
+            </w:r>
+          </w:p>
+        </w:tc>
+        <w:tc>
+          <w:tcPr>
+            <w:tcW w:type="dxa" w:w="2700"/>
+            <w:vAlign w:val="center"/>
+          </w:tcPr>
+          <w:p>
+            <w:pPr>
+              <w:pStyle w:val="ExampleTableText"/>
+            </w:pPr>
+            <w:r>
+              <w:t>SITIAMINAH / SITIAMINAH</w:t>
+            </w:r>
+          </w:p>
+        </w:tc>
+      </w:tr>
+      <w:tr>
+        <w:trPr>
+          <w:cantSplit/>
+        </w:trPr>
+        <w:tc>
+          <w:tcPr>
+            <w:tcW w:type="dxa" w:w="3000"/>
+            <w:vAlign w:val="center"/>
+          </w:tcPr>
+          <w:p>
+            <w:pPr>
+              <w:pStyle w:val="ExampleTableText"/>
+            </w:pPr>
+            <w:r>
+              <w:t>NIK field contains only "-"</w:t>
+            </w:r>
+          </w:p>
+        </w:tc>
+        <w:tc>
+          <w:tcPr>
+            <w:tcW w:type="dxa" w:w="3660"/>
+            <w:vAlign w:val="center"/>
+          </w:tcPr>
+          <w:p>
+            <w:pPr>
+              <w:pStyle w:val="ExampleTableText"/>
+            </w:pPr>
+            <w:r>
+              <w:t>SIGIZI source digit extraction finds no digits</w:t>
+            </w:r>
+          </w:p>
+        </w:tc>
+        <w:tc>
+          <w:tcPr>
+            <w:tcW w:type="dxa" w:w="2700"/>
+            <w:vAlign w:val="center"/>
+          </w:tcPr>
+          <w:p>
+            <w:pPr>
+              <w:pStyle w:val="ExampleTableText"/>
+            </w:pPr>
+            <w:r>
+              <w:t>NULL; no usable NIK from this value</w:t>
+            </w:r>
+          </w:p>
+        </w:tc>
+      </w:tr>
+      <w:tr>
+        <w:trPr>
+          <w:cantSplit/>
+        </w:trPr>
+        <w:tc>
+          <w:tcPr>
+            <w:tcW w:type="dxa" w:w="3000"/>
+            <w:vAlign w:val="center"/>
+          </w:tcPr>
+          <w:p>
+            <w:pPr>
+              <w:pStyle w:val="ExampleTableText"/>
+            </w:pPr>
+            <w:r>
+              <w:t>HPHT = NULL; HPL = 2026-09-07</w:t>
+            </w:r>
+          </w:p>
+        </w:tc>
+        <w:tc>
+          <w:tcPr>
+            <w:tcW w:type="dxa" w:w="3660"/>
+            <w:vAlign w:val="center"/>
+          </w:tcPr>
+          <w:p>
+            <w:pPr>
+              <w:pStyle w:val="ExampleTableText"/>
+            </w:pPr>
+            <w:r>
+              <w:t>Pregnancy-anchor fallback where implemented</w:t>
+            </w:r>
+          </w:p>
+        </w:tc>
+        <w:tc>
+          <w:tcPr>
+            <w:tcW w:type="dxa" w:w="2700"/>
+            <w:vAlign w:val="center"/>
+          </w:tcPr>
+          <w:p>
+            <w:pPr>
+              <w:pStyle w:val="ExampleTableText"/>
+            </w:pPr>
+            <w:r>
+              <w:t>2025-12-01 = HPL minus 280 days</w:t>
+            </w:r>
+          </w:p>
+        </w:tc>
+      </w:tr>
+      <w:tr>
+        <w:trPr>
+          <w:cantSplit/>
+        </w:trPr>
+        <w:tc>
+          <w:tcPr>
+            <w:tcW w:type="dxa" w:w="3000"/>
+            <w:vAlign w:val="center"/>
+          </w:tcPr>
+          <w:p>
+            <w:pPr>
+              <w:pStyle w:val="ExampleTableText"/>
+            </w:pPr>
+            <w:r>
+              <w:t>SITI AMINAH / SITI AMINAHH</w:t>
+            </w:r>
+          </w:p>
+        </w:tc>
+        <w:tc>
+          <w:tcPr>
+            <w:tcW w:type="dxa" w:w="3660"/>
+            <w:vAlign w:val="center"/>
+          </w:tcPr>
+          <w:p>
+            <w:pPr>
+              <w:pStyle w:val="ExampleTableText"/>
+            </w:pPr>
+            <w:r>
+              <w:t>Compact keys still differ</w:t>
+            </w:r>
+          </w:p>
+        </w:tc>
+        <w:tc>
+          <w:tcPr>
+            <w:tcW w:type="dxa" w:w="2700"/>
+            <w:vAlign w:val="center"/>
+          </w:tcPr>
+          <w:p>
+            <w:pPr>
+              <w:pStyle w:val="ExampleTableText"/>
+            </w:pPr>
+            <w:r>
+              <w:t>Requires a separate eligible fuzzy rule; cleaning alone does not make them equal</w:t>
+            </w:r>
+          </w:p>
+        </w:tc>
+      </w:tr>
+    </w:tbl>
+    <w:p>
+      <w:pPr>
+        <w:pStyle w:val="CaptionText"/>
+        <w:pageBreakBefore w:val="0"/>
+        <w:spacing w:after="20"/>
+      </w:pPr>
+    </w:p>
+    <w:p>
+      <w:pPr>
+        <w:pStyle w:val="Heading3"/>
+        <w:pageBreakBefore w:val="0"/>
+      </w:pPr>
+      <w:r>
+        <w:t>Geography: why a village must not become a Puskesmas</w:t>
+      </w:r>
+    </w:p>
+    <w:p>
+      <w:pPr>
+        <w:pageBreakBefore w:val="0"/>
+      </w:pPr>
+      <w:r>
+        <w:t>Suppose an export has shifted columns: its raw Puskesmas field contains a village name. In this hypothetical row, file metadata identifies NARMADA and a reviewed reference confirms that the shifted value is a village under that facility.</w:t>
+      </w:r>
+    </w:p>
+    <w:tbl>
+      <w:tblPr>
+        <w:tblStyle w:val="TableGrid"/>
+        <w:tblW w:type="dxa" w:w="9360"/>
+        <w:tblLayout w:type="fixed"/>
+        <w:tblLook w:firstColumn="1" w:firstRow="1" w:lastColumn="0" w:lastRow="0" w:noHBand="0" w:noVBand="1" w:val="04A0"/>
+        <w:tblInd w:w="120" w:type="dxa"/>
+        <w:tblCellMar>
+          <w:top w:w="85" w:type="dxa"/>
+          <w:bottom w:w="85" w:type="dxa"/>
+          <w:left w:w="120" w:type="dxa"/>
+          <w:right w:w="120" w:type="dxa"/>
+        </w:tblCellMar>
+      </w:tblPr>
+      <w:tblGrid>
+        <w:gridCol w:w="5000"/>
+        <w:gridCol w:w="4360"/>
+      </w:tblGrid>
+      <w:tr>
+        <w:trPr>
+          <w:cantSplit/>
+          <w:tblHeader/>
+        </w:trPr>
+        <w:tc>
+          <w:tcPr>
+            <w:tcW w:type="dxa" w:w="5000"/>
+            <w:vAlign w:val="center"/>
+            <w:shd w:fill="E8EFF8"/>
+          </w:tcPr>
+          <w:p>
+            <w:pPr>
+              <w:pStyle w:val="ExampleTableText"/>
+            </w:pPr>
+            <w:r>
+              <w:rPr>
+                <w:b/>
+              </w:rPr>
+              <w:t>Evidence before resolution</w:t>
+            </w:r>
+          </w:p>
+        </w:tc>
+        <w:tc>
+          <w:tcPr>
+            <w:tcW w:type="dxa" w:w="4360"/>
+            <w:vAlign w:val="center"/>
+            <w:shd w:fill="E8EFF8"/>
+          </w:tcPr>
+          <w:p>
+            <w:pPr>
+              <w:pStyle w:val="ExampleTableText"/>
+            </w:pPr>
+            <w:r>
+              <w:rPr>
+                <w:b/>
+              </w:rPr>
+              <w:t>Resolved fields</w:t>
+            </w:r>
+          </w:p>
+        </w:tc>
+      </w:tr>
+      <w:tr>
+        <w:trPr>
+          <w:cantSplit/>
+        </w:trPr>
+        <w:tc>
+          <w:tcPr>
+            <w:tcW w:type="dxa" w:w="5000"/>
+            <w:vAlign w:val="center"/>
+          </w:tcPr>
+          <w:p>
+            <w:pPr>
+              <w:pStyle w:val="ExampleTableText"/>
+            </w:pPr>
+            <w:r>
+              <w:t>Metadata facility: NARMADA; raw Puskesmas: DESA CONTOH A; reference confirms the relationship</w:t>
+            </w:r>
+          </w:p>
+        </w:tc>
+        <w:tc>
+          <w:tcPr>
+            <w:tcW w:type="dxa" w:w="4360"/>
+            <w:vAlign w:val="center"/>
+          </w:tcPr>
+          <w:p>
+            <w:pPr>
+              <w:pStyle w:val="ExampleTableText"/>
+            </w:pPr>
+            <w:r>
+              <w:t>puskesmas_norm = NARMADA; desa_norm = DESA CONTOH A</w:t>
+            </w:r>
+          </w:p>
+        </w:tc>
+      </w:tr>
+      <w:tr>
+        <w:trPr>
+          <w:cantSplit/>
+        </w:trPr>
+        <w:tc>
+          <w:tcPr>
+            <w:tcW w:type="dxa" w:w="5000"/>
+            <w:vAlign w:val="center"/>
+          </w:tcPr>
+          <w:p>
+            <w:pPr>
+              <w:pStyle w:val="ExampleTableText"/>
+            </w:pPr>
+            <w:r>
+              <w:t>No supported facility/village candidate</w:t>
+            </w:r>
+          </w:p>
+        </w:tc>
+        <w:tc>
+          <w:tcPr>
+            <w:tcW w:type="dxa" w:w="4360"/>
+            <w:vAlign w:val="center"/>
+          </w:tcPr>
+          <w:p>
+            <w:pPr>
+              <w:pStyle w:val="ExampleTableText"/>
+            </w:pPr>
+            <w:r>
+              <w:t>UNRESOLVED; publish NULL geography rather than restore the shifted fields</w:t>
+            </w:r>
+          </w:p>
+        </w:tc>
+      </w:tr>
+    </w:tbl>
+    <w:p>
+      <w:pPr>
+        <w:pStyle w:val="CaptionText"/>
+        <w:pageBreakBefore w:val="0"/>
+        <w:spacing w:after="20"/>
+      </w:pPr>
+    </w:p>
+    <w:p>
+      <w:pPr>
+        <w:pageBreakBefore w:val="0"/>
+      </w:pPr>
+      <w:r>
+        <w:t>DESA CONTOH A is fictional, not a proposed geography-reference entry. Production resolution scores actual reference candidates and retains the method and original values. Merely uppercasing a village name would not fix the field assignment.</w:t>
+      </w:r>
+    </w:p>
+    <w:p>
+      <w:pPr>
+        <w:pStyle w:val="CaptionText"/>
+        <w:pageBreakBefore w:val="0"/>
+      </w:pPr>
+      <w:r>
+        <w:t>Trace: cleaning adapters → 03_sigizi_source.sql → 03a_sigizi_geography.sql. Core name helpers are in 20_pregnancy_canonicalization.sql. Normalization supplies evidence; it does not prove that two records belong to one mother.</w:t>
+      </w:r>
+    </w:p>
+    <w:p>
+      <w:pPr>
+        <w:pStyle w:val="Heading2"/>
+        <w:pageBreakBefore/>
+      </w:pPr>
+      <w:r>
+        <w:t>Worked case B: bumil hapus excludes the pregnancy, not the mother</w:t>
+      </w:r>
+    </w:p>
+    <w:p>
+      <w:pPr>
+        <w:pageBreakBefore w:val="0"/>
+      </w:pPr>
+      <w:r>
+        <w:t>Start with a fictional registry notice: NIK-A, Siti Aminah, maternal DOB 1997-04-15, HPHT 2025-12-01. Assume it is the only relevant notice. The builder checks each SIGIZI clinical row against that notice before geography and episode construction.</w:t>
+      </w:r>
+    </w:p>
+    <w:tbl>
+      <w:tblPr>
+        <w:tblStyle w:val="TableGrid"/>
+        <w:tblW w:type="dxa" w:w="9360"/>
+        <w:tblLayout w:type="fixed"/>
+        <w:tblLook w:firstColumn="1" w:firstRow="1" w:lastColumn="0" w:lastRow="0" w:noHBand="0" w:noVBand="1" w:val="04A0"/>
+        <w:tblInd w:w="120" w:type="dxa"/>
+        <w:tblCellMar>
+          <w:top w:w="85" w:type="dxa"/>
+          <w:bottom w:w="85" w:type="dxa"/>
+          <w:left w:w="120" w:type="dxa"/>
+          <w:right w:w="120" w:type="dxa"/>
+        </w:tblCellMar>
+      </w:tblPr>
+      <w:tblGrid>
+        <w:gridCol w:w="1900"/>
+        <w:gridCol w:w="4460"/>
+        <w:gridCol w:w="3000"/>
+      </w:tblGrid>
+      <w:tr>
+        <w:trPr>
+          <w:cantSplit/>
+          <w:tblHeader/>
+        </w:trPr>
+        <w:tc>
+          <w:tcPr>
+            <w:tcW w:type="dxa" w:w="1900"/>
+            <w:vAlign w:val="center"/>
+            <w:shd w:fill="E8EFF8"/>
+          </w:tcPr>
+          <w:p>
+            <w:pPr>
+              <w:pStyle w:val="ExampleTableText"/>
+            </w:pPr>
+            <w:r>
+              <w:rPr>
+                <w:b/>
+              </w:rPr>
+              <w:t>SIGIZI clinical row</w:t>
+            </w:r>
+          </w:p>
+        </w:tc>
+        <w:tc>
+          <w:tcPr>
+            <w:tcW w:type="dxa" w:w="4460"/>
+            <w:vAlign w:val="center"/>
+            <w:shd w:fill="E8EFF8"/>
+          </w:tcPr>
+          <w:p>
+            <w:pPr>
+              <w:pStyle w:val="ExampleTableText"/>
+            </w:pPr>
+            <w:r>
+              <w:rPr>
+                <w:b/>
+              </w:rPr>
+              <w:t>Identity / pregnancy evidence</w:t>
+            </w:r>
+          </w:p>
+        </w:tc>
+        <w:tc>
+          <w:tcPr>
+            <w:tcW w:type="dxa" w:w="3000"/>
+            <w:vAlign w:val="center"/>
+            <w:shd w:fill="E8EFF8"/>
+          </w:tcPr>
+          <w:p>
+            <w:pPr>
+              <w:pStyle w:val="ExampleTableText"/>
+            </w:pPr>
+            <w:r>
+              <w:rPr>
+                <w:b/>
+              </w:rPr>
+              <w:t>Result</w:t>
+            </w:r>
+          </w:p>
+        </w:tc>
+      </w:tr>
+      <w:tr>
+        <w:trPr>
+          <w:cantSplit/>
+        </w:trPr>
+        <w:tc>
+          <w:tcPr>
+            <w:tcW w:type="dxa" w:w="1900"/>
+            <w:vAlign w:val="center"/>
+          </w:tcPr>
+          <w:p>
+            <w:pPr>
+              <w:pStyle w:val="ExampleTableText"/>
+            </w:pPr>
+            <w:r>
+              <w:t>SG-REG-A</w:t>
+            </w:r>
+          </w:p>
+        </w:tc>
+        <w:tc>
+          <w:tcPr>
+            <w:tcW w:type="dxa" w:w="4460"/>
+            <w:vAlign w:val="center"/>
+          </w:tcPr>
+          <w:p>
+            <w:pPr>
+              <w:pStyle w:val="ExampleTableText"/>
+            </w:pPr>
+            <w:r>
+              <w:t>NIK-A; HPHT 2025-12-01</w:t>
+            </w:r>
+          </w:p>
+        </w:tc>
+        <w:tc>
+          <w:tcPr>
+            <w:tcW w:type="dxa" w:w="3000"/>
+            <w:vAlign w:val="center"/>
+          </w:tcPr>
+          <w:p>
+            <w:pPr>
+              <w:pStyle w:val="ExampleTableText"/>
+            </w:pPr>
+            <w:r>
+              <w:t>Exclude: NIK and anchor both match</w:t>
+            </w:r>
+          </w:p>
+        </w:tc>
+      </w:tr>
+      <w:tr>
+        <w:trPr>
+          <w:cantSplit/>
+        </w:trPr>
+        <w:tc>
+          <w:tcPr>
+            <w:tcW w:type="dxa" w:w="1900"/>
+            <w:vAlign w:val="center"/>
+          </w:tcPr>
+          <w:p>
+            <w:pPr>
+              <w:pStyle w:val="ExampleTableText"/>
+            </w:pPr>
+            <w:r>
+              <w:t>SG-ANC-A</w:t>
+            </w:r>
+          </w:p>
+        </w:tc>
+        <w:tc>
+          <w:tcPr>
+            <w:tcW w:type="dxa" w:w="4460"/>
+            <w:vAlign w:val="center"/>
+          </w:tcPr>
+          <w:p>
+            <w:pPr>
+              <w:pStyle w:val="ExampleTableText"/>
+            </w:pPr>
+            <w:r>
+              <w:t>NIK missing; same normalized name and DOB; HPHT 2025-12-01</w:t>
+            </w:r>
+          </w:p>
+        </w:tc>
+        <w:tc>
+          <w:tcPr>
+            <w:tcW w:type="dxa" w:w="3000"/>
+            <w:vAlign w:val="center"/>
+          </w:tcPr>
+          <w:p>
+            <w:pPr>
+              <w:pStyle w:val="ExampleTableText"/>
+            </w:pPr>
+            <w:r>
+              <w:t>Exclude: name + DOB + anchor fallback</w:t>
+            </w:r>
+          </w:p>
+        </w:tc>
+      </w:tr>
+      <w:tr>
+        <w:trPr>
+          <w:cantSplit/>
+        </w:trPr>
+        <w:tc>
+          <w:tcPr>
+            <w:tcW w:type="dxa" w:w="1900"/>
+            <w:vAlign w:val="center"/>
+          </w:tcPr>
+          <w:p>
+            <w:pPr>
+              <w:pStyle w:val="ExampleTableText"/>
+            </w:pPr>
+            <w:r>
+              <w:t>SG-HPL-A</w:t>
+            </w:r>
+          </w:p>
+        </w:tc>
+        <w:tc>
+          <w:tcPr>
+            <w:tcW w:type="dxa" w:w="4460"/>
+            <w:vAlign w:val="center"/>
+          </w:tcPr>
+          <w:p>
+            <w:pPr>
+              <w:pStyle w:val="ExampleTableText"/>
+            </w:pPr>
+            <w:r>
+              <w:t>NIK-A; HPHT missing; HPL 2026-09-07</w:t>
+            </w:r>
+          </w:p>
+        </w:tc>
+        <w:tc>
+          <w:tcPr>
+            <w:tcW w:type="dxa" w:w="3000"/>
+            <w:vAlign w:val="center"/>
+          </w:tcPr>
+          <w:p>
+            <w:pPr>
+              <w:pStyle w:val="ExampleTableText"/>
+            </w:pPr>
+            <w:r>
+              <w:t>Exclude: derived anchor is 2025-12-01</w:t>
+            </w:r>
+          </w:p>
+        </w:tc>
+      </w:tr>
+      <w:tr>
+        <w:trPr>
+          <w:cantSplit/>
+        </w:trPr>
+        <w:tc>
+          <w:tcPr>
+            <w:tcW w:type="dxa" w:w="1900"/>
+            <w:vAlign w:val="center"/>
+          </w:tcPr>
+          <w:p>
+            <w:pPr>
+              <w:pStyle w:val="ExampleTableText"/>
+            </w:pPr>
+            <w:r>
+              <w:t>SG-LATER-A</w:t>
+            </w:r>
+          </w:p>
+        </w:tc>
+        <w:tc>
+          <w:tcPr>
+            <w:tcW w:type="dxa" w:w="4460"/>
+            <w:vAlign w:val="center"/>
+          </w:tcPr>
+          <w:p>
+            <w:pPr>
+              <w:pStyle w:val="ExampleTableText"/>
+            </w:pPr>
+            <w:r>
+              <w:t>NIK-A; HPHT 2027-02-01</w:t>
+            </w:r>
+          </w:p>
+        </w:tc>
+        <w:tc>
+          <w:tcPr>
+            <w:tcW w:type="dxa" w:w="3000"/>
+            <w:vAlign w:val="center"/>
+          </w:tcPr>
+          <w:p>
+            <w:pPr>
+              <w:pStyle w:val="ExampleTableText"/>
+            </w:pPr>
+            <w:r>
+              <w:t>Retain: this is a different pregnancy anchor</w:t>
+            </w:r>
+          </w:p>
+        </w:tc>
+      </w:tr>
+      <w:tr>
+        <w:trPr>
+          <w:cantSplit/>
+        </w:trPr>
+        <w:tc>
+          <w:tcPr>
+            <w:tcW w:type="dxa" w:w="1900"/>
+            <w:vAlign w:val="center"/>
+          </w:tcPr>
+          <w:p>
+            <w:pPr>
+              <w:pStyle w:val="ExampleTableText"/>
+            </w:pPr>
+            <w:r>
+              <w:t>SG-CONFLICT</w:t>
+            </w:r>
+          </w:p>
+        </w:tc>
+        <w:tc>
+          <w:tcPr>
+            <w:tcW w:type="dxa" w:w="4460"/>
+            <w:vAlign w:val="center"/>
+          </w:tcPr>
+          <w:p>
+            <w:pPr>
+              <w:pStyle w:val="ExampleTableText"/>
+            </w:pPr>
+            <w:r>
+              <w:t>NIK-B; same name, DOB and HPHT</w:t>
+            </w:r>
+          </w:p>
+        </w:tc>
+        <w:tc>
+          <w:tcPr>
+            <w:tcW w:type="dxa" w:w="3000"/>
+            <w:vAlign w:val="center"/>
+          </w:tcPr>
+          <w:p>
+            <w:pPr>
+              <w:pStyle w:val="ExampleTableText"/>
+            </w:pPr>
+            <w:r>
+              <w:t>Retain: conflicting non-null NIKs block the fallback</w:t>
+            </w:r>
+          </w:p>
+        </w:tc>
+      </w:tr>
+      <w:tr>
+        <w:trPr>
+          <w:cantSplit/>
+        </w:trPr>
+        <w:tc>
+          <w:tcPr>
+            <w:tcW w:type="dxa" w:w="1900"/>
+            <w:vAlign w:val="center"/>
+          </w:tcPr>
+          <w:p>
+            <w:pPr>
+              <w:pStyle w:val="ExampleTableText"/>
+            </w:pPr>
+            <w:r>
+              <w:t>SG-UNDATED</w:t>
+            </w:r>
+          </w:p>
+        </w:tc>
+        <w:tc>
+          <w:tcPr>
+            <w:tcW w:type="dxa" w:w="4460"/>
+            <w:vAlign w:val="center"/>
+          </w:tcPr>
+          <w:p>
+            <w:pPr>
+              <w:pStyle w:val="ExampleTableText"/>
+            </w:pPr>
+            <w:r>
+              <w:t>NIK-A; HPHT and HPL both missing</w:t>
+            </w:r>
+          </w:p>
+        </w:tc>
+        <w:tc>
+          <w:tcPr>
+            <w:tcW w:type="dxa" w:w="3000"/>
+            <w:vAlign w:val="center"/>
+          </w:tcPr>
+          <w:p>
+            <w:pPr>
+              <w:pStyle w:val="ExampleTableText"/>
+            </w:pPr>
+            <w:r>
+              <w:t>Retain as unmatched; review insufficient date evidence</w:t>
+            </w:r>
+          </w:p>
+        </w:tc>
+      </w:tr>
+    </w:tbl>
+    <w:p>
+      <w:pPr>
+        <w:pStyle w:val="CaptionText"/>
+        <w:pageBreakBefore w:val="0"/>
+        <w:spacing w:after="20"/>
+      </w:pPr>
+    </w:p>
+    <w:p>
+      <w:pPr>
+        <w:pStyle w:val="Heading3"/>
+        <w:pageBreakBefore w:val="0"/>
+      </w:pPr>
+      <w:r>
+        <w:t>The output is a split, not a clinical UNION</w:t>
+      </w:r>
+    </w:p>
+    <w:p>
+      <w:pPr>
+        <w:pageBreakBefore w:val="0"/>
+      </w:pPr>
+      <w:r>
+        <w:t>The excluded source rows go to t_sigizi_deletion_exclusion_audit with the matching registry reference. Rows without a qualifying match remain in t_sigizi_source_records. The deletion notice itself is never inserted as an ANC or delivery record.</w:t>
+      </w:r>
+    </w:p>
+    <w:p>
+      <w:pPr>
+        <w:pStyle w:val="Heading3"/>
+        <w:pageBreakBefore w:val="0"/>
+      </w:pPr>
+      <w:r>
+        <w:t>A strict boundary that matters</w:t>
+      </w:r>
+    </w:p>
+    <w:p>
+      <w:pPr>
+        <w:pageBreakBefore w:val="0"/>
+      </w:pPr>
+      <w:r>
+        <w:t>Change SG-REG-A’s HPHT to 2025-12-02 and remove HPL. It no longer matches this notice: the deletion gate requires exact anchor equality. The wider date tolerances used later for pregnancy matching do not apply here.</w:t>
+      </w:r>
+    </w:p>
+    <w:p>
+      <w:pPr>
+        <w:pageBreakBefore w:val="0"/>
+      </w:pPr>
+      <w:r>
+        <w:t>An EPUS record for Siti’s same pregnancy can still support an integrated episode. This implementation removes matching SIGIZI evidence; it is not a cross-system blacklist. A missing registry HPHT also prevents an exact deletion match.</w:t>
+      </w:r>
+    </w:p>
+    <w:p>
+      <w:pPr>
+        <w:pStyle w:val="CaptionText"/>
+        <w:pageBreakBefore w:val="0"/>
+      </w:pPr>
+      <w:r>
+        <w:t>Trace: vs_sigizi_bumil_hapus → deletion_match_rule in 03_sigizi_source.sql → retained source / audit / summary. These are alternative teaching rows; do not apply this notice to the retained Siti example in cases C–G.</w:t>
+      </w:r>
+    </w:p>
+    <w:p>
+      <w:pPr>
+        <w:pStyle w:val="Heading2"/>
+        <w:pageBreakBefore/>
+      </w:pPr>
+      <w:r>
+        <w:t>Worked case C: many source rows become one pregnancy episode</w:t>
+      </w:r>
+    </w:p>
+    <w:p>
+      <w:pPr>
+        <w:pageBreakBefore w:val="0"/>
+      </w:pPr>
+      <w:r>
+        <w:t>Return to Siti’s retained pregnancy, with no qualifying deletion notice. All rows below have NIK-A and compatible identity. Source IDs remain distinct even when the pregnancy is the same.</w:t>
+      </w:r>
+    </w:p>
+    <w:tbl>
+      <w:tblPr>
+        <w:tblStyle w:val="TableGrid"/>
+        <w:tblW w:type="dxa" w:w="9360"/>
+        <w:tblLayout w:type="fixed"/>
+        <w:tblLook w:firstColumn="1" w:firstRow="1" w:lastColumn="0" w:lastRow="0" w:noHBand="0" w:noVBand="1" w:val="04A0"/>
+        <w:tblInd w:w="120" w:type="dxa"/>
+        <w:tblCellMar>
+          <w:top w:w="85" w:type="dxa"/>
+          <w:bottom w:w="85" w:type="dxa"/>
+          <w:left w:w="120" w:type="dxa"/>
+          <w:right w:w="120" w:type="dxa"/>
+        </w:tblCellMar>
+      </w:tblPr>
+      <w:tblGrid>
+        <w:gridCol w:w="2150"/>
+        <w:gridCol w:w="4260"/>
+        <w:gridCol w:w="2950"/>
+      </w:tblGrid>
+      <w:tr>
+        <w:trPr>
+          <w:cantSplit/>
+          <w:tblHeader/>
+        </w:trPr>
+        <w:tc>
+          <w:tcPr>
+            <w:tcW w:type="dxa" w:w="2150"/>
+            <w:vAlign w:val="center"/>
+            <w:shd w:fill="E8EFF8"/>
+          </w:tcPr>
+          <w:p>
+            <w:pPr>
+              <w:pStyle w:val="ExampleTableText"/>
+            </w:pPr>
+            <w:r>
+              <w:rPr>
+                <w:b/>
+              </w:rPr>
+              <w:t>Source record</w:t>
+            </w:r>
+          </w:p>
+        </w:tc>
+        <w:tc>
+          <w:tcPr>
+            <w:tcW w:type="dxa" w:w="4260"/>
+            <w:vAlign w:val="center"/>
+            <w:shd w:fill="E8EFF8"/>
+          </w:tcPr>
+          <w:p>
+            <w:pPr>
+              <w:pStyle w:val="ExampleTableText"/>
+            </w:pPr>
+            <w:r>
+              <w:rPr>
+                <w:b/>
+              </w:rPr>
+              <w:t>Cleaned input</w:t>
+            </w:r>
+          </w:p>
+        </w:tc>
+        <w:tc>
+          <w:tcPr>
+            <w:tcW w:type="dxa" w:w="2950"/>
+            <w:vAlign w:val="center"/>
+            <w:shd w:fill="E8EFF8"/>
+          </w:tcPr>
+          <w:p>
+            <w:pPr>
+              <w:pStyle w:val="ExampleTableText"/>
+            </w:pPr>
+            <w:r>
+              <w:rPr>
+                <w:b/>
+              </w:rPr>
+              <w:t>Pregnancy dates</w:t>
+            </w:r>
+          </w:p>
+        </w:tc>
+      </w:tr>
+      <w:tr>
+        <w:trPr>
+          <w:cantSplit/>
+        </w:trPr>
+        <w:tc>
+          <w:tcPr>
+            <w:tcW w:type="dxa" w:w="2150"/>
+            <w:vAlign w:val="center"/>
+          </w:tcPr>
+          <w:p>
+            <w:pPr>
+              <w:pStyle w:val="ExampleTableText"/>
+            </w:pPr>
+            <w:r>
+              <w:t>SG-REG-A</w:t>
+            </w:r>
+          </w:p>
+        </w:tc>
+        <w:tc>
+          <w:tcPr>
+            <w:tcW w:type="dxa" w:w="4260"/>
+            <w:vAlign w:val="center"/>
+          </w:tcPr>
+          <w:p>
+            <w:pPr>
+              <w:pStyle w:val="ExampleTableText"/>
+            </w:pPr>
+            <w:r>
+              <w:t>SIGIZI DAFTAR_IBU; Siti Aminah</w:t>
+            </w:r>
+          </w:p>
+        </w:tc>
+        <w:tc>
+          <w:tcPr>
+            <w:tcW w:type="dxa" w:w="2950"/>
+            <w:vAlign w:val="center"/>
+          </w:tcPr>
+          <w:p>
+            <w:pPr>
+              <w:pStyle w:val="ExampleTableText"/>
+            </w:pPr>
+            <w:r>
+              <w:t>HPHT 2025-12-01</w:t>
+            </w:r>
+          </w:p>
+        </w:tc>
+      </w:tr>
+      <w:tr>
+        <w:trPr>
+          <w:cantSplit/>
+        </w:trPr>
+        <w:tc>
+          <w:tcPr>
+            <w:tcW w:type="dxa" w:w="2150"/>
+            <w:vAlign w:val="center"/>
+          </w:tcPr>
+          <w:p>
+            <w:pPr>
+              <w:pStyle w:val="ExampleTableText"/>
+            </w:pPr>
+            <w:r>
+              <w:t>SG-ANC-A</w:t>
+            </w:r>
+          </w:p>
+        </w:tc>
+        <w:tc>
+          <w:tcPr>
+            <w:tcW w:type="dxa" w:w="4260"/>
+            <w:vAlign w:val="center"/>
+          </w:tcPr>
+          <w:p>
+            <w:pPr>
+              <w:pStyle w:val="ExampleTableText"/>
+            </w:pPr>
+            <w:r>
+              <w:t>SIGIZI ANC; Siti Aminah</w:t>
+            </w:r>
+          </w:p>
+        </w:tc>
+        <w:tc>
+          <w:tcPr>
+            <w:tcW w:type="dxa" w:w="2950"/>
+            <w:vAlign w:val="center"/>
+          </w:tcPr>
+          <w:p>
+            <w:pPr>
+              <w:pStyle w:val="ExampleTableText"/>
+            </w:pPr>
+            <w:r>
+              <w:t>HPHT 2025-12-01</w:t>
+            </w:r>
+          </w:p>
+        </w:tc>
+      </w:tr>
+      <w:tr>
+        <w:trPr>
+          <w:cantSplit/>
+        </w:trPr>
+        <w:tc>
+          <w:tcPr>
+            <w:tcW w:type="dxa" w:w="2150"/>
+            <w:vAlign w:val="center"/>
+          </w:tcPr>
+          <w:p>
+            <w:pPr>
+              <w:pStyle w:val="ExampleTableText"/>
+            </w:pPr>
+            <w:r>
+              <w:t>SG-KOH-A</w:t>
+            </w:r>
+          </w:p>
+        </w:tc>
+        <w:tc>
+          <w:tcPr>
+            <w:tcW w:type="dxa" w:w="4260"/>
+            <w:vAlign w:val="center"/>
+          </w:tcPr>
+          <w:p>
+            <w:pPr>
+              <w:pStyle w:val="ExampleTableText"/>
+            </w:pPr>
+            <w:r>
+              <w:t>SIGIZI KOHORT_IBU; Siti Aminah</w:t>
+            </w:r>
+          </w:p>
+        </w:tc>
+        <w:tc>
+          <w:tcPr>
+            <w:tcW w:type="dxa" w:w="2950"/>
+            <w:vAlign w:val="center"/>
+          </w:tcPr>
+          <w:p>
+            <w:pPr>
+              <w:pStyle w:val="ExampleTableText"/>
+            </w:pPr>
+            <w:r>
+              <w:t>HPHT 2025-12-01</w:t>
+            </w:r>
+          </w:p>
+        </w:tc>
+      </w:tr>
+      <w:tr>
+        <w:trPr>
+          <w:cantSplit/>
+        </w:trPr>
+        <w:tc>
+          <w:tcPr>
+            <w:tcW w:type="dxa" w:w="2150"/>
+            <w:vAlign w:val="center"/>
+          </w:tcPr>
+          <w:p>
+            <w:pPr>
+              <w:pStyle w:val="ExampleTableText"/>
+            </w:pPr>
+            <w:r>
+              <w:t>EP-ANC-A</w:t>
+            </w:r>
+          </w:p>
+        </w:tc>
+        <w:tc>
+          <w:tcPr>
+            <w:tcW w:type="dxa" w:w="4260"/>
+            <w:vAlign w:val="center"/>
+          </w:tcPr>
+          <w:p>
+            <w:pPr>
+              <w:pStyle w:val="ExampleTableText"/>
+            </w:pPr>
+            <w:r>
+              <w:t>EPUS ANC; SITI AMINAH</w:t>
+            </w:r>
+          </w:p>
+        </w:tc>
+        <w:tc>
+          <w:tcPr>
+            <w:tcW w:type="dxa" w:w="2950"/>
+            <w:vAlign w:val="center"/>
+          </w:tcPr>
+          <w:p>
+            <w:pPr>
+              <w:pStyle w:val="ExampleTableText"/>
+            </w:pPr>
+            <w:r>
+              <w:t>HPHT 2025-12-03</w:t>
+            </w:r>
+          </w:p>
+        </w:tc>
+      </w:tr>
+      <w:tr>
+        <w:trPr>
+          <w:cantSplit/>
+        </w:trPr>
+        <w:tc>
+          <w:tcPr>
+            <w:tcW w:type="dxa" w:w="2150"/>
+            <w:vAlign w:val="center"/>
+          </w:tcPr>
+          <w:p>
+            <w:pPr>
+              <w:pStyle w:val="ExampleTableText"/>
+            </w:pPr>
+            <w:r>
+              <w:t>EP-VISIT-A</w:t>
+            </w:r>
+          </w:p>
+        </w:tc>
+        <w:tc>
+          <w:tcPr>
+            <w:tcW w:type="dxa" w:w="4260"/>
+            <w:vAlign w:val="center"/>
+          </w:tcPr>
+          <w:p>
+            <w:pPr>
+              <w:pStyle w:val="ExampleTableText"/>
+            </w:pPr>
+            <w:r>
+              <w:t>EPUS pregnancy visit; SITI AMINAH</w:t>
+            </w:r>
+          </w:p>
+        </w:tc>
+        <w:tc>
+          <w:tcPr>
+            <w:tcW w:type="dxa" w:w="2950"/>
+            <w:vAlign w:val="center"/>
+          </w:tcPr>
+          <w:p>
+            <w:pPr>
+              <w:pStyle w:val="ExampleTableText"/>
+            </w:pPr>
+            <w:r>
+              <w:t>HPHT 2025-12-03</w:t>
+            </w:r>
+          </w:p>
+        </w:tc>
+      </w:tr>
+    </w:tbl>
+    <w:p>
+      <w:pPr>
+        <w:pStyle w:val="CaptionText"/>
+        <w:pageBreakBefore w:val="0"/>
+        <w:spacing w:after="20"/>
+      </w:pPr>
+    </w:p>
+    <w:p>
+      <w:pPr>
+        <w:pageBreakBefore w:val="0"/>
+      </w:pPr>
+      <w:r>
+        <w:t>SIGIZI episode construction groups the compatible anchored SIGIZI rows into a source episode, labelled SG-P-A here. EPUS mother/pregnancy preparation produces EP-P-A. Within-source canonicalization can then reconcile residual duplicate episodes before cross-source matching builds P-A.</w:t>
+      </w:r>
+    </w:p>
+    <w:p>
+      <w:pPr>
+        <w:pStyle w:val="Heading3"/>
+        <w:pageBreakBefore w:val="0"/>
+      </w:pPr>
+      <w:r>
+        <w:t>A duplicate encounter is different from another ANC visit</w:t>
+      </w:r>
+    </w:p>
+    <w:tbl>
+      <w:tblPr>
+        <w:tblStyle w:val="TableGrid"/>
+        <w:tblW w:type="dxa" w:w="9360"/>
+        <w:tblLayout w:type="fixed"/>
+        <w:tblLook w:firstColumn="1" w:firstRow="1" w:lastColumn="0" w:lastRow="0" w:noHBand="0" w:noVBand="1" w:val="04A0"/>
+        <w:tblInd w:w="120" w:type="dxa"/>
+        <w:tblCellMar>
+          <w:top w:w="85" w:type="dxa"/>
+          <w:bottom w:w="85" w:type="dxa"/>
+          <w:left w:w="120" w:type="dxa"/>
+          <w:right w:w="120" w:type="dxa"/>
+        </w:tblCellMar>
+      </w:tblPr>
+      <w:tblGrid>
+        <w:gridCol w:w="2000"/>
+        <w:gridCol w:w="3060"/>
+        <w:gridCol w:w="1800"/>
+        <w:gridCol w:w="2500"/>
+      </w:tblGrid>
+      <w:tr>
+        <w:trPr>
+          <w:cantSplit/>
+          <w:tblHeader/>
+        </w:trPr>
+        <w:tc>
+          <w:tcPr>
+            <w:tcW w:type="dxa" w:w="2000"/>
+            <w:vAlign w:val="center"/>
+            <w:shd w:fill="E8EFF8"/>
+          </w:tcPr>
+          <w:p>
+            <w:pPr>
+              <w:pStyle w:val="ExampleTableText"/>
+            </w:pPr>
+            <w:r>
+              <w:rPr>
+                <w:b/>
+              </w:rPr>
+              <w:t>EPUS record</w:t>
+            </w:r>
+          </w:p>
+        </w:tc>
+        <w:tc>
+          <w:tcPr>
+            <w:tcW w:type="dxa" w:w="3060"/>
+            <w:vAlign w:val="center"/>
+            <w:shd w:fill="E8EFF8"/>
+          </w:tcPr>
+          <w:p>
+            <w:pPr>
+              <w:pStyle w:val="ExampleTableText"/>
+            </w:pPr>
+            <w:r>
+              <w:rPr>
+                <w:b/>
+              </w:rPr>
+              <w:t>Assigned episode / visit date</w:t>
+            </w:r>
+          </w:p>
+        </w:tc>
+        <w:tc>
+          <w:tcPr>
+            <w:tcW w:type="dxa" w:w="1800"/>
+            <w:vAlign w:val="center"/>
+            <w:shd w:fill="E8EFF8"/>
+          </w:tcPr>
+          <w:p>
+            <w:pPr>
+              <w:pStyle w:val="ExampleTableText"/>
+            </w:pPr>
+            <w:r>
+              <w:rPr>
+                <w:b/>
+              </w:rPr>
+              <w:t>Known facility</w:t>
+            </w:r>
+          </w:p>
+        </w:tc>
+        <w:tc>
+          <w:tcPr>
+            <w:tcW w:type="dxa" w:w="2500"/>
+            <w:vAlign w:val="center"/>
+            <w:shd w:fill="E8EFF8"/>
+          </w:tcPr>
+          <w:p>
+            <w:pPr>
+              <w:pStyle w:val="ExampleTableText"/>
+            </w:pPr>
+            <w:r>
+              <w:rPr>
+                <w:b/>
+              </w:rPr>
+              <w:t>ANC result</w:t>
+            </w:r>
+          </w:p>
+        </w:tc>
+      </w:tr>
+      <w:tr>
+        <w:trPr>
+          <w:cantSplit/>
+        </w:trPr>
+        <w:tc>
+          <w:tcPr>
+            <w:tcW w:type="dxa" w:w="2000"/>
+            <w:vAlign w:val="center"/>
+          </w:tcPr>
+          <w:p>
+            <w:pPr>
+              <w:pStyle w:val="ExampleTableText"/>
+            </w:pPr>
+            <w:r>
+              <w:t>EP-ANC-A</w:t>
+            </w:r>
+          </w:p>
+        </w:tc>
+        <w:tc>
+          <w:tcPr>
+            <w:tcW w:type="dxa" w:w="3060"/>
+            <w:vAlign w:val="center"/>
+          </w:tcPr>
+          <w:p>
+            <w:pPr>
+              <w:pStyle w:val="ExampleTableText"/>
+            </w:pPr>
+            <w:r>
+              <w:t>EP-P-A / 2026-02-10</w:t>
+            </w:r>
+          </w:p>
+        </w:tc>
+        <w:tc>
+          <w:tcPr>
+            <w:tcW w:type="dxa" w:w="1800"/>
+            <w:vAlign w:val="center"/>
+          </w:tcPr>
+          <w:p>
+            <w:pPr>
+              <w:pStyle w:val="ExampleTableText"/>
+            </w:pPr>
+            <w:r>
+              <w:t>NARMADA</w:t>
+            </w:r>
+          </w:p>
+        </w:tc>
+        <w:tc>
+          <w:tcPr>
+            <w:tcW w:type="dxa" w:w="2500"/>
+            <w:vAlign w:val="center"/>
+          </w:tcPr>
+          <w:p>
+            <w:pPr>
+              <w:pStyle w:val="ExampleTableText"/>
+            </w:pPr>
+            <w:r>
+              <w:t>Same encounter as EP-VISIT-A</w:t>
+            </w:r>
+          </w:p>
+        </w:tc>
+      </w:tr>
+      <w:tr>
+        <w:trPr>
+          <w:cantSplit/>
+        </w:trPr>
+        <w:tc>
+          <w:tcPr>
+            <w:tcW w:type="dxa" w:w="2000"/>
+            <w:vAlign w:val="center"/>
+          </w:tcPr>
+          <w:p>
+            <w:pPr>
+              <w:pStyle w:val="ExampleTableText"/>
+            </w:pPr>
+            <w:r>
+              <w:t>EP-VISIT-A</w:t>
+            </w:r>
+          </w:p>
+        </w:tc>
+        <w:tc>
+          <w:tcPr>
+            <w:tcW w:type="dxa" w:w="3060"/>
+            <w:vAlign w:val="center"/>
+          </w:tcPr>
+          <w:p>
+            <w:pPr>
+              <w:pStyle w:val="ExampleTableText"/>
+            </w:pPr>
+            <w:r>
+              <w:t>EP-P-A / 2026-02-10</w:t>
+            </w:r>
+          </w:p>
+        </w:tc>
+        <w:tc>
+          <w:tcPr>
+            <w:tcW w:type="dxa" w:w="1800"/>
+            <w:vAlign w:val="center"/>
+          </w:tcPr>
+          <w:p>
+            <w:pPr>
+              <w:pStyle w:val="ExampleTableText"/>
+            </w:pPr>
+            <w:r>
+              <w:t>NARMADA</w:t>
+            </w:r>
+          </w:p>
+        </w:tc>
+        <w:tc>
+          <w:tcPr>
+            <w:tcW w:type="dxa" w:w="2500"/>
+            <w:vAlign w:val="center"/>
+          </w:tcPr>
+          <w:p>
+            <w:pPr>
+              <w:pStyle w:val="ExampleTableText"/>
+            </w:pPr>
+            <w:r>
+              <w:t>Represented by the same canonical ANC event</w:t>
+            </w:r>
+          </w:p>
+        </w:tc>
+      </w:tr>
+      <w:tr>
+        <w:trPr>
+          <w:cantSplit/>
+        </w:trPr>
+        <w:tc>
+          <w:tcPr>
+            <w:tcW w:type="dxa" w:w="2000"/>
+            <w:vAlign w:val="center"/>
+          </w:tcPr>
+          <w:p>
+            <w:pPr>
+              <w:pStyle w:val="ExampleTableText"/>
+            </w:pPr>
+            <w:r>
+              <w:t>EP-ANC-B</w:t>
+            </w:r>
+          </w:p>
+        </w:tc>
+        <w:tc>
+          <w:tcPr>
+            <w:tcW w:type="dxa" w:w="3060"/>
+            <w:vAlign w:val="center"/>
+          </w:tcPr>
+          <w:p>
+            <w:pPr>
+              <w:pStyle w:val="ExampleTableText"/>
+            </w:pPr>
+            <w:r>
+              <w:t>EP-P-A / 2026-03-10</w:t>
+            </w:r>
+          </w:p>
+        </w:tc>
+        <w:tc>
+          <w:tcPr>
+            <w:tcW w:type="dxa" w:w="1800"/>
+            <w:vAlign w:val="center"/>
+          </w:tcPr>
+          <w:p>
+            <w:pPr>
+              <w:pStyle w:val="ExampleTableText"/>
+            </w:pPr>
+            <w:r>
+              <w:t>NARMADA</w:t>
+            </w:r>
+          </w:p>
+        </w:tc>
+        <w:tc>
+          <w:tcPr>
+            <w:tcW w:type="dxa" w:w="2500"/>
+            <w:vAlign w:val="center"/>
+          </w:tcPr>
+          <w:p>
+            <w:pPr>
+              <w:pStyle w:val="ExampleTableText"/>
+            </w:pPr>
+            <w:r>
+              <w:t>Separate ANC event; same pregnancy</w:t>
+            </w:r>
+          </w:p>
+        </w:tc>
+      </w:tr>
+    </w:tbl>
+    <w:p>
+      <w:pPr>
+        <w:pStyle w:val="CaptionText"/>
+        <w:pageBreakBefore w:val="0"/>
+        <w:spacing w:after="20"/>
+      </w:pPr>
+    </w:p>
+    <w:p>
+      <w:pPr>
+        <w:pageBreakBefore w:val="0"/>
+      </w:pPr>
+      <w:r>
+        <w:t>If the same-date records instead have different known facilities, the ANC stage keeps them separate by facility. If a further row has no facility while known facilities conflict, it cannot safely be assigned to either one.</w:t>
+      </w:r>
+    </w:p>
+    <w:p>
+      <w:pPr>
+        <w:pageBreakBefore w:val="0"/>
+      </w:pPr>
+      <w:r>
+        <w:t>A later pregnancy with HPHT 2027-02-01 stays separate in this example: sharing NIK-A does not make all of Siti’s pregnancies one episode. No other contradictory or rescue evidence is assumed.</w:t>
+      </w:r>
+    </w:p>
+    <w:p>
+      <w:pPr>
+        <w:pStyle w:val="CaptionText"/>
+        <w:pageBreakBefore w:val="0"/>
+      </w:pPr>
+      <w:r>
+        <w:t>Trace: 10_sigizi_episodes.sql; EPUS 05–08 preparation; 11_epus_adapter.sql; then 20_pregnancy_canonicalization.sql. Deduplication means canonical representation with lineage, not deletion of raw records.</w:t>
+      </w:r>
+    </w:p>
+    <w:p>
+      <w:pPr>
+        <w:pStyle w:val="Heading2"/>
+        <w:pageBreakBefore/>
+      </w:pPr>
+      <w:r>
+        <w:t>Worked case D: exact, compact and strong-identity matching</w:t>
+      </w:r>
+    </w:p>
+    <w:p>
+      <w:pPr>
+        <w:pageBreakBefore w:val="0"/>
+      </w:pPr>
+      <w:r>
+        <w:t>Each pair below is an independent example of canonical SIGIZI and EPUS episodes entering Stage 20. Assume there are no competing candidates. A pair may satisfy several rules; the highest-priority qualifying rule is retained.</w:t>
+      </w:r>
+    </w:p>
+    <w:p>
+      <w:pPr>
+        <w:pStyle w:val="Heading3"/>
+        <w:pageBreakBefore w:val="0"/>
+      </w:pPr>
+      <w:r>
+        <w:t>Exact NIK plus compatible pregnancy timing</w:t>
+      </w:r>
+    </w:p>
+    <w:tbl>
+      <w:tblPr>
+        <w:tblStyle w:val="TableGrid"/>
+        <w:tblW w:type="dxa" w:w="9360"/>
+        <w:tblLayout w:type="fixed"/>
+        <w:tblLook w:firstColumn="1" w:firstRow="1" w:lastColumn="0" w:lastRow="0" w:noHBand="0" w:noVBand="1" w:val="04A0"/>
+        <w:tblInd w:w="120" w:type="dxa"/>
+        <w:tblCellMar>
+          <w:top w:w="85" w:type="dxa"/>
+          <w:bottom w:w="85" w:type="dxa"/>
+          <w:left w:w="120" w:type="dxa"/>
+          <w:right w:w="120" w:type="dxa"/>
+        </w:tblCellMar>
+      </w:tblPr>
+      <w:tblGrid>
+        <w:gridCol w:w="2460"/>
+        <w:gridCol w:w="3450"/>
+        <w:gridCol w:w="3450"/>
+      </w:tblGrid>
+      <w:tr>
+        <w:trPr>
+          <w:cantSplit/>
+          <w:tblHeader/>
+        </w:trPr>
+        <w:tc>
+          <w:tcPr>
+            <w:tcW w:type="dxa" w:w="2460"/>
+            <w:vAlign w:val="center"/>
+            <w:shd w:fill="E8EFF8"/>
+          </w:tcPr>
+          <w:p>
+            <w:pPr>
+              <w:pStyle w:val="ExampleTableText"/>
+            </w:pPr>
+            <w:r>
+              <w:rPr>
+                <w:b/>
+              </w:rPr>
+              <w:t>Field</w:t>
+            </w:r>
+          </w:p>
+        </w:tc>
+        <w:tc>
+          <w:tcPr>
+            <w:tcW w:type="dxa" w:w="3450"/>
+            <w:vAlign w:val="center"/>
+            <w:shd w:fill="E8EFF8"/>
+          </w:tcPr>
+          <w:p>
+            <w:pPr>
+              <w:pStyle w:val="ExampleTableText"/>
+            </w:pPr>
+            <w:r>
+              <w:rPr>
+                <w:b/>
+              </w:rPr>
+              <w:t>SIGIZI episode</w:t>
+            </w:r>
+          </w:p>
+        </w:tc>
+        <w:tc>
+          <w:tcPr>
+            <w:tcW w:type="dxa" w:w="3450"/>
+            <w:vAlign w:val="center"/>
+            <w:shd w:fill="E8EFF8"/>
+          </w:tcPr>
+          <w:p>
+            <w:pPr>
+              <w:pStyle w:val="ExampleTableText"/>
+            </w:pPr>
+            <w:r>
+              <w:rPr>
+                <w:b/>
+              </w:rPr>
+              <w:t>EPUS episode</w:t>
+            </w:r>
+          </w:p>
+        </w:tc>
+      </w:tr>
+      <w:tr>
+        <w:trPr>
+          <w:cantSplit/>
+        </w:trPr>
+        <w:tc>
+          <w:tcPr>
+            <w:tcW w:type="dxa" w:w="2460"/>
+            <w:vAlign w:val="center"/>
+          </w:tcPr>
+          <w:p>
+            <w:pPr>
+              <w:pStyle w:val="ExampleTableText"/>
+            </w:pPr>
+            <w:r>
+              <w:t>NIK</w:t>
+            </w:r>
+          </w:p>
+        </w:tc>
+        <w:tc>
+          <w:tcPr>
+            <w:tcW w:type="dxa" w:w="3450"/>
+            <w:vAlign w:val="center"/>
+          </w:tcPr>
+          <w:p>
+            <w:pPr>
+              <w:pStyle w:val="ExampleTableText"/>
+            </w:pPr>
+            <w:r>
+              <w:t>NIK-A</w:t>
+            </w:r>
+          </w:p>
+        </w:tc>
+        <w:tc>
+          <w:tcPr>
+            <w:tcW w:type="dxa" w:w="3450"/>
+            <w:vAlign w:val="center"/>
+          </w:tcPr>
+          <w:p>
+            <w:pPr>
+              <w:pStyle w:val="ExampleTableText"/>
+            </w:pPr>
+            <w:r>
+              <w:t>NIK-A</w:t>
+            </w:r>
+          </w:p>
+        </w:tc>
+      </w:tr>
+      <w:tr>
+        <w:trPr>
+          <w:cantSplit/>
+        </w:trPr>
+        <w:tc>
+          <w:tcPr>
+            <w:tcW w:type="dxa" w:w="2460"/>
+            <w:vAlign w:val="center"/>
+          </w:tcPr>
+          <w:p>
+            <w:pPr>
+              <w:pStyle w:val="ExampleTableText"/>
+            </w:pPr>
+            <w:r>
+              <w:t>Pregnancy anchor</w:t>
+            </w:r>
+          </w:p>
+        </w:tc>
+        <w:tc>
+          <w:tcPr>
+            <w:tcW w:type="dxa" w:w="3450"/>
+            <w:vAlign w:val="center"/>
+          </w:tcPr>
+          <w:p>
+            <w:pPr>
+              <w:pStyle w:val="ExampleTableText"/>
+            </w:pPr>
+            <w:r>
+              <w:t>2025-12-01</w:t>
+            </w:r>
+          </w:p>
+        </w:tc>
+        <w:tc>
+          <w:tcPr>
+            <w:tcW w:type="dxa" w:w="3450"/>
+            <w:vAlign w:val="center"/>
+          </w:tcPr>
+          <w:p>
+            <w:pPr>
+              <w:pStyle w:val="ExampleTableText"/>
+            </w:pPr>
+            <w:r>
+              <w:t>2025-12-03</w:t>
+            </w:r>
+          </w:p>
+        </w:tc>
+      </w:tr>
+      <w:tr>
+        <w:trPr>
+          <w:cantSplit/>
+        </w:trPr>
+        <w:tc>
+          <w:tcPr>
+            <w:tcW w:type="dxa" w:w="2460"/>
+            <w:vAlign w:val="center"/>
+          </w:tcPr>
+          <w:p>
+            <w:pPr>
+              <w:pStyle w:val="ExampleTableText"/>
+            </w:pPr>
+            <w:r>
+              <w:t>Mother name</w:t>
+            </w:r>
+          </w:p>
+        </w:tc>
+        <w:tc>
+          <w:tcPr>
+            <w:tcW w:type="dxa" w:w="3450"/>
+            <w:vAlign w:val="center"/>
+          </w:tcPr>
+          <w:p>
+            <w:pPr>
+              <w:pStyle w:val="ExampleTableText"/>
+            </w:pPr>
+            <w:r>
+              <w:t>SITI AMINAH</w:t>
+            </w:r>
+          </w:p>
+        </w:tc>
+        <w:tc>
+          <w:tcPr>
+            <w:tcW w:type="dxa" w:w="3450"/>
+            <w:vAlign w:val="center"/>
+          </w:tcPr>
+          <w:p>
+            <w:pPr>
+              <w:pStyle w:val="ExampleTableText"/>
+            </w:pPr>
+            <w:r>
+              <w:t>SITI AMINAH</w:t>
+            </w:r>
+          </w:p>
+        </w:tc>
+      </w:tr>
+    </w:tbl>
+    <w:p>
+      <w:pPr>
+        <w:pStyle w:val="CaptionText"/>
+        <w:pageBreakBefore w:val="0"/>
+        <w:spacing w:after="20"/>
+      </w:pPr>
+    </w:p>
+    <w:p>
+      <w:pPr>
+        <w:pageBreakBefore w:val="0"/>
+      </w:pPr>
+      <w:r>
+        <w:t>The anchors differ by two days, inside the cross-source ninety-day tolerance. The pair qualifies for NIK+ANCHOR. With reciprocal best ranking and no other candidates, SG-P-A and EP-P-A are assigned together as P-A.</w:t>
+      </w:r>
+    </w:p>
+    <w:p>
+      <w:pPr>
+        <w:pStyle w:val="Heading3"/>
+        <w:pageBreakBefore w:val="0"/>
+      </w:pPr>
+      <w:r>
+        <w:t>Missing NIK: compact name, DOB and corroboration</w:t>
+      </w:r>
+    </w:p>
+    <w:tbl>
+      <w:tblPr>
+        <w:tblStyle w:val="TableGrid"/>
+        <w:tblW w:type="dxa" w:w="9360"/>
+        <w:tblLayout w:type="fixed"/>
+        <w:tblLook w:firstColumn="1" w:firstRow="1" w:lastColumn="0" w:lastRow="0" w:noHBand="0" w:noVBand="1" w:val="04A0"/>
+        <w:tblInd w:w="120" w:type="dxa"/>
+        <w:tblCellMar>
+          <w:top w:w="85" w:type="dxa"/>
+          <w:bottom w:w="85" w:type="dxa"/>
+          <w:left w:w="120" w:type="dxa"/>
+          <w:right w:w="120" w:type="dxa"/>
+        </w:tblCellMar>
+      </w:tblPr>
+      <w:tblGrid>
+        <w:gridCol w:w="2460"/>
+        <w:gridCol w:w="3450"/>
+        <w:gridCol w:w="3450"/>
+      </w:tblGrid>
+      <w:tr>
+        <w:trPr>
+          <w:cantSplit/>
+          <w:tblHeader/>
+        </w:trPr>
+        <w:tc>
+          <w:tcPr>
+            <w:tcW w:type="dxa" w:w="2460"/>
+            <w:vAlign w:val="center"/>
+            <w:shd w:fill="E8EFF8"/>
+          </w:tcPr>
+          <w:p>
+            <w:pPr>
+              <w:pStyle w:val="ExampleTableText"/>
+            </w:pPr>
+            <w:r>
+              <w:rPr>
+                <w:b/>
+              </w:rPr>
+              <w:t>Field</w:t>
+            </w:r>
+          </w:p>
+        </w:tc>
+        <w:tc>
+          <w:tcPr>
+            <w:tcW w:type="dxa" w:w="3450"/>
+            <w:vAlign w:val="center"/>
+            <w:shd w:fill="E8EFF8"/>
+          </w:tcPr>
+          <w:p>
+            <w:pPr>
+              <w:pStyle w:val="ExampleTableText"/>
+            </w:pPr>
+            <w:r>
+              <w:rPr>
+                <w:b/>
+              </w:rPr>
+              <w:t>SIGIZI episode</w:t>
+            </w:r>
+          </w:p>
+        </w:tc>
+        <w:tc>
+          <w:tcPr>
+            <w:tcW w:type="dxa" w:w="3450"/>
+            <w:vAlign w:val="center"/>
+            <w:shd w:fill="E8EFF8"/>
+          </w:tcPr>
+          <w:p>
+            <w:pPr>
+              <w:pStyle w:val="ExampleTableText"/>
+            </w:pPr>
+            <w:r>
+              <w:rPr>
+                <w:b/>
+              </w:rPr>
+              <w:t>EPUS episode</w:t>
+            </w:r>
+          </w:p>
+        </w:tc>
+      </w:tr>
+      <w:tr>
+        <w:trPr>
+          <w:cantSplit/>
+        </w:trPr>
+        <w:tc>
+          <w:tcPr>
+            <w:tcW w:type="dxa" w:w="2460"/>
+            <w:vAlign w:val="center"/>
+          </w:tcPr>
+          <w:p>
+            <w:pPr>
+              <w:pStyle w:val="ExampleTableText"/>
+            </w:pPr>
+            <w:r>
+              <w:t>NIK / name</w:t>
+            </w:r>
+          </w:p>
+        </w:tc>
+        <w:tc>
+          <w:tcPr>
+            <w:tcW w:type="dxa" w:w="3450"/>
+            <w:vAlign w:val="center"/>
+          </w:tcPr>
+          <w:p>
+            <w:pPr>
+              <w:pStyle w:val="ExampleTableText"/>
+            </w:pPr>
+            <w:r>
+              <w:t>NULL / SITI AMINAH</w:t>
+            </w:r>
+          </w:p>
+        </w:tc>
+        <w:tc>
+          <w:tcPr>
+            <w:tcW w:type="dxa" w:w="3450"/>
+            <w:vAlign w:val="center"/>
+          </w:tcPr>
+          <w:p>
+            <w:pPr>
+              <w:pStyle w:val="ExampleTableText"/>
+            </w:pPr>
+            <w:r>
+              <w:t>NIK-A / SITIAMINAH</w:t>
+            </w:r>
+          </w:p>
+        </w:tc>
+      </w:tr>
+      <w:tr>
+        <w:trPr>
+          <w:cantSplit/>
+        </w:trPr>
+        <w:tc>
+          <w:tcPr>
+            <w:tcW w:type="dxa" w:w="2460"/>
+            <w:vAlign w:val="center"/>
+          </w:tcPr>
+          <w:p>
+            <w:pPr>
+              <w:pStyle w:val="ExampleTableText"/>
+            </w:pPr>
+            <w:r>
+              <w:t>Maternal DOB</w:t>
+            </w:r>
+          </w:p>
+        </w:tc>
+        <w:tc>
+          <w:tcPr>
+            <w:tcW w:type="dxa" w:w="3450"/>
+            <w:vAlign w:val="center"/>
+          </w:tcPr>
+          <w:p>
+            <w:pPr>
+              <w:pStyle w:val="ExampleTableText"/>
+            </w:pPr>
+            <w:r>
+              <w:t>1997-04-15</w:t>
+            </w:r>
+          </w:p>
+        </w:tc>
+        <w:tc>
+          <w:tcPr>
+            <w:tcW w:type="dxa" w:w="3450"/>
+            <w:vAlign w:val="center"/>
+          </w:tcPr>
+          <w:p>
+            <w:pPr>
+              <w:pStyle w:val="ExampleTableText"/>
+            </w:pPr>
+            <w:r>
+              <w:t>1997-04-15</w:t>
+            </w:r>
+          </w:p>
+        </w:tc>
+      </w:tr>
+      <w:tr>
+        <w:trPr>
+          <w:cantSplit/>
+        </w:trPr>
+        <w:tc>
+          <w:tcPr>
+            <w:tcW w:type="dxa" w:w="2460"/>
+            <w:vAlign w:val="center"/>
+          </w:tcPr>
+          <w:p>
+            <w:pPr>
+              <w:pStyle w:val="ExampleTableText"/>
+            </w:pPr>
+            <w:r>
+              <w:t>HPHT / Puskesmas</w:t>
+            </w:r>
+          </w:p>
+        </w:tc>
+        <w:tc>
+          <w:tcPr>
+            <w:tcW w:type="dxa" w:w="3450"/>
+            <w:vAlign w:val="center"/>
+          </w:tcPr>
+          <w:p>
+            <w:pPr>
+              <w:pStyle w:val="ExampleTableText"/>
+            </w:pPr>
+            <w:r>
+              <w:t>2025-12-01 / NARMADA</w:t>
+            </w:r>
+          </w:p>
+        </w:tc>
+        <w:tc>
+          <w:tcPr>
+            <w:tcW w:type="dxa" w:w="3450"/>
+            <w:vAlign w:val="center"/>
+          </w:tcPr>
+          <w:p>
+            <w:pPr>
+              <w:pStyle w:val="ExampleTableText"/>
+            </w:pPr>
+            <w:r>
+              <w:t>2025-12-03 / NARMADA</w:t>
+            </w:r>
+          </w:p>
+        </w:tc>
+      </w:tr>
+    </w:tbl>
+    <w:p>
+      <w:pPr>
+        <w:pStyle w:val="CaptionText"/>
+        <w:pageBreakBefore w:val="0"/>
+        <w:spacing w:after="20"/>
+      </w:pPr>
+    </w:p>
+    <w:p>
+      <w:pPr>
+        <w:pageBreakBefore w:val="0"/>
+      </w:pPr>
+      <w:r>
+        <w:t>The compact names agree, DOB agrees, HPHT differs by two days and the facility corroborates the pair. It qualifies for STRONG_NAME+DOB+HPHT_14D+CORROBORATOR. Compact matching removes formatting differences; it is not fuzzy matching.</w:t>
+      </w:r>
+    </w:p>
+    <w:p>
+      <w:pPr>
+        <w:pStyle w:val="Heading3"/>
+        <w:pageBreakBefore w:val="0"/>
+      </w:pPr>
+      <w:r>
+        <w:t>Conflicting NIK: the stage-specific exception</w:t>
+      </w:r>
+    </w:p>
+    <w:p>
+      <w:pPr>
+        <w:pageBreakBefore w:val="0"/>
+      </w:pPr>
+      <w:r>
+        <w:t>Replace the missing SIGIZI NIK above with NIK-B, different from NIK-A. This strong Stage 20 rule still permits the candidate because the required name, DOB, HPHT and corroboration agree. Identity disagreement remains a QA concern; the match does not establish which NIK is correct.</w:t>
+      </w:r>
+    </w:p>
+    <w:p>
+      <w:pPr>
+        <w:pageBreakBefore w:val="0"/>
+      </w:pPr>
+      <w:r>
+        <w:t>In contrast, weaker fallbacks block trusted-NIK conflicts. If both names and DOBs agree but there are no extra corroborators, the strong route fails; conflicting trusted NIKs also block the weaker name + DOB + HPHT route. The bumil hapus gate is stricter again: it never overrides two conflicting non-null NIKs.</w:t>
+      </w:r>
+    </w:p>
+    <w:p>
+      <w:pPr>
+        <w:pStyle w:val="CaptionText"/>
+        <w:pageBreakBefore w:val="0"/>
+      </w:pPr>
+      <w:r>
+        <w:t>Trace: cross-source candidates, best-rule selection and reciprocal assignment in 20_pregnancy_canonicalization.sql. These are deterministic rule-based candidates, not probabilities of identity.</w:t>
+      </w:r>
+    </w:p>
+    <w:p>
+      <w:pPr>
+        <w:pStyle w:val="Heading2"/>
+        <w:pageBreakBefore/>
+      </w:pPr>
+      <w:r>
+        <w:t>Worked case E: rescue rules need evidence beyond a similar name</w:t>
+      </w:r>
+    </w:p>
+    <w:p>
+      <w:pPr>
+        <w:pageBreakBefore w:val="0"/>
+      </w:pPr>
+      <w:r>
+        <w:t>These cases illustrate the final guard, which examines residual pregnancy episodes after initial matching. Both NIKs are missing unless stated. Dates, facilities and other unlisted clues are assumed missing rather than silently agreeing.</w:t>
+      </w:r>
+    </w:p>
+    <w:tbl>
+      <w:tblPr>
+        <w:tblStyle w:val="TableGrid"/>
+        <w:tblW w:type="dxa" w:w="9360"/>
+        <w:tblLayout w:type="fixed"/>
+        <w:tblLook w:firstColumn="1" w:firstRow="1" w:lastColumn="0" w:lastRow="0" w:noHBand="0" w:noVBand="1" w:val="04A0"/>
+        <w:tblInd w:w="120" w:type="dxa"/>
+        <w:tblCellMar>
+          <w:top w:w="85" w:type="dxa"/>
+          <w:bottom w:w="85" w:type="dxa"/>
+          <w:left w:w="120" w:type="dxa"/>
+          <w:right w:w="120" w:type="dxa"/>
+        </w:tblCellMar>
+      </w:tblPr>
+      <w:tblGrid>
+        <w:gridCol w:w="2050"/>
+        <w:gridCol w:w="3655"/>
+        <w:gridCol w:w="3655"/>
+      </w:tblGrid>
+      <w:tr>
+        <w:trPr>
+          <w:cantSplit/>
+          <w:tblHeader/>
+        </w:trPr>
+        <w:tc>
+          <w:tcPr>
+            <w:tcW w:type="dxa" w:w="2050"/>
+            <w:vAlign w:val="center"/>
+            <w:shd w:fill="E8EFF8"/>
+          </w:tcPr>
+          <w:p>
+            <w:pPr>
+              <w:pStyle w:val="ExampleTableText"/>
+            </w:pPr>
+            <w:r>
+              <w:rPr>
+                <w:b/>
+              </w:rPr>
+              <w:t>Case</w:t>
+            </w:r>
+          </w:p>
+        </w:tc>
+        <w:tc>
+          <w:tcPr>
+            <w:tcW w:type="dxa" w:w="3655"/>
+            <w:vAlign w:val="center"/>
+            <w:shd w:fill="E8EFF8"/>
+          </w:tcPr>
+          <w:p>
+            <w:pPr>
+              <w:pStyle w:val="ExampleTableText"/>
+            </w:pPr>
+            <w:r>
+              <w:rPr>
+                <w:b/>
+              </w:rPr>
+              <w:t>Left record</w:t>
+            </w:r>
+          </w:p>
+        </w:tc>
+        <w:tc>
+          <w:tcPr>
+            <w:tcW w:type="dxa" w:w="3655"/>
+            <w:vAlign w:val="center"/>
+            <w:shd w:fill="E8EFF8"/>
+          </w:tcPr>
+          <w:p>
+            <w:pPr>
+              <w:pStyle w:val="ExampleTableText"/>
+            </w:pPr>
+            <w:r>
+              <w:rPr>
+                <w:b/>
+              </w:rPr>
+              <w:t>Right record</w:t>
+            </w:r>
+          </w:p>
+        </w:tc>
+      </w:tr>
+      <w:tr>
+        <w:trPr>
+          <w:cantSplit/>
+        </w:trPr>
+        <w:tc>
+          <w:tcPr>
+            <w:tcW w:type="dxa" w:w="2050"/>
+            <w:vAlign w:val="center"/>
+          </w:tcPr>
+          <w:p>
+            <w:pPr>
+              <w:pStyle w:val="ExampleTableText"/>
+            </w:pPr>
+            <w:r>
+              <w:t>Controlled fuzzy name</w:t>
+            </w:r>
+          </w:p>
+        </w:tc>
+        <w:tc>
+          <w:tcPr>
+            <w:tcW w:type="dxa" w:w="3655"/>
+            <w:vAlign w:val="center"/>
+          </w:tcPr>
+          <w:p>
+            <w:pPr>
+              <w:pStyle w:val="ExampleTableText"/>
+            </w:pPr>
+            <w:r>
+              <w:t>SITI AMINAH; DOB 1997-04-15; HPHT 2025-12-01</w:t>
+            </w:r>
+          </w:p>
+        </w:tc>
+        <w:tc>
+          <w:tcPr>
+            <w:tcW w:type="dxa" w:w="3655"/>
+            <w:vAlign w:val="center"/>
+          </w:tcPr>
+          <w:p>
+            <w:pPr>
+              <w:pStyle w:val="ExampleTableText"/>
+            </w:pPr>
+            <w:r>
+              <w:t>SITI AMINAHH; same DOB; HPHT 2025-12-03</w:t>
+            </w:r>
+          </w:p>
+        </w:tc>
+      </w:tr>
+      <w:tr>
+        <w:trPr>
+          <w:cantSplit/>
+        </w:trPr>
+        <w:tc>
+          <w:tcPr>
+            <w:tcW w:type="dxa" w:w="2050"/>
+            <w:vAlign w:val="center"/>
+          </w:tcPr>
+          <w:p>
+            <w:pPr>
+              <w:pStyle w:val="ExampleTableText"/>
+            </w:pPr>
+            <w:r>
+              <w:t>Corroboration for that pair</w:t>
+            </w:r>
+          </w:p>
+        </w:tc>
+        <w:tc>
+          <w:tcPr>
+            <w:tcW w:type="dxa" w:w="3655"/>
+            <w:vAlign w:val="center"/>
+          </w:tcPr>
+          <w:p>
+            <w:pPr>
+              <w:pStyle w:val="ExampleTableText"/>
+            </w:pPr>
+            <w:r>
+              <w:t>NARMADA; DESA CONTOH A; Posyandu CONTOH X</w:t>
+            </w:r>
+          </w:p>
+        </w:tc>
+        <w:tc>
+          <w:tcPr>
+            <w:tcW w:type="dxa" w:w="3655"/>
+            <w:vAlign w:val="center"/>
+          </w:tcPr>
+          <w:p>
+            <w:pPr>
+              <w:pStyle w:val="ExampleTableText"/>
+            </w:pPr>
+            <w:r>
+              <w:t>Same facility, village and Posyandu</w:t>
+            </w:r>
+          </w:p>
+        </w:tc>
+      </w:tr>
+      <w:tr>
+        <w:trPr>
+          <w:cantSplit/>
+        </w:trPr>
+        <w:tc>
+          <w:tcPr>
+            <w:tcW w:type="dxa" w:w="2050"/>
+            <w:vAlign w:val="center"/>
+          </w:tcPr>
+          <w:p>
+            <w:pPr>
+              <w:pStyle w:val="ExampleTableText"/>
+            </w:pPr>
+            <w:r>
+              <w:t>Phone-based rescue, separate pair</w:t>
+            </w:r>
+          </w:p>
+        </w:tc>
+        <w:tc>
+          <w:tcPr>
+            <w:tcW w:type="dxa" w:w="3655"/>
+            <w:vAlign w:val="center"/>
+          </w:tcPr>
+          <w:p>
+            <w:pPr>
+              <w:pStyle w:val="ExampleTableText"/>
+            </w:pPr>
+            <w:r>
+              <w:t>RINA; DOB 1995-05-20; PHONE-A; HPHT 2025-12-01; HPL 2026-09-07</w:t>
+            </w:r>
+          </w:p>
+        </w:tc>
+        <w:tc>
+          <w:tcPr>
+            <w:tcW w:type="dxa" w:w="3655"/>
+            <w:vAlign w:val="center"/>
+          </w:tcPr>
+          <w:p>
+            <w:pPr>
+              <w:pStyle w:val="ExampleTableText"/>
+            </w:pPr>
+            <w:r>
+              <w:t>MAYA; same DOB and PHONE-A; HPHT 2025-12-03; HPL 2026-09-09</w:t>
+            </w:r>
+          </w:p>
+        </w:tc>
+      </w:tr>
+    </w:tbl>
+    <w:p>
+      <w:pPr>
+        <w:pStyle w:val="CaptionText"/>
+        <w:pageBreakBefore w:val="0"/>
+        <w:spacing w:after="20"/>
+      </w:pPr>
+    </w:p>
+    <w:p>
+      <w:pPr>
+        <w:pageBreakBefore w:val="0"/>
+      </w:pPr>
+      <w:r>
+        <w:t>Fuzzy result: the compact names differ by one character, DOB matches, HPHT is within fourteen days, and the required corroborators are present. The final fuzzy rule qualifies. Remove the corroborating locations and the same typo is not enough to qualify through that rule.</w:t>
+      </w:r>
+    </w:p>
+    <w:p>
+      <w:pPr>
+        <w:pageBreakBefore w:val="0"/>
+      </w:pPr>
+      <w:r>
+        <w:t>Phone result: despite the different names, exact accepted comparison phone and DOB plus close HPHT and HPL qualify for the final phone rescue. A phone match alone is not enough; families may share numbers. This example illustrates the implemented rule, not proof that a shared phone identifies a person.</w:t>
+      </w:r>
+    </w:p>
+    <w:p>
+      <w:pPr>
+        <w:pStyle w:val="Heading3"/>
+        <w:pageBreakBefore w:val="0"/>
+      </w:pPr>
+      <w:r>
+        <w:t>Missing birth date is not a conflicting birth date</w:t>
+      </w:r>
+    </w:p>
+    <w:p>
+      <w:pPr>
+        <w:pageBreakBefore w:val="0"/>
+      </w:pPr>
+      <w:r>
+        <w:t>For a separate pair, use the same exact/compact name, exact HPHT and HPL, a missing DOB on one side, and matching facility, village and Posyandu. That satisfies the final missing-DOB rescue. Two different recorded DOBs do not satisfy this missing-DOB rule; other strong fingerprint rules are separate and must meet their own conditions.</w:t>
+      </w:r>
+    </w:p>
+    <w:p>
+      <w:pPr>
+        <w:pStyle w:val="Heading3"/>
+        <w:pageBreakBefore w:val="0"/>
+      </w:pPr>
+      <w:r>
+        <w:t>Candidate generation is not the final join</w:t>
+      </w:r>
+    </w:p>
+    <w:tbl>
+      <w:tblPr>
+        <w:tblStyle w:val="TableGrid"/>
+        <w:tblW w:type="dxa" w:w="9360"/>
+        <w:tblLayout w:type="fixed"/>
+        <w:tblLook w:firstColumn="1" w:firstRow="1" w:lastColumn="0" w:lastRow="0" w:noHBand="0" w:noVBand="1" w:val="04A0"/>
+        <w:tblInd w:w="120" w:type="dxa"/>
+        <w:tblCellMar>
+          <w:top w:w="85" w:type="dxa"/>
+          <w:bottom w:w="85" w:type="dxa"/>
+          <w:left w:w="120" w:type="dxa"/>
+          <w:right w:w="120" w:type="dxa"/>
+        </w:tblCellMar>
+      </w:tblPr>
+      <w:tblGrid>
+        <w:gridCol w:w="4300"/>
+        <w:gridCol w:w="5060"/>
+      </w:tblGrid>
+      <w:tr>
+        <w:trPr>
+          <w:cantSplit/>
+          <w:tblHeader/>
+        </w:trPr>
+        <w:tc>
+          <w:tcPr>
+            <w:tcW w:type="dxa" w:w="4300"/>
+            <w:vAlign w:val="center"/>
+            <w:shd w:fill="E8EFF8"/>
+          </w:tcPr>
+          <w:p>
+            <w:pPr>
+              <w:pStyle w:val="ExampleTableText"/>
+            </w:pPr>
+            <w:r>
+              <w:rPr>
+                <w:b/>
+              </w:rPr>
+              <w:t>Cross-source preference</w:t>
+            </w:r>
+          </w:p>
+        </w:tc>
+        <w:tc>
+          <w:tcPr>
+            <w:tcW w:type="dxa" w:w="5060"/>
+            <w:vAlign w:val="center"/>
+            <w:shd w:fill="E8EFF8"/>
+          </w:tcPr>
+          <w:p>
+            <w:pPr>
+              <w:pStyle w:val="ExampleTableText"/>
+            </w:pPr>
+            <w:r>
+              <w:rPr>
+                <w:b/>
+              </w:rPr>
+              <w:t>Meaning</w:t>
+            </w:r>
+          </w:p>
+        </w:tc>
+      </w:tr>
+      <w:tr>
+        <w:trPr>
+          <w:cantSplit/>
+        </w:trPr>
+        <w:tc>
+          <w:tcPr>
+            <w:tcW w:type="dxa" w:w="4300"/>
+            <w:vAlign w:val="center"/>
+          </w:tcPr>
+          <w:p>
+            <w:pPr>
+              <w:pStyle w:val="ExampleTableText"/>
+            </w:pPr>
+            <w:r>
+              <w:t>EP-A ranks SG-A first; SG-A ranks EP-A first</w:t>
+            </w:r>
+          </w:p>
+        </w:tc>
+        <w:tc>
+          <w:tcPr>
+            <w:tcW w:type="dxa" w:w="5060"/>
+            <w:vAlign w:val="center"/>
+          </w:tcPr>
+          <w:p>
+            <w:pPr>
+              <w:pStyle w:val="ExampleTableText"/>
+            </w:pPr>
+            <w:r>
+              <w:t>Reciprocal best pair can be assigned in that round</w:t>
+            </w:r>
+          </w:p>
+        </w:tc>
+      </w:tr>
+      <w:tr>
+        <w:trPr>
+          <w:cantSplit/>
+        </w:trPr>
+        <w:tc>
+          <w:tcPr>
+            <w:tcW w:type="dxa" w:w="4300"/>
+            <w:vAlign w:val="center"/>
+          </w:tcPr>
+          <w:p>
+            <w:pPr>
+              <w:pStyle w:val="ExampleTableText"/>
+            </w:pPr>
+            <w:r>
+              <w:t>EP-B also proposes SG-A, but SG-A prefers EP-A</w:t>
+            </w:r>
+          </w:p>
+        </w:tc>
+        <w:tc>
+          <w:tcPr>
+            <w:tcW w:type="dxa" w:w="5060"/>
+            <w:vAlign w:val="center"/>
+          </w:tcPr>
+          <w:p>
+            <w:pPr>
+              <w:pStyle w:val="ExampleTableText"/>
+            </w:pPr>
+            <w:r>
+              <w:t>EP-B is not joined to SG-A in the same round; later rounds only consider remaining candidates</w:t>
+            </w:r>
+          </w:p>
+        </w:tc>
+      </w:tr>
+    </w:tbl>
+    <w:p>
+      <w:pPr>
+        <w:pStyle w:val="CaptionText"/>
+        <w:pageBreakBefore w:val="0"/>
+        <w:spacing w:after="20"/>
+      </w:pPr>
+    </w:p>
+    <w:p>
+      <w:pPr>
+        <w:pStyle w:val="CaptionText"/>
+        <w:pageBreakBefore w:val="0"/>
+      </w:pPr>
+      <w:r>
+        <w:t>Trace: final pair features and FINAL_FUZZY_NAME / FINAL_PHONE / DOB_MISSING branches in Stage 20. Corroborators are counted SQL signals, not proven statistically independent evidence. Final merges follow candidate direction, quality and stable tie-breaks; source maps retain lineage.</w:t>
+      </w:r>
+    </w:p>
+    <w:p>
+      <w:pPr>
+        <w:pStyle w:val="Heading2"/>
+        <w:pageBreakBefore/>
+      </w:pPr>
+      <w:r>
+        <w:t>Worked case F: deduplicate births, then link to ANC</w:t>
+      </w:r>
+    </w:p>
+    <w:p>
+      <w:pPr>
+        <w:pageBreakBefore w:val="0"/>
+      </w:pPr>
+      <w:r>
+        <w:t>Assume the standardized delivery-source rows below have passed source-level eligibility and all carry the same trusted NIK-A. Each source has independently reported Siti’s delivery. They are not separate births merely because their source systems differ.</w:t>
+      </w:r>
+    </w:p>
+    <w:tbl>
+      <w:tblPr>
+        <w:tblStyle w:val="TableGrid"/>
+        <w:tblW w:type="dxa" w:w="9360"/>
+        <w:tblLayout w:type="fixed"/>
+        <w:tblLook w:firstColumn="1" w:firstRow="1" w:lastColumn="0" w:lastRow="0" w:noHBand="0" w:noVBand="1" w:val="04A0"/>
+        <w:tblInd w:w="120" w:type="dxa"/>
+        <w:tblCellMar>
+          <w:top w:w="85" w:type="dxa"/>
+          <w:bottom w:w="85" w:type="dxa"/>
+          <w:left w:w="120" w:type="dxa"/>
+          <w:right w:w="120" w:type="dxa"/>
+        </w:tblCellMar>
+      </w:tblPr>
+      <w:tblGrid>
+        <w:gridCol w:w="3000"/>
+        <w:gridCol w:w="3650"/>
+        <w:gridCol w:w="2710"/>
+      </w:tblGrid>
+      <w:tr>
+        <w:trPr>
+          <w:cantSplit/>
+          <w:tblHeader/>
+        </w:trPr>
+        <w:tc>
+          <w:tcPr>
+            <w:tcW w:type="dxa" w:w="3000"/>
+            <w:vAlign w:val="center"/>
+            <w:shd w:fill="E8EFF8"/>
+          </w:tcPr>
+          <w:p>
+            <w:pPr>
+              <w:pStyle w:val="ExampleTableText"/>
+            </w:pPr>
+            <w:r>
+              <w:rPr>
+                <w:b/>
+              </w:rPr>
+              <w:t>Delivery evidence</w:t>
+            </w:r>
+          </w:p>
+        </w:tc>
+        <w:tc>
+          <w:tcPr>
+            <w:tcW w:type="dxa" w:w="3650"/>
+            <w:vAlign w:val="center"/>
+            <w:shd w:fill="E8EFF8"/>
+          </w:tcPr>
+          <w:p>
+            <w:pPr>
+              <w:pStyle w:val="ExampleTableText"/>
+            </w:pPr>
+            <w:r>
+              <w:rPr>
+                <w:b/>
+              </w:rPr>
+              <w:t>Mother / delivery date</w:t>
+            </w:r>
+          </w:p>
+        </w:tc>
+        <w:tc>
+          <w:tcPr>
+            <w:tcW w:type="dxa" w:w="2710"/>
+            <w:vAlign w:val="center"/>
+            <w:shd w:fill="E8EFF8"/>
+          </w:tcPr>
+          <w:p>
+            <w:pPr>
+              <w:pStyle w:val="ExampleTableText"/>
+            </w:pPr>
+            <w:r>
+              <w:rPr>
+                <w:b/>
+              </w:rPr>
+              <w:t>Source identity</w:t>
+            </w:r>
+          </w:p>
+        </w:tc>
+      </w:tr>
+      <w:tr>
+        <w:trPr>
+          <w:cantSplit/>
+        </w:trPr>
+        <w:tc>
+          <w:tcPr>
+            <w:tcW w:type="dxa" w:w="3000"/>
+            <w:vAlign w:val="center"/>
+          </w:tcPr>
+          <w:p>
+            <w:pPr>
+              <w:pStyle w:val="ExampleTableText"/>
+            </w:pPr>
+            <w:r>
+              <w:t>SIGIZI KOHORT_IBU</w:t>
+            </w:r>
+          </w:p>
+        </w:tc>
+        <w:tc>
+          <w:tcPr>
+            <w:tcW w:type="dxa" w:w="3650"/>
+            <w:vAlign w:val="center"/>
+          </w:tcPr>
+          <w:p>
+            <w:pPr>
+              <w:pStyle w:val="ExampleTableText"/>
+            </w:pPr>
+            <w:r>
+              <w:t>Siti Aminah / 2026-08-31</w:t>
+            </w:r>
+          </w:p>
+        </w:tc>
+        <w:tc>
+          <w:tcPr>
+            <w:tcW w:type="dxa" w:w="2710"/>
+            <w:vAlign w:val="center"/>
+          </w:tcPr>
+          <w:p>
+            <w:pPr>
+              <w:pStyle w:val="ExampleTableText"/>
+            </w:pPr>
+            <w:r>
+              <w:t>SG-BIRTH-A</w:t>
+            </w:r>
+          </w:p>
+        </w:tc>
+      </w:tr>
+      <w:tr>
+        <w:trPr>
+          <w:cantSplit/>
+        </w:trPr>
+        <w:tc>
+          <w:tcPr>
+            <w:tcW w:type="dxa" w:w="3000"/>
+            <w:vAlign w:val="center"/>
+          </w:tcPr>
+          <w:p>
+            <w:pPr>
+              <w:pStyle w:val="ExampleTableText"/>
+            </w:pPr>
+            <w:r>
+              <w:t>EPUS INC</w:t>
+            </w:r>
+          </w:p>
+        </w:tc>
+        <w:tc>
+          <w:tcPr>
+            <w:tcW w:type="dxa" w:w="3650"/>
+            <w:vAlign w:val="center"/>
+          </w:tcPr>
+          <w:p>
+            <w:pPr>
+              <w:pStyle w:val="ExampleTableText"/>
+            </w:pPr>
+            <w:r>
+              <w:t>SITI AMINAH / 2026-08-31</w:t>
+            </w:r>
+          </w:p>
+        </w:tc>
+        <w:tc>
+          <w:tcPr>
+            <w:tcW w:type="dxa" w:w="2710"/>
+            <w:vAlign w:val="center"/>
+          </w:tcPr>
+          <w:p>
+            <w:pPr>
+              <w:pStyle w:val="ExampleTableText"/>
+            </w:pPr>
+            <w:r>
+              <w:t>EP-BIRTH-A</w:t>
+            </w:r>
+          </w:p>
+        </w:tc>
+      </w:tr>
+      <w:tr>
+        <w:trPr>
+          <w:cantSplit/>
+        </w:trPr>
+        <w:tc>
+          <w:tcPr>
+            <w:tcW w:type="dxa" w:w="3000"/>
+            <w:vAlign w:val="center"/>
+          </w:tcPr>
+          <w:p>
+            <w:pPr>
+              <w:pStyle w:val="ExampleTableText"/>
+            </w:pPr>
+            <w:r>
+              <w:t>SIMRS INC</w:t>
+            </w:r>
+          </w:p>
+        </w:tc>
+        <w:tc>
+          <w:tcPr>
+            <w:tcW w:type="dxa" w:w="3650"/>
+            <w:vAlign w:val="center"/>
+          </w:tcPr>
+          <w:p>
+            <w:pPr>
+              <w:pStyle w:val="ExampleTableText"/>
+            </w:pPr>
+            <w:r>
+              <w:t>Siti Aminah / 2026-08-31</w:t>
+            </w:r>
+          </w:p>
+        </w:tc>
+        <w:tc>
+          <w:tcPr>
+            <w:tcW w:type="dxa" w:w="2710"/>
+            <w:vAlign w:val="center"/>
+          </w:tcPr>
+          <w:p>
+            <w:pPr>
+              <w:pStyle w:val="ExampleTableText"/>
+            </w:pPr>
+            <w:r>
+              <w:t>RS-BIRTH-A</w:t>
+            </w:r>
+          </w:p>
+        </w:tc>
+      </w:tr>
+    </w:tbl>
+    <w:p>
+      <w:pPr>
+        <w:pStyle w:val="CaptionText"/>
+        <w:pageBreakBefore w:val="0"/>
+        <w:spacing w:after="20"/>
+      </w:pPr>
+    </w:p>
+    <w:p>
+      <w:pPr>
+        <w:pageBreakBefore w:val="0"/>
+      </w:pPr>
+      <w:r>
+        <w:t>The trusted-NIK and close-delivery-date rule connects these reports. With no conflicting identities, they form an unlinked canonical delivery D-U-A. The member map retains all source-event references. Field selection is field-specific; the event is not simply the last row received.</w:t>
+      </w:r>
+    </w:p>
+    <w:p>
+      <w:pPr>
+        <w:pStyle w:val="Heading3"/>
+        <w:pageBreakBefore w:val="0"/>
+      </w:pPr>
+      <w:r>
+        <w:t>Which pregnancy does that delivery belong to?</w:t>
+      </w:r>
+    </w:p>
+    <w:tbl>
+      <w:tblPr>
+        <w:tblStyle w:val="TableGrid"/>
+        <w:tblW w:type="dxa" w:w="9360"/>
+        <w:tblLayout w:type="fixed"/>
+        <w:tblLook w:firstColumn="1" w:firstRow="1" w:lastColumn="0" w:lastRow="0" w:noHBand="0" w:noVBand="1" w:val="04A0"/>
+        <w:tblInd w:w="120" w:type="dxa"/>
+        <w:tblCellMar>
+          <w:top w:w="85" w:type="dxa"/>
+          <w:bottom w:w="85" w:type="dxa"/>
+          <w:left w:w="120" w:type="dxa"/>
+          <w:right w:w="120" w:type="dxa"/>
+        </w:tblCellMar>
+      </w:tblPr>
+      <w:tblGrid>
+        <w:gridCol w:w="1800"/>
+        <w:gridCol w:w="3460"/>
+        <w:gridCol w:w="4100"/>
+      </w:tblGrid>
+      <w:tr>
+        <w:trPr>
+          <w:cantSplit/>
+          <w:tblHeader/>
+        </w:trPr>
+        <w:tc>
+          <w:tcPr>
+            <w:tcW w:type="dxa" w:w="1800"/>
+            <w:vAlign w:val="center"/>
+            <w:shd w:fill="E8EFF8"/>
+          </w:tcPr>
+          <w:p>
+            <w:pPr>
+              <w:pStyle w:val="ExampleTableText"/>
+            </w:pPr>
+            <w:r>
+              <w:rPr>
+                <w:b/>
+              </w:rPr>
+              <w:t>Pregnancy candidate</w:t>
+            </w:r>
+          </w:p>
+        </w:tc>
+        <w:tc>
+          <w:tcPr>
+            <w:tcW w:type="dxa" w:w="3460"/>
+            <w:vAlign w:val="center"/>
+            <w:shd w:fill="E8EFF8"/>
+          </w:tcPr>
+          <w:p>
+            <w:pPr>
+              <w:pStyle w:val="ExampleTableText"/>
+            </w:pPr>
+            <w:r>
+              <w:rPr>
+                <w:b/>
+              </w:rPr>
+              <w:t>Anchor / identity</w:t>
+            </w:r>
+          </w:p>
+        </w:tc>
+        <w:tc>
+          <w:tcPr>
+            <w:tcW w:type="dxa" w:w="4100"/>
+            <w:vAlign w:val="center"/>
+            <w:shd w:fill="E8EFF8"/>
+          </w:tcPr>
+          <w:p>
+            <w:pPr>
+              <w:pStyle w:val="ExampleTableText"/>
+            </w:pPr>
+            <w:r>
+              <w:rPr>
+                <w:b/>
+              </w:rPr>
+              <w:t>Decision</w:t>
+            </w:r>
+          </w:p>
+        </w:tc>
+      </w:tr>
+      <w:tr>
+        <w:trPr>
+          <w:cantSplit/>
+        </w:trPr>
+        <w:tc>
+          <w:tcPr>
+            <w:tcW w:type="dxa" w:w="1800"/>
+            <w:vAlign w:val="center"/>
+          </w:tcPr>
+          <w:p>
+            <w:pPr>
+              <w:pStyle w:val="ExampleTableText"/>
+            </w:pPr>
+            <w:r>
+              <w:t>P-A</w:t>
+            </w:r>
+          </w:p>
+        </w:tc>
+        <w:tc>
+          <w:tcPr>
+            <w:tcW w:type="dxa" w:w="3460"/>
+            <w:vAlign w:val="center"/>
+          </w:tcPr>
+          <w:p>
+            <w:pPr>
+              <w:pStyle w:val="ExampleTableText"/>
+            </w:pPr>
+            <w:r>
+              <w:t>2025-12-01 / NIK-A</w:t>
+            </w:r>
+          </w:p>
+        </w:tc>
+        <w:tc>
+          <w:tcPr>
+            <w:tcW w:type="dxa" w:w="4100"/>
+            <w:vAlign w:val="center"/>
+          </w:tcPr>
+          <w:p>
+            <w:pPr>
+              <w:pStyle w:val="ExampleTableText"/>
+            </w:pPr>
+            <w:r>
+              <w:t>Delivery is 273 days after anchor: inside the 126–322-day window</w:t>
+            </w:r>
+          </w:p>
+        </w:tc>
+      </w:tr>
+      <w:tr>
+        <w:trPr>
+          <w:cantSplit/>
+        </w:trPr>
+        <w:tc>
+          <w:tcPr>
+            <w:tcW w:type="dxa" w:w="1800"/>
+            <w:vAlign w:val="center"/>
+          </w:tcPr>
+          <w:p>
+            <w:pPr>
+              <w:pStyle w:val="ExampleTableText"/>
+            </w:pPr>
+            <w:r>
+              <w:t>P-OLD</w:t>
+            </w:r>
+          </w:p>
+        </w:tc>
+        <w:tc>
+          <w:tcPr>
+            <w:tcW w:type="dxa" w:w="3460"/>
+            <w:vAlign w:val="center"/>
+          </w:tcPr>
+          <w:p>
+            <w:pPr>
+              <w:pStyle w:val="ExampleTableText"/>
+            </w:pPr>
+            <w:r>
+              <w:t>2024-12-01 / NIK-A</w:t>
+            </w:r>
+          </w:p>
+        </w:tc>
+        <w:tc>
+          <w:tcPr>
+            <w:tcW w:type="dxa" w:w="4100"/>
+            <w:vAlign w:val="center"/>
+          </w:tcPr>
+          <w:p>
+            <w:pPr>
+              <w:pStyle w:val="ExampleTableText"/>
+            </w:pPr>
+            <w:r>
+              <w:t>Delivery lies outside the ordinary pregnancy window: not a qualifying NIK-window candidate</w:t>
+            </w:r>
+          </w:p>
+        </w:tc>
+      </w:tr>
+    </w:tbl>
+    <w:p>
+      <w:pPr>
+        <w:pStyle w:val="CaptionText"/>
+        <w:pageBreakBefore w:val="0"/>
+        <w:spacing w:after="20"/>
+      </w:pPr>
+    </w:p>
+    <w:p>
+      <w:pPr>
+        <w:pageBreakBefore w:val="0"/>
+      </w:pPr>
+      <w:r>
+        <w:t>If the delivery also carries P-A’s original EPUS episode key, the plausible direct-key route has higher priority than ordinary NIK-window matching. Without a usable direct key, the unique NIK-window candidate still links D-U-A to P-A. Assume no competing delivery cluster: the final master retains the accepted event as D-A.</w:t>
+      </w:r>
+    </w:p>
+    <w:p>
+      <w:pPr>
+        <w:pStyle w:val="Heading3"/>
+        <w:pageBreakBefore w:val="0"/>
+      </w:pPr>
+      <w:r>
+        <w:t>Cases that must not be forced into a match</w:t>
+      </w:r>
+    </w:p>
+    <w:p>
+      <w:pPr>
+        <w:pageBreakBefore w:val="0"/>
+      </w:pPr>
+      <w:r>
+        <w:t>If two distinct pregnancies tie at the best plausibility, method priority and date-distance score, the delivery stays ambiguous. An ID tie-break does not turn that tie into an accepted link. An implausible direct-key candidate is not accepted just because its source key agrees.</w:t>
+      </w:r>
+    </w:p>
+    <w:p>
+      <w:pPr>
+        <w:pageBreakBefore w:val="0"/>
+      </w:pPr>
+      <w:r>
+        <w:t>A source report carrying another trusted NIK cannot be merged into this delivery through the trusted-NIK rule. Weaker delivery rules and the connected-component guard protect against incompatible trusted identities. Competing date clusters linked to the same pregnancy are resolved later; rejected clusters remain auditable.</w:t>
+      </w:r>
+    </w:p>
+    <w:p>
+      <w:pPr>
+        <w:pStyle w:val="CaptionText"/>
+        <w:pageBreakBefore w:val="0"/>
+      </w:pPr>
+      <w:r>
+        <w:t>Trace: 50_delivery_canonicalization.sql → dedup base → unlinked event/member map → ANC candidates → post-link consolidation → final master/member map. Delivery deduplication and delivery-to-ANC linkage answer different questions.</w:t>
+      </w:r>
+    </w:p>
+    <w:p>
+      <w:pPr>
+        <w:pStyle w:val="Heading2"/>
+        <w:pageBreakBefore/>
+      </w:pPr>
+      <w:r>
+        <w:t>Worked case G: joins add evidence; they must not multiply pregnancies</w:t>
+      </w:r>
+    </w:p>
+    <w:p>
+      <w:pPr>
+        <w:pageBreakBefore w:val="0"/>
+      </w:pPr>
+      <w:r>
+        <w:t>The tables below are simplified projections, not runnable SQL or the full physical schemas. Assume P-A has an accepted validated delivery and P-B is an unrelated pregnancy with no accepted delivery.</w:t>
+      </w:r>
+    </w:p>
+    <w:tbl>
+      <w:tblPr>
+        <w:tblStyle w:val="TableGrid"/>
+        <w:tblW w:type="dxa" w:w="9360"/>
+        <w:tblLayout w:type="fixed"/>
+        <w:tblLook w:firstColumn="1" w:firstRow="1" w:lastColumn="0" w:lastRow="0" w:noHBand="0" w:noVBand="1" w:val="04A0"/>
+        <w:tblInd w:w="120" w:type="dxa"/>
+        <w:tblCellMar>
+          <w:top w:w="85" w:type="dxa"/>
+          <w:bottom w:w="85" w:type="dxa"/>
+          <w:left w:w="120" w:type="dxa"/>
+          <w:right w:w="120" w:type="dxa"/>
+        </w:tblCellMar>
+      </w:tblPr>
+      <w:tblGrid>
+        <w:gridCol w:w="2350"/>
+        <w:gridCol w:w="3260"/>
+        <w:gridCol w:w="3750"/>
+      </w:tblGrid>
+      <w:tr>
+        <w:trPr>
+          <w:cantSplit/>
+          <w:tblHeader/>
+        </w:trPr>
+        <w:tc>
+          <w:tcPr>
+            <w:tcW w:type="dxa" w:w="2350"/>
+            <w:vAlign w:val="center"/>
+            <w:shd w:fill="E8EFF8"/>
+          </w:tcPr>
+          <w:p>
+            <w:pPr>
+              <w:pStyle w:val="ExampleTableText"/>
+            </w:pPr>
+            <w:r>
+              <w:rPr>
+                <w:b/>
+              </w:rPr>
+              <w:t>Pregnancy spine</w:t>
+            </w:r>
+          </w:p>
+        </w:tc>
+        <w:tc>
+          <w:tcPr>
+            <w:tcW w:type="dxa" w:w="3260"/>
+            <w:vAlign w:val="center"/>
+            <w:shd w:fill="E8EFF8"/>
+          </w:tcPr>
+          <w:p>
+            <w:pPr>
+              <w:pStyle w:val="ExampleTableText"/>
+            </w:pPr>
+            <w:r>
+              <w:rPr>
+                <w:b/>
+              </w:rPr>
+              <w:t>Source combination</w:t>
+            </w:r>
+          </w:p>
+        </w:tc>
+        <w:tc>
+          <w:tcPr>
+            <w:tcW w:type="dxa" w:w="3750"/>
+            <w:vAlign w:val="center"/>
+            <w:shd w:fill="E8EFF8"/>
+          </w:tcPr>
+          <w:p>
+            <w:pPr>
+              <w:pStyle w:val="ExampleTableText"/>
+            </w:pPr>
+            <w:r>
+              <w:rPr>
+                <w:b/>
+              </w:rPr>
+              <w:t>Episode meaning</w:t>
+            </w:r>
+          </w:p>
+        </w:tc>
+      </w:tr>
+      <w:tr>
+        <w:trPr>
+          <w:cantSplit/>
+        </w:trPr>
+        <w:tc>
+          <w:tcPr>
+            <w:tcW w:type="dxa" w:w="2350"/>
+            <w:vAlign w:val="center"/>
+          </w:tcPr>
+          <w:p>
+            <w:pPr>
+              <w:pStyle w:val="ExampleTableText"/>
+            </w:pPr>
+            <w:r>
+              <w:t>P-A</w:t>
+            </w:r>
+          </w:p>
+        </w:tc>
+        <w:tc>
+          <w:tcPr>
+            <w:tcW w:type="dxa" w:w="3260"/>
+            <w:vAlign w:val="center"/>
+          </w:tcPr>
+          <w:p>
+            <w:pPr>
+              <w:pStyle w:val="ExampleTableText"/>
+            </w:pPr>
+            <w:r>
+              <w:t>SIGIZI + EPUS</w:t>
+            </w:r>
+          </w:p>
+        </w:tc>
+        <w:tc>
+          <w:tcPr>
+            <w:tcW w:type="dxa" w:w="3750"/>
+            <w:vAlign w:val="center"/>
+          </w:tcPr>
+          <w:p>
+            <w:pPr>
+              <w:pStyle w:val="ExampleTableText"/>
+            </w:pPr>
+            <w:r>
+              <w:t>Siti’s integrated pregnancy</w:t>
+            </w:r>
+          </w:p>
+        </w:tc>
+      </w:tr>
+      <w:tr>
+        <w:trPr>
+          <w:cantSplit/>
+        </w:trPr>
+        <w:tc>
+          <w:tcPr>
+            <w:tcW w:type="dxa" w:w="2350"/>
+            <w:vAlign w:val="center"/>
+          </w:tcPr>
+          <w:p>
+            <w:pPr>
+              <w:pStyle w:val="ExampleTableText"/>
+            </w:pPr>
+            <w:r>
+              <w:t>P-B</w:t>
+            </w:r>
+          </w:p>
+        </w:tc>
+        <w:tc>
+          <w:tcPr>
+            <w:tcW w:type="dxa" w:w="3260"/>
+            <w:vAlign w:val="center"/>
+          </w:tcPr>
+          <w:p>
+            <w:pPr>
+              <w:pStyle w:val="ExampleTableText"/>
+            </w:pPr>
+            <w:r>
+              <w:t>SIGIZI ONLY</w:t>
+            </w:r>
+          </w:p>
+        </w:tc>
+        <w:tc>
+          <w:tcPr>
+            <w:tcW w:type="dxa" w:w="3750"/>
+            <w:vAlign w:val="center"/>
+          </w:tcPr>
+          <w:p>
+            <w:pPr>
+              <w:pStyle w:val="ExampleTableText"/>
+            </w:pPr>
+            <w:r>
+              <w:t>Another retained pregnancy</w:t>
+            </w:r>
+          </w:p>
+        </w:tc>
+      </w:tr>
+    </w:tbl>
+    <w:p>
+      <w:pPr>
+        <w:pStyle w:val="CaptionText"/>
+        <w:pageBreakBefore w:val="0"/>
+        <w:spacing w:after="20"/>
+      </w:pPr>
+    </w:p>
+    <w:tbl>
+      <w:tblPr>
+        <w:tblStyle w:val="TableGrid"/>
+        <w:tblW w:type="dxa" w:w="9360"/>
+        <w:tblLayout w:type="fixed"/>
+        <w:tblLook w:firstColumn="1" w:firstRow="1" w:lastColumn="0" w:lastRow="0" w:noHBand="0" w:noVBand="1" w:val="04A0"/>
+        <w:tblInd w:w="120" w:type="dxa"/>
+        <w:tblCellMar>
+          <w:top w:w="85" w:type="dxa"/>
+          <w:bottom w:w="85" w:type="dxa"/>
+          <w:left w:w="120" w:type="dxa"/>
+          <w:right w:w="120" w:type="dxa"/>
+        </w:tblCellMar>
+      </w:tblPr>
+      <w:tblGrid>
+        <w:gridCol w:w="2800"/>
+        <w:gridCol w:w="2800"/>
+        <w:gridCol w:w="3760"/>
+      </w:tblGrid>
+      <w:tr>
+        <w:trPr>
+          <w:cantSplit/>
+          <w:tblHeader/>
+        </w:trPr>
+        <w:tc>
+          <w:tcPr>
+            <w:tcW w:type="dxa" w:w="2800"/>
+            <w:vAlign w:val="center"/>
+            <w:shd w:fill="E8EFF8"/>
+          </w:tcPr>
+          <w:p>
+            <w:pPr>
+              <w:pStyle w:val="ExampleTableText"/>
+            </w:pPr>
+            <w:r>
+              <w:rPr>
+                <w:b/>
+              </w:rPr>
+              <w:t>Validated delivery</w:t>
+            </w:r>
+          </w:p>
+        </w:tc>
+        <w:tc>
+          <w:tcPr>
+            <w:tcW w:type="dxa" w:w="2800"/>
+            <w:vAlign w:val="center"/>
+            <w:shd w:fill="E8EFF8"/>
+          </w:tcPr>
+          <w:p>
+            <w:pPr>
+              <w:pStyle w:val="ExampleTableText"/>
+            </w:pPr>
+            <w:r>
+              <w:rPr>
+                <w:b/>
+              </w:rPr>
+              <w:t>Linked pregnancy</w:t>
+            </w:r>
+          </w:p>
+        </w:tc>
+        <w:tc>
+          <w:tcPr>
+            <w:tcW w:type="dxa" w:w="3760"/>
+            <w:vAlign w:val="center"/>
+            <w:shd w:fill="E8EFF8"/>
+          </w:tcPr>
+          <w:p>
+            <w:pPr>
+              <w:pStyle w:val="ExampleTableText"/>
+            </w:pPr>
+            <w:r>
+              <w:rPr>
+                <w:b/>
+              </w:rPr>
+              <w:t>Actual delivery date</w:t>
+            </w:r>
+          </w:p>
+        </w:tc>
+      </w:tr>
+      <w:tr>
+        <w:trPr>
+          <w:cantSplit/>
+        </w:trPr>
+        <w:tc>
+          <w:tcPr>
+            <w:tcW w:type="dxa" w:w="2800"/>
+            <w:vAlign w:val="center"/>
+          </w:tcPr>
+          <w:p>
+            <w:pPr>
+              <w:pStyle w:val="ExampleTableText"/>
+            </w:pPr>
+            <w:r>
+              <w:t>D-A</w:t>
+            </w:r>
+          </w:p>
+        </w:tc>
+        <w:tc>
+          <w:tcPr>
+            <w:tcW w:type="dxa" w:w="2800"/>
+            <w:vAlign w:val="center"/>
+          </w:tcPr>
+          <w:p>
+            <w:pPr>
+              <w:pStyle w:val="ExampleTableText"/>
+            </w:pPr>
+            <w:r>
+              <w:t>P-A</w:t>
+            </w:r>
+          </w:p>
+        </w:tc>
+        <w:tc>
+          <w:tcPr>
+            <w:tcW w:type="dxa" w:w="3760"/>
+            <w:vAlign w:val="center"/>
+          </w:tcPr>
+          <w:p>
+            <w:pPr>
+              <w:pStyle w:val="ExampleTableText"/>
+            </w:pPr>
+            <w:r>
+              <w:t>2026-08-31</w:t>
+            </w:r>
+          </w:p>
+        </w:tc>
+      </w:tr>
+    </w:tbl>
+    <w:p>
+      <w:pPr>
+        <w:pStyle w:val="CaptionText"/>
+        <w:pageBreakBefore w:val="0"/>
+        <w:spacing w:after="20"/>
+      </w:pPr>
+    </w:p>
+    <w:p>
+      <w:pPr>
+        <w:pStyle w:val="Heading3"/>
+        <w:pageBreakBefore w:val="0"/>
+      </w:pPr>
+      <w:r>
+        <w:t>A pregnancy-preserving join</w:t>
+      </w:r>
+    </w:p>
+    <w:p>
+      <w:pPr>
+        <w:pageBreakBefore w:val="0"/>
+      </w:pPr>
+      <w:r>
+        <w:t>The reporting layer combines pregnancy tracking with accepted delivery evidence by pregnancy_episode_id. In this example, joining the accepted delivery projection to the pregnancy rows preserves the pregnancy without a delivery as well.</w:t>
+      </w:r>
+    </w:p>
+    <w:tbl>
+      <w:tblPr>
+        <w:tblStyle w:val="TableGrid"/>
+        <w:tblW w:type="dxa" w:w="9360"/>
+        <w:tblLayout w:type="fixed"/>
+        <w:tblLook w:firstColumn="1" w:firstRow="1" w:lastColumn="0" w:lastRow="0" w:noHBand="0" w:noVBand="1" w:val="04A0"/>
+        <w:tblInd w:w="120" w:type="dxa"/>
+        <w:tblCellMar>
+          <w:top w:w="85" w:type="dxa"/>
+          <w:bottom w:w="85" w:type="dxa"/>
+          <w:left w:w="120" w:type="dxa"/>
+          <w:right w:w="120" w:type="dxa"/>
+        </w:tblCellMar>
+      </w:tblPr>
+      <w:tblGrid>
+        <w:gridCol w:w="1800"/>
+        <w:gridCol w:w="2860"/>
+        <w:gridCol w:w="4700"/>
+      </w:tblGrid>
+      <w:tr>
+        <w:trPr>
+          <w:cantSplit/>
+          <w:tblHeader/>
+        </w:trPr>
+        <w:tc>
+          <w:tcPr>
+            <w:tcW w:type="dxa" w:w="1800"/>
+            <w:vAlign w:val="center"/>
+            <w:shd w:fill="E8EFF8"/>
+          </w:tcPr>
+          <w:p>
+            <w:pPr>
+              <w:pStyle w:val="ExampleTableText"/>
+            </w:pPr>
+            <w:r>
+              <w:rPr>
+                <w:b/>
+              </w:rPr>
+              <w:t>Pregnancy</w:t>
+            </w:r>
+          </w:p>
+        </w:tc>
+        <w:tc>
+          <w:tcPr>
+            <w:tcW w:type="dxa" w:w="2860"/>
+            <w:vAlign w:val="center"/>
+            <w:shd w:fill="E8EFF8"/>
+          </w:tcPr>
+          <w:p>
+            <w:pPr>
+              <w:pStyle w:val="ExampleTableText"/>
+            </w:pPr>
+            <w:r>
+              <w:rPr>
+                <w:b/>
+              </w:rPr>
+              <w:t>Joined delivery</w:t>
+            </w:r>
+          </w:p>
+        </w:tc>
+        <w:tc>
+          <w:tcPr>
+            <w:tcW w:type="dxa" w:w="4700"/>
+            <w:vAlign w:val="center"/>
+            <w:shd w:fill="E8EFF8"/>
+          </w:tcPr>
+          <w:p>
+            <w:pPr>
+              <w:pStyle w:val="ExampleTableText"/>
+            </w:pPr>
+            <w:r>
+              <w:rPr>
+                <w:b/>
+              </w:rPr>
+              <w:t>What can be concluded</w:t>
+            </w:r>
+          </w:p>
+        </w:tc>
+      </w:tr>
+      <w:tr>
+        <w:trPr>
+          <w:cantSplit/>
+        </w:trPr>
+        <w:tc>
+          <w:tcPr>
+            <w:tcW w:type="dxa" w:w="1800"/>
+            <w:vAlign w:val="center"/>
+          </w:tcPr>
+          <w:p>
+            <w:pPr>
+              <w:pStyle w:val="ExampleTableText"/>
+            </w:pPr>
+            <w:r>
+              <w:t>P-A</w:t>
+            </w:r>
+          </w:p>
+        </w:tc>
+        <w:tc>
+          <w:tcPr>
+            <w:tcW w:type="dxa" w:w="2860"/>
+            <w:vAlign w:val="center"/>
+          </w:tcPr>
+          <w:p>
+            <w:pPr>
+              <w:pStyle w:val="ExampleTableText"/>
+            </w:pPr>
+            <w:r>
+              <w:t>D-A / 2026-08-31</w:t>
+            </w:r>
+          </w:p>
+        </w:tc>
+        <w:tc>
+          <w:tcPr>
+            <w:tcW w:type="dxa" w:w="4700"/>
+            <w:vAlign w:val="center"/>
+          </w:tcPr>
+          <w:p>
+            <w:pPr>
+              <w:pStyle w:val="ExampleTableText"/>
+            </w:pPr>
+            <w:r>
+              <w:t>Accepted delivery is available; integrated status can be DELIVERED</w:t>
+            </w:r>
+          </w:p>
+        </w:tc>
+      </w:tr>
+      <w:tr>
+        <w:trPr>
+          <w:cantSplit/>
+        </w:trPr>
+        <w:tc>
+          <w:tcPr>
+            <w:tcW w:type="dxa" w:w="1800"/>
+            <w:vAlign w:val="center"/>
+          </w:tcPr>
+          <w:p>
+            <w:pPr>
+              <w:pStyle w:val="ExampleTableText"/>
+            </w:pPr>
+            <w:r>
+              <w:t>P-B</w:t>
+            </w:r>
+          </w:p>
+        </w:tc>
+        <w:tc>
+          <w:tcPr>
+            <w:tcW w:type="dxa" w:w="2860"/>
+            <w:vAlign w:val="center"/>
+          </w:tcPr>
+          <w:p>
+            <w:pPr>
+              <w:pStyle w:val="ExampleTableText"/>
+            </w:pPr>
+            <w:r>
+              <w:t>NULL</w:t>
+            </w:r>
+          </w:p>
+        </w:tc>
+        <w:tc>
+          <w:tcPr>
+            <w:tcW w:type="dxa" w:w="4700"/>
+            <w:vAlign w:val="center"/>
+          </w:tcPr>
+          <w:p>
+            <w:pPr>
+              <w:pStyle w:val="ExampleTableText"/>
+            </w:pPr>
+            <w:r>
+              <w:t>No accepted delivery in this join; status still depends on other evidence and date rules</w:t>
+            </w:r>
+          </w:p>
+        </w:tc>
+      </w:tr>
+    </w:tbl>
+    <w:p>
+      <w:pPr>
+        <w:pStyle w:val="CaptionText"/>
+        <w:pageBreakBefore w:val="0"/>
+        <w:spacing w:after="20"/>
+      </w:pPr>
+    </w:p>
+    <w:p>
+      <w:pPr>
+        <w:pageBreakBefore w:val="0"/>
+      </w:pPr>
+      <w:r>
+        <w:t>NULL here is not automatically MISSING_BIRTH. P-B may still be active, overdue, abortus or supported by another allowed outcome pathway. The status logic must evaluate that evidence.</w:t>
+      </w:r>
+    </w:p>
+    <w:p>
+      <w:pPr>
+        <w:pStyle w:val="Heading3"/>
+        <w:pageBreakBefore w:val="0"/>
+      </w:pPr>
+      <w:r>
+        <w:t>Why a source-member join can duplicate a dashboard row</w:t>
+      </w:r>
+    </w:p>
+    <w:p>
+      <w:pPr>
+        <w:pageBreakBefore w:val="0"/>
+      </w:pPr>
+      <w:r>
+        <w:t>D-A’s member map contains SG-BIRTH-A, EP-BIRTH-A and RS-BIRTH-A. Joining these directly to P-A produces a row for each contributing report. That is useful for audit, but not a pregnancy-grain scorecard. Aggregate evidence before joining, or use the accepted canonical grain.</w:t>
+      </w:r>
+    </w:p>
+    <w:p>
+      <w:pPr>
+        <w:pStyle w:val="Heading3"/>
+        <w:pageBreakBefore w:val="0"/>
+      </w:pPr>
+      <w:r>
+        <w:t>UNION of scopes is not deduplication</w:t>
+      </w:r>
+    </w:p>
+    <w:p>
+      <w:pPr>
+        <w:pageBreakBefore w:val="0"/>
+      </w:pPr>
+      <w:r>
+        <w:t>The source-scope view deliberately repeats P-A as ALL, SIGIZI, EPUS and the combined scope. These are different views of the same pregnancy, not new pregnancies. Filter to the intended scope and count distinct episode IDs. Pregnancy charts use EDD-based eligibility; delivery charts use delivery-date and valid-birth rules.</w:t>
+      </w:r>
+    </w:p>
+    <w:p>
+      <w:pPr>
+        <w:pStyle w:val="CaptionText"/>
+        <w:pageBreakBefore w:val="0"/>
+      </w:pPr>
+      <w:r>
+        <w:t>Trace: t_pregnancy_outcome_tracking_v3_3 + v_delivery_event_master_validated → v_pregnancy_monitoring_integrated → v_pregnancy_monitoring_by_source_scope. Raw-member joins are for lineage, not a substitute for those reporting contracts.</w:t>
+      </w:r>
+    </w:p>
+    <w:p>
+      <w:pPr>
         <w:pStyle w:val="Heading1"/>
         <w:pageBreakBefore/>
       </w:pPr>
@@ -7173,6 +11301,22 @@
       </w:r>
       <w:r>
         <w:t>Revision: adds the restored SIGIZI deletion registry before source publication. This is pregnancy-specific exclusion, not a global patient blacklist.</w:t>
+      </w:r>
+    </w:p>
+  </w:comment>
+  <w:comment w:id="1" w:author="Documentation review" w:initials="DR" w:date="2026-09-03T21:45:43Z">
+    <w:p>
+      <w:pPr>
+        <w:pStyle w:val="CommentText"/>
+      </w:pPr>
+      <w:r>
+        <w:rPr>
+          <w:rStyle w:val="CommentReference"/>
+        </w:rPr>
+        <w:annotationRef/>
+      </w:r>
+      <w:r>
+        <w:t>Added fictional worked examples to make the existing rules concrete. Examples illustrate selected branches of the SQL; they are not patient extracts or a live pipeline execution.</w:t>
       </w:r>
     </w:p>
   </w:comment>
@@ -19307,6 +23451,17 @@
       <w:sz w:val="16"/>
     </w:rPr>
   </w:style>
+  <w:style w:type="paragraph" w:customStyle="1" w:styleId="ExampleTableText">
+    <w:name w:val="ExampleTableText"/>
+    <w:basedOn w:val="TableText"/>
+    <w:pPr>
+      <w:spacing w:before="40" w:after="40" w:line="259" w:lineRule="auto"/>
+    </w:pPr>
+    <w:rPr>
+      <w:rFonts w:ascii="Calibri" w:hAnsi="Calibri"/>
+      <w:sz w:val="19"/>
+    </w:rPr>
+  </w:style>
 </w:styles>
 </file>
 

</xml_diff>

<commit_message>
Document canonical pregnancy and delivery tables
Add table-by-table descriptions of row grain, purpose, lineage, and downstream use for pregnancy and delivery canonicalization outputs.
</commit_message>
<xml_diff>
--- a/docs/Lombok_Barat_v3_Data_Flow_and_Matching.docx
+++ b/docs/Lombok_Barat_v3_Data_Flow_and_Matching.docx
@@ -8277,7 +8277,1956 @@
         <w:pageBreakBefore/>
       </w:pPr>
       <w:r>
-        <w:t>Appendix: reporting views and their direct inputs</w:t>
+        <w:t>Appendix: source-specific pregnancy canonicalization tables</w:t>
+      </w:r>
+    </w:p>
+    <w:p>
+      <w:pPr>
+        <w:pageBreakBefore w:val="0"/>
+      </w:pPr>
+      <w:r>
+        <w:t>All four tables on this page are created by 20_pregnancy_canonicalization.sql. A map preserves member-to-canonical assignments; a canonical episode table contains the consolidated source-specific pregnancy.</w:t>
+      </w:r>
+    </w:p>
+    <w:tbl>
+      <w:tblPr>
+        <w:tblStyle w:val="TableGrid"/>
+        <w:tblW w:type="dxa" w:w="9360"/>
+        <w:tblLayout w:type="fixed"/>
+        <w:tblLook w:firstColumn="1" w:firstRow="1" w:lastColumn="0" w:lastRow="0" w:noHBand="0" w:noVBand="1" w:val="04A0"/>
+        <w:tblInd w:w="120" w:type="dxa"/>
+        <w:tblCellMar>
+          <w:top w:w="85" w:type="dxa"/>
+          <w:bottom w:w="85" w:type="dxa"/>
+          <w:left w:w="120" w:type="dxa"/>
+          <w:right w:w="120" w:type="dxa"/>
+        </w:tblCellMar>
+      </w:tblPr>
+      <w:tblGrid>
+        <w:gridCol w:w="2600"/>
+        <w:gridCol w:w="1640"/>
+        <w:gridCol w:w="3420"/>
+        <w:gridCol w:w="1700"/>
+      </w:tblGrid>
+      <w:tr>
+        <w:trPr>
+          <w:cantSplit/>
+          <w:tblHeader/>
+        </w:trPr>
+        <w:tc>
+          <w:tcPr>
+            <w:tcW w:type="dxa" w:w="2600"/>
+            <w:vAlign w:val="center"/>
+            <w:shd w:fill="E8EFF8"/>
+          </w:tcPr>
+          <w:p>
+            <w:pPr>
+              <w:pStyle w:val="ExampleTableText"/>
+              <w:spacing w:before="40" w:after="40"/>
+            </w:pPr>
+            <w:r>
+              <w:rPr>
+                <w:b/>
+              </w:rPr>
+              <w:t>Table</w:t>
+            </w:r>
+          </w:p>
+        </w:tc>
+        <w:tc>
+          <w:tcPr>
+            <w:tcW w:type="dxa" w:w="1640"/>
+            <w:vAlign w:val="center"/>
+            <w:shd w:fill="E8EFF8"/>
+          </w:tcPr>
+          <w:p>
+            <w:pPr>
+              <w:pStyle w:val="ExampleTableText"/>
+              <w:spacing w:before="40" w:after="40"/>
+            </w:pPr>
+            <w:r>
+              <w:rPr>
+                <w:b/>
+              </w:rPr>
+              <w:t>Row grain</w:t>
+            </w:r>
+          </w:p>
+        </w:tc>
+        <w:tc>
+          <w:tcPr>
+            <w:tcW w:type="dxa" w:w="3420"/>
+            <w:vAlign w:val="center"/>
+            <w:shd w:fill="E8EFF8"/>
+          </w:tcPr>
+          <w:p>
+            <w:pPr>
+              <w:pStyle w:val="ExampleTableText"/>
+              <w:spacing w:before="40" w:after="40"/>
+            </w:pPr>
+            <w:r>
+              <w:rPr>
+                <w:b/>
+              </w:rPr>
+              <w:t>Function</w:t>
+            </w:r>
+          </w:p>
+        </w:tc>
+        <w:tc>
+          <w:tcPr>
+            <w:tcW w:type="dxa" w:w="1700"/>
+            <w:vAlign w:val="center"/>
+            <w:shd w:fill="E8EFF8"/>
+          </w:tcPr>
+          <w:p>
+            <w:pPr>
+              <w:pStyle w:val="ExampleTableText"/>
+              <w:spacing w:before="40" w:after="40"/>
+            </w:pPr>
+            <w:r>
+              <w:rPr>
+                <w:b/>
+              </w:rPr>
+              <w:t>Used next by</w:t>
+            </w:r>
+          </w:p>
+        </w:tc>
+      </w:tr>
+      <w:tr>
+        <w:trPr>
+          <w:cantSplit/>
+        </w:trPr>
+        <w:tc>
+          <w:tcPr>
+            <w:tcW w:type="dxa" w:w="2600"/>
+            <w:vAlign w:val="center"/>
+          </w:tcPr>
+          <w:p>
+            <w:pPr>
+              <w:pStyle w:val="ExampleTableText"/>
+              <w:spacing w:before="40" w:after="40"/>
+            </w:pPr>
+            <w:r>
+              <w:t>t_sigizi_episode_canonical_map_v3_3</w:t>
+            </w:r>
+          </w:p>
+        </w:tc>
+        <w:tc>
+          <w:tcPr>
+            <w:tcW w:type="dxa" w:w="1640"/>
+            <w:vAlign w:val="center"/>
+          </w:tcPr>
+          <w:p>
+            <w:pPr>
+              <w:pStyle w:val="ExampleTableText"/>
+              <w:spacing w:before="40" w:after="40"/>
+            </w:pPr>
+            <w:r>
+              <w:t>One row per original SIGIZI episode</w:t>
+            </w:r>
+          </w:p>
+        </w:tc>
+        <w:tc>
+          <w:tcPr>
+            <w:tcW w:type="dxa" w:w="3420"/>
+            <w:vAlign w:val="center"/>
+          </w:tcPr>
+          <w:p>
+            <w:pPr>
+              <w:pStyle w:val="ExampleTableText"/>
+              <w:spacing w:before="40" w:after="40"/>
+            </w:pPr>
+            <w:r>
+              <w:t>Assigns each SIGIZI episode to its selected canonical SIGIZI episode. Records the within-source rule, priority, confidence and date differences. An unmerged episode maps to itself.</w:t>
+            </w:r>
+          </w:p>
+        </w:tc>
+        <w:tc>
+          <w:tcPr>
+            <w:tcW w:type="dxa" w:w="1700"/>
+            <w:vAlign w:val="center"/>
+          </w:tcPr>
+          <w:p>
+            <w:pPr>
+              <w:pStyle w:val="ExampleTableText"/>
+              <w:spacing w:before="40" w:after="40"/>
+            </w:pPr>
+            <w:r>
+              <w:t>SIGIZI canonical episode aggregation</w:t>
+            </w:r>
+          </w:p>
+        </w:tc>
+      </w:tr>
+      <w:tr>
+        <w:trPr>
+          <w:cantSplit/>
+        </w:trPr>
+        <w:tc>
+          <w:tcPr>
+            <w:tcW w:type="dxa" w:w="2600"/>
+            <w:vAlign w:val="center"/>
+          </w:tcPr>
+          <w:p>
+            <w:pPr>
+              <w:pStyle w:val="ExampleTableText"/>
+              <w:spacing w:before="40" w:after="40"/>
+            </w:pPr>
+            <w:r>
+              <w:t>t_sigizi_pregnancy_episode_canonical_v3_3</w:t>
+            </w:r>
+          </w:p>
+        </w:tc>
+        <w:tc>
+          <w:tcPr>
+            <w:tcW w:type="dxa" w:w="1640"/>
+            <w:vAlign w:val="center"/>
+          </w:tcPr>
+          <w:p>
+            <w:pPr>
+              <w:pStyle w:val="ExampleTableText"/>
+              <w:spacing w:before="40" w:after="40"/>
+            </w:pPr>
+            <w:r>
+              <w:t>One row per canonical SIGIZI pregnancy</w:t>
+            </w:r>
+          </w:p>
+        </w:tc>
+        <w:tc>
+          <w:tcPr>
+            <w:tcW w:type="dxa" w:w="3420"/>
+            <w:vAlign w:val="center"/>
+          </w:tcPr>
+          <w:p>
+            <w:pPr>
+              <w:pStyle w:val="ExampleTableText"/>
+              <w:spacing w:before="40" w:after="40"/>
+            </w:pPr>
+            <w:r>
+              <w:t>Combines assigned SIGIZI episodes. Selects representative identity, geography, HPHT, HPL, delivery and ANC fields by episode quality while preserving member episodes, source tables and source-record IDs.</w:t>
+            </w:r>
+          </w:p>
+        </w:tc>
+        <w:tc>
+          <w:tcPr>
+            <w:tcW w:type="dxa" w:w="1700"/>
+            <w:vAlign w:val="center"/>
+          </w:tcPr>
+          <w:p>
+            <w:pPr>
+              <w:pStyle w:val="ExampleTableText"/>
+              <w:spacing w:before="40" w:after="40"/>
+            </w:pPr>
+            <w:r>
+              <w:t>Cross-source pregnancy matching and direct SIGIZI delivery rescue</w:t>
+            </w:r>
+          </w:p>
+        </w:tc>
+      </w:tr>
+      <w:tr>
+        <w:trPr>
+          <w:cantSplit/>
+        </w:trPr>
+        <w:tc>
+          <w:tcPr>
+            <w:tcW w:type="dxa" w:w="2600"/>
+            <w:vAlign w:val="center"/>
+          </w:tcPr>
+          <w:p>
+            <w:pPr>
+              <w:pStyle w:val="ExampleTableText"/>
+              <w:spacing w:before="40" w:after="40"/>
+            </w:pPr>
+            <w:r>
+              <w:t>t_epus_episode_canonical_map_v3_3</w:t>
+            </w:r>
+          </w:p>
+        </w:tc>
+        <w:tc>
+          <w:tcPr>
+            <w:tcW w:type="dxa" w:w="1640"/>
+            <w:vAlign w:val="center"/>
+          </w:tcPr>
+          <w:p>
+            <w:pPr>
+              <w:pStyle w:val="ExampleTableText"/>
+              <w:spacing w:before="40" w:after="40"/>
+            </w:pPr>
+            <w:r>
+              <w:t>One row per original EPUS episode</w:t>
+            </w:r>
+          </w:p>
+        </w:tc>
+        <w:tc>
+          <w:tcPr>
+            <w:tcW w:type="dxa" w:w="3420"/>
+            <w:vAlign w:val="center"/>
+          </w:tcPr>
+          <w:p>
+            <w:pPr>
+              <w:pStyle w:val="ExampleTableText"/>
+              <w:spacing w:before="40" w:after="40"/>
+            </w:pPr>
+            <w:r>
+              <w:t>Assigns each EPUS episode to its selected canonical EPUS episode and records the within-source matching evidence. An unmerged episode maps to itself.</w:t>
+            </w:r>
+          </w:p>
+        </w:tc>
+        <w:tc>
+          <w:tcPr>
+            <w:tcW w:type="dxa" w:w="1700"/>
+            <w:vAlign w:val="center"/>
+          </w:tcPr>
+          <w:p>
+            <w:pPr>
+              <w:pStyle w:val="ExampleTableText"/>
+              <w:spacing w:before="40" w:after="40"/>
+            </w:pPr>
+            <w:r>
+              <w:t>EPUS canonical episode aggregation</w:t>
+            </w:r>
+          </w:p>
+        </w:tc>
+      </w:tr>
+      <w:tr>
+        <w:trPr>
+          <w:cantSplit/>
+        </w:trPr>
+        <w:tc>
+          <w:tcPr>
+            <w:tcW w:type="dxa" w:w="2600"/>
+            <w:vAlign w:val="center"/>
+          </w:tcPr>
+          <w:p>
+            <w:pPr>
+              <w:pStyle w:val="ExampleTableText"/>
+              <w:spacing w:before="40" w:after="40"/>
+            </w:pPr>
+            <w:r>
+              <w:t>t_epus_pregnancy_episode_canonical_v3_3</w:t>
+            </w:r>
+          </w:p>
+        </w:tc>
+        <w:tc>
+          <w:tcPr>
+            <w:tcW w:type="dxa" w:w="1640"/>
+            <w:vAlign w:val="center"/>
+          </w:tcPr>
+          <w:p>
+            <w:pPr>
+              <w:pStyle w:val="ExampleTableText"/>
+              <w:spacing w:before="40" w:after="40"/>
+            </w:pPr>
+            <w:r>
+              <w:t>One row per canonical EPUS pregnancy</w:t>
+            </w:r>
+          </w:p>
+        </w:tc>
+        <w:tc>
+          <w:tcPr>
+            <w:tcW w:type="dxa" w:w="3420"/>
+            <w:vAlign w:val="center"/>
+          </w:tcPr>
+          <w:p>
+            <w:pPr>
+              <w:pStyle w:val="ExampleTableText"/>
+              <w:spacing w:before="40" w:after="40"/>
+            </w:pPr>
+            <w:r>
+              <w:t>Combines assigned EPUS episodes. Selects representative identity, pregnancy dates, ANC dates, geography and EPUS source keys while retaining all member episode IDs.</w:t>
+            </w:r>
+          </w:p>
+        </w:tc>
+        <w:tc>
+          <w:tcPr>
+            <w:tcW w:type="dxa" w:w="1700"/>
+            <w:vAlign w:val="center"/>
+          </w:tcPr>
+          <w:p>
+            <w:pPr>
+              <w:pStyle w:val="ExampleTableText"/>
+              <w:spacing w:before="40" w:after="40"/>
+            </w:pPr>
+            <w:r>
+              <w:t>Cross-source pregnancy matching</w:t>
+            </w:r>
+          </w:p>
+        </w:tc>
+      </w:tr>
+    </w:tbl>
+    <w:p>
+      <w:pPr>
+        <w:pStyle w:val="CaptionText"/>
+        <w:pageBreakBefore w:val="0"/>
+        <w:spacing w:after="20"/>
+      </w:pPr>
+    </w:p>
+    <w:p>
+      <w:pPr>
+        <w:pStyle w:val="Heading3"/>
+        <w:pageBreakBefore w:val="0"/>
+      </w:pPr>
+      <w:r>
+        <w:t>What these tables solve</w:t>
+      </w:r>
+    </w:p>
+    <w:p>
+      <w:pPr>
+        <w:pageBreakBefore w:val="0"/>
+      </w:pPr>
+      <w:r>
+        <w:t>SIGIZI and EPUS can each contain more than one representation of the same pregnancy. These tables first resolve duplication inside each source family. They do not yet prove that a SIGIZI pregnancy and an EPUS pregnancy belong together.</w:t>
+      </w:r>
+    </w:p>
+    <w:p>
+      <w:pPr>
+        <w:pStyle w:val="CaptionText"/>
+        <w:pageBreakBefore w:val="0"/>
+      </w:pPr>
+      <w:r>
+        <w:t>Trace: initial SIGIZI and EPUS episode tables -&gt; source-specific canonical maps -&gt; source-specific canonical pregnancy tables.</w:t>
+      </w:r>
+    </w:p>
+    <w:p>
+      <w:pPr>
+        <w:pStyle w:val="Heading2"/>
+        <w:pageBreakBefore/>
+      </w:pPr>
+      <w:r>
+        <w:t>Appendix: final pregnancy map and spine</w:t>
+      </w:r>
+    </w:p>
+    <w:p>
+      <w:pPr>
+        <w:pageBreakBefore w:val="0"/>
+      </w:pPr>
+      <w:r>
+        <w:t>These tables are also created by 20_pregnancy_canonicalization.sql. They integrate the source-specific pregnancies and preserve how preliminary pregnancy rows were regrouped.</w:t>
+      </w:r>
+    </w:p>
+    <w:tbl>
+      <w:tblPr>
+        <w:tblStyle w:val="TableGrid"/>
+        <w:tblW w:type="dxa" w:w="9360"/>
+        <w:tblLayout w:type="fixed"/>
+        <w:tblLook w:firstColumn="1" w:firstRow="1" w:lastColumn="0" w:lastRow="0" w:noHBand="0" w:noVBand="1" w:val="04A0"/>
+        <w:tblInd w:w="120" w:type="dxa"/>
+        <w:tblCellMar>
+          <w:top w:w="85" w:type="dxa"/>
+          <w:bottom w:w="85" w:type="dxa"/>
+          <w:left w:w="120" w:type="dxa"/>
+          <w:right w:w="120" w:type="dxa"/>
+        </w:tblCellMar>
+      </w:tblPr>
+      <w:tblGrid>
+        <w:gridCol w:w="2600"/>
+        <w:gridCol w:w="1640"/>
+        <w:gridCol w:w="3420"/>
+        <w:gridCol w:w="1700"/>
+      </w:tblGrid>
+      <w:tr>
+        <w:trPr>
+          <w:cantSplit/>
+          <w:tblHeader/>
+        </w:trPr>
+        <w:tc>
+          <w:tcPr>
+            <w:tcW w:type="dxa" w:w="2600"/>
+            <w:vAlign w:val="center"/>
+            <w:shd w:fill="E8EFF8"/>
+          </w:tcPr>
+          <w:p>
+            <w:pPr>
+              <w:pStyle w:val="ExampleTableText"/>
+              <w:spacing w:before="40" w:after="40"/>
+            </w:pPr>
+            <w:r>
+              <w:rPr>
+                <w:b/>
+              </w:rPr>
+              <w:t>Table</w:t>
+            </w:r>
+          </w:p>
+        </w:tc>
+        <w:tc>
+          <w:tcPr>
+            <w:tcW w:type="dxa" w:w="1640"/>
+            <w:vAlign w:val="center"/>
+            <w:shd w:fill="E8EFF8"/>
+          </w:tcPr>
+          <w:p>
+            <w:pPr>
+              <w:pStyle w:val="ExampleTableText"/>
+              <w:spacing w:before="40" w:after="40"/>
+            </w:pPr>
+            <w:r>
+              <w:rPr>
+                <w:b/>
+              </w:rPr>
+              <w:t>Row grain</w:t>
+            </w:r>
+          </w:p>
+        </w:tc>
+        <w:tc>
+          <w:tcPr>
+            <w:tcW w:type="dxa" w:w="3420"/>
+            <w:vAlign w:val="center"/>
+            <w:shd w:fill="E8EFF8"/>
+          </w:tcPr>
+          <w:p>
+            <w:pPr>
+              <w:pStyle w:val="ExampleTableText"/>
+              <w:spacing w:before="40" w:after="40"/>
+            </w:pPr>
+            <w:r>
+              <w:rPr>
+                <w:b/>
+              </w:rPr>
+              <w:t>Function</w:t>
+            </w:r>
+          </w:p>
+        </w:tc>
+        <w:tc>
+          <w:tcPr>
+            <w:tcW w:type="dxa" w:w="1700"/>
+            <w:vAlign w:val="center"/>
+            <w:shd w:fill="E8EFF8"/>
+          </w:tcPr>
+          <w:p>
+            <w:pPr>
+              <w:pStyle w:val="ExampleTableText"/>
+              <w:spacing w:before="40" w:after="40"/>
+            </w:pPr>
+            <w:r>
+              <w:rPr>
+                <w:b/>
+              </w:rPr>
+              <w:t>Used next by</w:t>
+            </w:r>
+          </w:p>
+        </w:tc>
+      </w:tr>
+      <w:tr>
+        <w:trPr>
+          <w:cantSplit/>
+        </w:trPr>
+        <w:tc>
+          <w:tcPr>
+            <w:tcW w:type="dxa" w:w="2600"/>
+            <w:vAlign w:val="center"/>
+          </w:tcPr>
+          <w:p>
+            <w:pPr>
+              <w:pStyle w:val="ExampleTableText"/>
+              <w:spacing w:before="40" w:after="40"/>
+            </w:pPr>
+            <w:r>
+              <w:t>t_pregnancy_final_canonical_map_v3_3</w:t>
+            </w:r>
+          </w:p>
+        </w:tc>
+        <w:tc>
+          <w:tcPr>
+            <w:tcW w:type="dxa" w:w="1640"/>
+            <w:vAlign w:val="center"/>
+          </w:tcPr>
+          <w:p>
+            <w:pPr>
+              <w:pStyle w:val="ExampleTableText"/>
+              <w:spacing w:before="40" w:after="40"/>
+            </w:pPr>
+            <w:r>
+              <w:t>One row per preliminary pregnancy episode</w:t>
+            </w:r>
+          </w:p>
+        </w:tc>
+        <w:tc>
+          <w:tcPr>
+            <w:tcW w:type="dxa" w:w="3420"/>
+            <w:vAlign w:val="center"/>
+          </w:tcPr>
+          <w:p>
+            <w:pPr>
+              <w:pStyle w:val="ExampleTableText"/>
+              <w:spacing w:before="40" w:after="40"/>
+            </w:pPr>
+            <w:r>
+              <w:t>Maps each preliminary spine row to the final canonical pregnancy after the additional controlled matching guard. Stores merge method, priority, confidence, conflicts, edit distance and corroborating evidence.</w:t>
+            </w:r>
+          </w:p>
+        </w:tc>
+        <w:tc>
+          <w:tcPr>
+            <w:tcW w:type="dxa" w:w="1700"/>
+            <w:vAlign w:val="center"/>
+          </w:tcPr>
+          <w:p>
+            <w:pPr>
+              <w:pStyle w:val="ExampleTableText"/>
+              <w:spacing w:before="40" w:after="40"/>
+            </w:pPr>
+            <w:r>
+              <w:t>Final pregnancy-spine rebuild and lineage review</w:t>
+            </w:r>
+          </w:p>
+        </w:tc>
+      </w:tr>
+      <w:tr>
+        <w:trPr>
+          <w:cantSplit/>
+        </w:trPr>
+        <w:tc>
+          <w:tcPr>
+            <w:tcW w:type="dxa" w:w="2600"/>
+            <w:vAlign w:val="center"/>
+          </w:tcPr>
+          <w:p>
+            <w:pPr>
+              <w:pStyle w:val="ExampleTableText"/>
+              <w:spacing w:before="40" w:after="40"/>
+            </w:pPr>
+            <w:r>
+              <w:t>t_pregnancy_episode_spine_v3_3</w:t>
+            </w:r>
+          </w:p>
+        </w:tc>
+        <w:tc>
+          <w:tcPr>
+            <w:tcW w:type="dxa" w:w="1640"/>
+            <w:vAlign w:val="center"/>
+          </w:tcPr>
+          <w:p>
+            <w:pPr>
+              <w:pStyle w:val="ExampleTableText"/>
+              <w:spacing w:before="40" w:after="40"/>
+            </w:pPr>
+            <w:r>
+              <w:t>One row per final canonical pregnancy</w:t>
+            </w:r>
+          </w:p>
+        </w:tc>
+        <w:tc>
+          <w:tcPr>
+            <w:tcW w:type="dxa" w:w="3420"/>
+            <w:vAlign w:val="center"/>
+          </w:tcPr>
+          <w:p>
+            <w:pPr>
+              <w:pStyle w:val="ExampleTableText"/>
+              <w:spacing w:before="40" w:after="40"/>
+            </w:pPr>
+            <w:r>
+              <w:t>Final integrated pregnancy population. Combines matched SIGIZI and EPUS pregnancies and retains source-only pregnancies, with selected identity, dating, geography, source membership and QA fields.</w:t>
+            </w:r>
+          </w:p>
+        </w:tc>
+        <w:tc>
+          <w:tcPr>
+            <w:tcW w:type="dxa" w:w="1700"/>
+            <w:vAlign w:val="center"/>
+          </w:tcPr>
+          <w:p>
+            <w:pPr>
+              <w:pStyle w:val="ExampleTableText"/>
+              <w:spacing w:before="40" w:after="40"/>
+            </w:pPr>
+            <w:r>
+              <w:t>USG dating, outcome tracking, delivery linkage and reporting</w:t>
+            </w:r>
+          </w:p>
+        </w:tc>
+      </w:tr>
+    </w:tbl>
+    <w:p>
+      <w:pPr>
+        <w:pStyle w:val="CaptionText"/>
+        <w:pageBreakBefore w:val="0"/>
+        <w:spacing w:after="20"/>
+      </w:pPr>
+    </w:p>
+    <w:p>
+      <w:pPr>
+        <w:pStyle w:val="Heading3"/>
+        <w:pageBreakBefore w:val="0"/>
+      </w:pPr>
+      <w:r>
+        <w:t>Why the pregnancy spine is created twice</w:t>
+      </w:r>
+    </w:p>
+    <w:tbl>
+      <w:tblPr>
+        <w:tblStyle w:val="TableGrid"/>
+        <w:tblW w:type="dxa" w:w="9360"/>
+        <w:tblLayout w:type="fixed"/>
+        <w:tblLook w:firstColumn="1" w:firstRow="1" w:lastColumn="0" w:lastRow="0" w:noHBand="0" w:noVBand="1" w:val="04A0"/>
+        <w:tblInd w:w="120" w:type="dxa"/>
+        <w:tblCellMar>
+          <w:top w:w="85" w:type="dxa"/>
+          <w:bottom w:w="85" w:type="dxa"/>
+          <w:left w:w="120" w:type="dxa"/>
+          <w:right w:w="120" w:type="dxa"/>
+        </w:tblCellMar>
+      </w:tblPr>
+      <w:tblGrid>
+        <w:gridCol w:w="1900"/>
+        <w:gridCol w:w="7460"/>
+      </w:tblGrid>
+      <w:tr>
+        <w:trPr>
+          <w:cantSplit/>
+          <w:tblHeader/>
+        </w:trPr>
+        <w:tc>
+          <w:tcPr>
+            <w:tcW w:type="dxa" w:w="1900"/>
+            <w:vAlign w:val="center"/>
+            <w:shd w:fill="E8EFF8"/>
+          </w:tcPr>
+          <w:p>
+            <w:pPr>
+              <w:pStyle w:val="ExampleTableText"/>
+              <w:spacing w:before="40" w:after="40"/>
+            </w:pPr>
+            <w:r>
+              <w:rPr>
+                <w:b/>
+              </w:rPr>
+              <w:t>Step</w:t>
+            </w:r>
+          </w:p>
+        </w:tc>
+        <w:tc>
+          <w:tcPr>
+            <w:tcW w:type="dxa" w:w="7460"/>
+            <w:vAlign w:val="center"/>
+            <w:shd w:fill="E8EFF8"/>
+          </w:tcPr>
+          <w:p>
+            <w:pPr>
+              <w:pStyle w:val="ExampleTableText"/>
+              <w:spacing w:before="40" w:after="40"/>
+            </w:pPr>
+            <w:r>
+              <w:rPr>
+                <w:b/>
+              </w:rPr>
+              <w:t>What happens</w:t>
+            </w:r>
+          </w:p>
+        </w:tc>
+      </w:tr>
+      <w:tr>
+        <w:trPr>
+          <w:cantSplit/>
+        </w:trPr>
+        <w:tc>
+          <w:tcPr>
+            <w:tcW w:type="dxa" w:w="1900"/>
+            <w:vAlign w:val="center"/>
+          </w:tcPr>
+          <w:p>
+            <w:pPr>
+              <w:pStyle w:val="ExampleTableText"/>
+              <w:spacing w:before="40" w:after="40"/>
+            </w:pPr>
+            <w:r>
+              <w:t>Initial spine</w:t>
+            </w:r>
+          </w:p>
+        </w:tc>
+        <w:tc>
+          <w:tcPr>
+            <w:tcW w:type="dxa" w:w="7460"/>
+            <w:vAlign w:val="center"/>
+          </w:tcPr>
+          <w:p>
+            <w:pPr>
+              <w:pStyle w:val="ExampleTableText"/>
+              <w:spacing w:before="40" w:after="40"/>
+            </w:pPr>
+            <w:r>
+              <w:t>Reciprocal SIGIZI-EPUS matches are combined; SIGIZI-only and EPUS-only pregnancies are appended.</w:t>
+            </w:r>
+          </w:p>
+        </w:tc>
+      </w:tr>
+      <w:tr>
+        <w:trPr>
+          <w:cantSplit/>
+        </w:trPr>
+        <w:tc>
+          <w:tcPr>
+            <w:tcW w:type="dxa" w:w="1900"/>
+            <w:vAlign w:val="center"/>
+          </w:tcPr>
+          <w:p>
+            <w:pPr>
+              <w:pStyle w:val="ExampleTableText"/>
+              <w:spacing w:before="40" w:after="40"/>
+            </w:pPr>
+            <w:r>
+              <w:t>Precanonical copy</w:t>
+            </w:r>
+          </w:p>
+        </w:tc>
+        <w:tc>
+          <w:tcPr>
+            <w:tcW w:type="dxa" w:w="7460"/>
+            <w:vAlign w:val="center"/>
+          </w:tcPr>
+          <w:p>
+            <w:pPr>
+              <w:pStyle w:val="ExampleTableText"/>
+              <w:spacing w:before="40" w:after="40"/>
+            </w:pPr>
+            <w:r>
+              <w:t>The initial spine is retained temporarily so residual unmatched or duplicate pregnancy rows can be evaluated.</w:t>
+            </w:r>
+          </w:p>
+        </w:tc>
+      </w:tr>
+      <w:tr>
+        <w:trPr>
+          <w:cantSplit/>
+        </w:trPr>
+        <w:tc>
+          <w:tcPr>
+            <w:tcW w:type="dxa" w:w="1900"/>
+            <w:vAlign w:val="center"/>
+          </w:tcPr>
+          <w:p>
+            <w:pPr>
+              <w:pStyle w:val="ExampleTableText"/>
+              <w:spacing w:before="40" w:after="40"/>
+            </w:pPr>
+            <w:r>
+              <w:t>Final guard</w:t>
+            </w:r>
+          </w:p>
+        </w:tc>
+        <w:tc>
+          <w:tcPr>
+            <w:tcW w:type="dxa" w:w="7460"/>
+            <w:vAlign w:val="center"/>
+          </w:tcPr>
+          <w:p>
+            <w:pPr>
+              <w:pStyle w:val="ExampleTableText"/>
+              <w:spacing w:before="40" w:after="40"/>
+            </w:pPr>
+            <w:r>
+              <w:t>Controlled fingerprint, fuzzy-name, phone and missing-DOB routes evaluate remaining candidates with conflict and corroboration checks.</w:t>
+            </w:r>
+          </w:p>
+        </w:tc>
+      </w:tr>
+      <w:tr>
+        <w:trPr>
+          <w:cantSplit/>
+        </w:trPr>
+        <w:tc>
+          <w:tcPr>
+            <w:tcW w:type="dxa" w:w="1900"/>
+            <w:vAlign w:val="center"/>
+          </w:tcPr>
+          <w:p>
+            <w:pPr>
+              <w:pStyle w:val="ExampleTableText"/>
+              <w:spacing w:before="40" w:after="40"/>
+            </w:pPr>
+            <w:r>
+              <w:t>Final map</w:t>
+            </w:r>
+          </w:p>
+        </w:tc>
+        <w:tc>
+          <w:tcPr>
+            <w:tcW w:type="dxa" w:w="7460"/>
+            <w:vAlign w:val="center"/>
+          </w:tcPr>
+          <w:p>
+            <w:pPr>
+              <w:pStyle w:val="ExampleTableText"/>
+              <w:spacing w:before="40" w:after="40"/>
+            </w:pPr>
+            <w:r>
+              <w:t>Each preliminary pregnancy points to its accepted final canonical pregnancy, or to itself if no further merge is accepted.</w:t>
+            </w:r>
+          </w:p>
+        </w:tc>
+      </w:tr>
+      <w:tr>
+        <w:trPr>
+          <w:cantSplit/>
+        </w:trPr>
+        <w:tc>
+          <w:tcPr>
+            <w:tcW w:type="dxa" w:w="1900"/>
+            <w:vAlign w:val="center"/>
+          </w:tcPr>
+          <w:p>
+            <w:pPr>
+              <w:pStyle w:val="ExampleTableText"/>
+              <w:spacing w:before="40" w:after="40"/>
+            </w:pPr>
+            <w:r>
+              <w:t>Final spine rebuild</w:t>
+            </w:r>
+          </w:p>
+        </w:tc>
+        <w:tc>
+          <w:tcPr>
+            <w:tcW w:type="dxa" w:w="7460"/>
+            <w:vAlign w:val="center"/>
+          </w:tcPr>
+          <w:p>
+            <w:pPr>
+              <w:pStyle w:val="ExampleTableText"/>
+              <w:spacing w:before="40" w:after="40"/>
+            </w:pPr>
+            <w:r>
+              <w:t>Member rows are aggregated again so the persistent spine returns to one row per final pregnancy.</w:t>
+            </w:r>
+          </w:p>
+        </w:tc>
+      </w:tr>
+    </w:tbl>
+    <w:p>
+      <w:pPr>
+        <w:pStyle w:val="CaptionText"/>
+        <w:pageBreakBefore w:val="0"/>
+        <w:spacing w:after="20"/>
+      </w:pPr>
+    </w:p>
+    <w:p>
+      <w:pPr>
+        <w:pStyle w:val="CaptionText"/>
+        <w:pageBreakBefore w:val="0"/>
+      </w:pPr>
+      <w:r>
+        <w:t>The final map is the audit crosswalk. The final spine is the analytical pregnancy table. Generated IDs may change when source membership changes, so investigation should begin with the maps and member IDs.</w:t>
+      </w:r>
+    </w:p>
+    <w:p>
+      <w:pPr>
+        <w:pStyle w:val="Heading2"/>
+        <w:pageBreakBefore/>
+      </w:pPr>
+      <w:r>
+        <w:t>Appendix: delivery tables before pregnancy linkage</w:t>
+      </w:r>
+    </w:p>
+    <w:p>
+      <w:pPr>
+        <w:pageBreakBefore w:val="0"/>
+      </w:pPr>
+      <w:r>
+        <w:t>All delivery tables in this guide are created by 50_delivery_canonicalization.sql. The first phase standardizes and deduplicates delivery reports without requiring an ANC or pregnancy match.</w:t>
+      </w:r>
+    </w:p>
+    <w:tbl>
+      <w:tblPr>
+        <w:tblStyle w:val="TableGrid"/>
+        <w:tblW w:type="dxa" w:w="9360"/>
+        <w:tblLayout w:type="fixed"/>
+        <w:tblLook w:firstColumn="1" w:firstRow="1" w:lastColumn="0" w:lastRow="0" w:noHBand="0" w:noVBand="1" w:val="04A0"/>
+        <w:tblInd w:w="120" w:type="dxa"/>
+        <w:tblCellMar>
+          <w:top w:w="85" w:type="dxa"/>
+          <w:bottom w:w="85" w:type="dxa"/>
+          <w:left w:w="120" w:type="dxa"/>
+          <w:right w:w="120" w:type="dxa"/>
+        </w:tblCellMar>
+      </w:tblPr>
+      <w:tblGrid>
+        <w:gridCol w:w="2600"/>
+        <w:gridCol w:w="1640"/>
+        <w:gridCol w:w="3420"/>
+        <w:gridCol w:w="1700"/>
+      </w:tblGrid>
+      <w:tr>
+        <w:trPr>
+          <w:cantSplit/>
+          <w:tblHeader/>
+        </w:trPr>
+        <w:tc>
+          <w:tcPr>
+            <w:tcW w:type="dxa" w:w="2600"/>
+            <w:vAlign w:val="center"/>
+            <w:shd w:fill="E8EFF8"/>
+          </w:tcPr>
+          <w:p>
+            <w:pPr>
+              <w:pStyle w:val="ExampleTableText"/>
+              <w:spacing w:before="40" w:after="40"/>
+            </w:pPr>
+            <w:r>
+              <w:rPr>
+                <w:b/>
+              </w:rPr>
+              <w:t>Table</w:t>
+            </w:r>
+          </w:p>
+        </w:tc>
+        <w:tc>
+          <w:tcPr>
+            <w:tcW w:type="dxa" w:w="1640"/>
+            <w:vAlign w:val="center"/>
+            <w:shd w:fill="E8EFF8"/>
+          </w:tcPr>
+          <w:p>
+            <w:pPr>
+              <w:pStyle w:val="ExampleTableText"/>
+              <w:spacing w:before="40" w:after="40"/>
+            </w:pPr>
+            <w:r>
+              <w:rPr>
+                <w:b/>
+              </w:rPr>
+              <w:t>Row grain</w:t>
+            </w:r>
+          </w:p>
+        </w:tc>
+        <w:tc>
+          <w:tcPr>
+            <w:tcW w:type="dxa" w:w="3420"/>
+            <w:vAlign w:val="center"/>
+            <w:shd w:fill="E8EFF8"/>
+          </w:tcPr>
+          <w:p>
+            <w:pPr>
+              <w:pStyle w:val="ExampleTableText"/>
+              <w:spacing w:before="40" w:after="40"/>
+            </w:pPr>
+            <w:r>
+              <w:rPr>
+                <w:b/>
+              </w:rPr>
+              <w:t>Function</w:t>
+            </w:r>
+          </w:p>
+        </w:tc>
+        <w:tc>
+          <w:tcPr>
+            <w:tcW w:type="dxa" w:w="1700"/>
+            <w:vAlign w:val="center"/>
+            <w:shd w:fill="E8EFF8"/>
+          </w:tcPr>
+          <w:p>
+            <w:pPr>
+              <w:pStyle w:val="ExampleTableText"/>
+              <w:spacing w:before="40" w:after="40"/>
+            </w:pPr>
+            <w:r>
+              <w:rPr>
+                <w:b/>
+              </w:rPr>
+              <w:t>Used next by</w:t>
+            </w:r>
+          </w:p>
+        </w:tc>
+      </w:tr>
+      <w:tr>
+        <w:trPr>
+          <w:cantSplit/>
+        </w:trPr>
+        <w:tc>
+          <w:tcPr>
+            <w:tcW w:type="dxa" w:w="2600"/>
+            <w:vAlign w:val="center"/>
+          </w:tcPr>
+          <w:p>
+            <w:pPr>
+              <w:pStyle w:val="ExampleTableText"/>
+              <w:spacing w:before="40" w:after="40"/>
+            </w:pPr>
+            <w:r>
+              <w:t>t_delivery_source_records</w:t>
+            </w:r>
+          </w:p>
+        </w:tc>
+        <w:tc>
+          <w:tcPr>
+            <w:tcW w:type="dxa" w:w="1640"/>
+            <w:vAlign w:val="center"/>
+          </w:tcPr>
+          <w:p>
+            <w:pPr>
+              <w:pStyle w:val="ExampleTableText"/>
+              <w:spacing w:before="40" w:after="40"/>
+            </w:pPr>
+            <w:r>
+              <w:t>One row per eligible source delivery report</w:t>
+            </w:r>
+          </w:p>
+        </w:tc>
+        <w:tc>
+          <w:tcPr>
+            <w:tcW w:type="dxa" w:w="3420"/>
+            <w:vAlign w:val="center"/>
+          </w:tcPr>
+          <w:p>
+            <w:pPr>
+              <w:pStyle w:val="ExampleTableText"/>
+              <w:spacing w:before="40" w:after="40"/>
+            </w:pPr>
+            <w:r>
+              <w:t>Standardizes dated delivery evidence from SIGIZI, EPUS, SIMRS, Kobo, neonatal outcomes and facility reporting. Excludes abortus-only evidence from the delivery spine.</w:t>
+            </w:r>
+          </w:p>
+        </w:tc>
+        <w:tc>
+          <w:tcPr>
+            <w:tcW w:type="dxa" w:w="1700"/>
+            <w:vAlign w:val="center"/>
+          </w:tcPr>
+          <w:p>
+            <w:pPr>
+              <w:pStyle w:val="ExampleTableText"/>
+              <w:spacing w:before="40" w:after="40"/>
+            </w:pPr>
+            <w:r>
+              <w:t>Delivery deduplication base</w:t>
+            </w:r>
+          </w:p>
+        </w:tc>
+      </w:tr>
+      <w:tr>
+        <w:trPr>
+          <w:cantSplit/>
+        </w:trPr>
+        <w:tc>
+          <w:tcPr>
+            <w:tcW w:type="dxa" w:w="2600"/>
+            <w:vAlign w:val="center"/>
+          </w:tcPr>
+          <w:p>
+            <w:pPr>
+              <w:pStyle w:val="ExampleTableText"/>
+              <w:spacing w:before="40" w:after="40"/>
+            </w:pPr>
+            <w:r>
+              <w:t>t_delivery_dedup_base</w:t>
+            </w:r>
+          </w:p>
+        </w:tc>
+        <w:tc>
+          <w:tcPr>
+            <w:tcW w:type="dxa" w:w="1640"/>
+            <w:vAlign w:val="center"/>
+          </w:tcPr>
+          <w:p>
+            <w:pPr>
+              <w:pStyle w:val="ExampleTableText"/>
+              <w:spacing w:before="40" w:after="40"/>
+            </w:pPr>
+            <w:r>
+              <w:t>One row per prepared source delivery report</w:t>
+            </w:r>
+          </w:p>
+        </w:tc>
+        <w:tc>
+          <w:tcPr>
+            <w:tcW w:type="dxa" w:w="3420"/>
+            <w:vAlign w:val="center"/>
+          </w:tcPr>
+          <w:p>
+            <w:pPr>
+              <w:pStyle w:val="ExampleTableText"/>
+              <w:spacing w:before="40" w:after="40"/>
+            </w:pPr>
+            <w:r>
+              <w:t>Adds compact names, trusted-NIK flags and a record-quality score. It is the comparison-ready evidence used to generate possible same-delivery edges.</w:t>
+            </w:r>
+          </w:p>
+        </w:tc>
+        <w:tc>
+          <w:tcPr>
+            <w:tcW w:type="dxa" w:w="1700"/>
+            <w:vAlign w:val="center"/>
+          </w:tcPr>
+          <w:p>
+            <w:pPr>
+              <w:pStyle w:val="ExampleTableText"/>
+              <w:spacing w:before="40" w:after="40"/>
+            </w:pPr>
+            <w:r>
+              <w:t>Pair features, candidate edges and both member maps</w:t>
+            </w:r>
+          </w:p>
+        </w:tc>
+      </w:tr>
+      <w:tr>
+        <w:trPr>
+          <w:cantSplit/>
+        </w:trPr>
+        <w:tc>
+          <w:tcPr>
+            <w:tcW w:type="dxa" w:w="2600"/>
+            <w:vAlign w:val="center"/>
+          </w:tcPr>
+          <w:p>
+            <w:pPr>
+              <w:pStyle w:val="ExampleTableText"/>
+              <w:spacing w:before="40" w:after="40"/>
+            </w:pPr>
+            <w:r>
+              <w:t>t_delivery_event_member_map</w:t>
+            </w:r>
+          </w:p>
+        </w:tc>
+        <w:tc>
+          <w:tcPr>
+            <w:tcW w:type="dxa" w:w="1640"/>
+            <w:vAlign w:val="center"/>
+          </w:tcPr>
+          <w:p>
+            <w:pPr>
+              <w:pStyle w:val="ExampleTableText"/>
+              <w:spacing w:before="40" w:after="40"/>
+            </w:pPr>
+            <w:r>
+              <w:t>One row per source delivery report</w:t>
+            </w:r>
+          </w:p>
+        </w:tc>
+        <w:tc>
+          <w:tcPr>
+            <w:tcW w:type="dxa" w:w="3420"/>
+            <w:vAlign w:val="center"/>
+          </w:tcPr>
+          <w:p>
+            <w:pPr>
+              <w:pStyle w:val="ExampleTableText"/>
+              <w:spacing w:before="40" w:after="40"/>
+            </w:pPr>
+            <w:r>
+              <w:t>Maps each source event to its preliminary canonical delivery event before ANC linkage. Connected components with incompatible trusted NIKs are separated for safety.</w:t>
+            </w:r>
+          </w:p>
+        </w:tc>
+        <w:tc>
+          <w:tcPr>
+            <w:tcW w:type="dxa" w:w="1700"/>
+            <w:vAlign w:val="center"/>
+          </w:tcPr>
+          <w:p>
+            <w:pPr>
+              <w:pStyle w:val="ExampleTableText"/>
+              <w:spacing w:before="40" w:after="40"/>
+            </w:pPr>
+            <w:r>
+              <w:t>Unlinked delivery master, direct rescue and final member map</w:t>
+            </w:r>
+          </w:p>
+        </w:tc>
+      </w:tr>
+      <w:tr>
+        <w:trPr>
+          <w:cantSplit/>
+        </w:trPr>
+        <w:tc>
+          <w:tcPr>
+            <w:tcW w:type="dxa" w:w="2600"/>
+            <w:vAlign w:val="center"/>
+          </w:tcPr>
+          <w:p>
+            <w:pPr>
+              <w:pStyle w:val="ExampleTableText"/>
+              <w:spacing w:before="40" w:after="40"/>
+            </w:pPr>
+            <w:r>
+              <w:t>t_delivery_event_master_unlinked</w:t>
+            </w:r>
+          </w:p>
+        </w:tc>
+        <w:tc>
+          <w:tcPr>
+            <w:tcW w:type="dxa" w:w="1640"/>
+            <w:vAlign w:val="center"/>
+          </w:tcPr>
+          <w:p>
+            <w:pPr>
+              <w:pStyle w:val="ExampleTableText"/>
+              <w:spacing w:before="40" w:after="40"/>
+            </w:pPr>
+            <w:r>
+              <w:t>One row per preliminary canonical delivery</w:t>
+            </w:r>
+          </w:p>
+        </w:tc>
+        <w:tc>
+          <w:tcPr>
+            <w:tcW w:type="dxa" w:w="3420"/>
+            <w:vAlign w:val="center"/>
+          </w:tcPr>
+          <w:p>
+            <w:pPr>
+              <w:pStyle w:val="ExampleTableText"/>
+              <w:spacing w:before="40" w:after="40"/>
+            </w:pPr>
+            <w:r>
+              <w:t>Aggregates reports believed to describe the same delivery and selects representative identity, geography, date, outcome and source fields. Unlinked means pregnancy linkage has not yet been applied.</w:t>
+            </w:r>
+          </w:p>
+        </w:tc>
+        <w:tc>
+          <w:tcPr>
+            <w:tcW w:type="dxa" w:w="1700"/>
+            <w:vAlign w:val="center"/>
+          </w:tcPr>
+          <w:p>
+            <w:pPr>
+              <w:pStyle w:val="ExampleTableText"/>
+              <w:spacing w:before="40" w:after="40"/>
+            </w:pPr>
+            <w:r>
+              <w:t>Pregnancy candidates, direct rescue and post-link consolidation</w:t>
+            </w:r>
+          </w:p>
+        </w:tc>
+      </w:tr>
+    </w:tbl>
+    <w:p>
+      <w:pPr>
+        <w:pStyle w:val="CaptionText"/>
+        <w:pageBreakBefore w:val="0"/>
+        <w:spacing w:after="20"/>
+      </w:pPr>
+    </w:p>
+    <w:p>
+      <w:pPr>
+        <w:pStyle w:val="CaptionText"/>
+        <w:pageBreakBefore w:val="0"/>
+      </w:pPr>
+      <w:r>
+        <w:t>Delivery deduplication asks whether several reports describe one birth. Pregnancy linkage is a later and different decision.</w:t>
+      </w:r>
+    </w:p>
+    <w:p>
+      <w:pPr>
+        <w:pStyle w:val="Heading2"/>
+        <w:pageBreakBefore/>
+      </w:pPr>
+      <w:r>
+        <w:t>Appendix: final delivery tables and lineage</w:t>
+      </w:r>
+    </w:p>
+    <w:p>
+      <w:pPr>
+        <w:pageBreakBefore w:val="0"/>
+      </w:pPr>
+      <w:r>
+        <w:t>The second delivery phase links canonical deliveries to pregnancy episodes, handles ambiguous or implausible candidates, and consolidates compatible post-link clusters.</w:t>
+      </w:r>
+    </w:p>
+    <w:tbl>
+      <w:tblPr>
+        <w:tblStyle w:val="TableGrid"/>
+        <w:tblW w:type="dxa" w:w="9360"/>
+        <w:tblLayout w:type="fixed"/>
+        <w:tblLook w:firstColumn="1" w:firstRow="1" w:lastColumn="0" w:lastRow="0" w:noHBand="0" w:noVBand="1" w:val="04A0"/>
+        <w:tblInd w:w="120" w:type="dxa"/>
+        <w:tblCellMar>
+          <w:top w:w="85" w:type="dxa"/>
+          <w:bottom w:w="85" w:type="dxa"/>
+          <w:left w:w="120" w:type="dxa"/>
+          <w:right w:w="120" w:type="dxa"/>
+        </w:tblCellMar>
+      </w:tblPr>
+      <w:tblGrid>
+        <w:gridCol w:w="2600"/>
+        <w:gridCol w:w="1640"/>
+        <w:gridCol w:w="3420"/>
+        <w:gridCol w:w="1700"/>
+      </w:tblGrid>
+      <w:tr>
+        <w:trPr>
+          <w:cantSplit/>
+          <w:tblHeader/>
+        </w:trPr>
+        <w:tc>
+          <w:tcPr>
+            <w:tcW w:type="dxa" w:w="2600"/>
+            <w:vAlign w:val="center"/>
+            <w:shd w:fill="E8EFF8"/>
+          </w:tcPr>
+          <w:p>
+            <w:pPr>
+              <w:pStyle w:val="ExampleTableText"/>
+              <w:spacing w:before="40" w:after="40"/>
+            </w:pPr>
+            <w:r>
+              <w:rPr>
+                <w:b/>
+              </w:rPr>
+              <w:t>Table</w:t>
+            </w:r>
+          </w:p>
+        </w:tc>
+        <w:tc>
+          <w:tcPr>
+            <w:tcW w:type="dxa" w:w="1640"/>
+            <w:vAlign w:val="center"/>
+            <w:shd w:fill="E8EFF8"/>
+          </w:tcPr>
+          <w:p>
+            <w:pPr>
+              <w:pStyle w:val="ExampleTableText"/>
+              <w:spacing w:before="40" w:after="40"/>
+            </w:pPr>
+            <w:r>
+              <w:rPr>
+                <w:b/>
+              </w:rPr>
+              <w:t>Row grain</w:t>
+            </w:r>
+          </w:p>
+        </w:tc>
+        <w:tc>
+          <w:tcPr>
+            <w:tcW w:type="dxa" w:w="3420"/>
+            <w:vAlign w:val="center"/>
+            <w:shd w:fill="E8EFF8"/>
+          </w:tcPr>
+          <w:p>
+            <w:pPr>
+              <w:pStyle w:val="ExampleTableText"/>
+              <w:spacing w:before="40" w:after="40"/>
+            </w:pPr>
+            <w:r>
+              <w:rPr>
+                <w:b/>
+              </w:rPr>
+              <w:t>Function</w:t>
+            </w:r>
+          </w:p>
+        </w:tc>
+        <w:tc>
+          <w:tcPr>
+            <w:tcW w:type="dxa" w:w="1700"/>
+            <w:vAlign w:val="center"/>
+            <w:shd w:fill="E8EFF8"/>
+          </w:tcPr>
+          <w:p>
+            <w:pPr>
+              <w:pStyle w:val="ExampleTableText"/>
+              <w:spacing w:before="40" w:after="40"/>
+            </w:pPr>
+            <w:r>
+              <w:rPr>
+                <w:b/>
+              </w:rPr>
+              <w:t>Used next by</w:t>
+            </w:r>
+          </w:p>
+        </w:tc>
+      </w:tr>
+      <w:tr>
+        <w:trPr>
+          <w:cantSplit/>
+        </w:trPr>
+        <w:tc>
+          <w:tcPr>
+            <w:tcW w:type="dxa" w:w="2600"/>
+            <w:vAlign w:val="center"/>
+          </w:tcPr>
+          <w:p>
+            <w:pPr>
+              <w:pStyle w:val="ExampleTableText"/>
+              <w:spacing w:before="40" w:after="40"/>
+            </w:pPr>
+            <w:r>
+              <w:t>t_delivery_sigizi_direct_rescue_v3</w:t>
+            </w:r>
+          </w:p>
+        </w:tc>
+        <w:tc>
+          <w:tcPr>
+            <w:tcW w:type="dxa" w:w="1640"/>
+            <w:vAlign w:val="center"/>
+          </w:tcPr>
+          <w:p>
+            <w:pPr>
+              <w:pStyle w:val="ExampleTableText"/>
+              <w:spacing w:before="40" w:after="40"/>
+            </w:pPr>
+            <w:r>
+              <w:t>One row per uniquely rescued delivery-pregnancy pair</w:t>
+            </w:r>
+          </w:p>
+        </w:tc>
+        <w:tc>
+          <w:tcPr>
+            <w:tcW w:type="dxa" w:w="3420"/>
+            <w:vAlign w:val="center"/>
+          </w:tcPr>
+          <w:p>
+            <w:pPr>
+              <w:pStyle w:val="ExampleTableText"/>
+              <w:spacing w:before="40" w:after="40"/>
+            </w:pPr>
+            <w:r>
+              <w:t>For a delivery without an ordinary ANC candidate, checks whether the delivery and pregnancy share an original SIGIZI source record. It accepts only a unique pregnancy with plausible source-level HPHT or HPL timing.</w:t>
+            </w:r>
+          </w:p>
+        </w:tc>
+        <w:tc>
+          <w:tcPr>
+            <w:tcW w:type="dxa" w:w="1700"/>
+            <w:vAlign w:val="center"/>
+          </w:tcPr>
+          <w:p>
+            <w:pPr>
+              <w:pStyle w:val="ExampleTableText"/>
+              <w:spacing w:before="40" w:after="40"/>
+            </w:pPr>
+            <w:r>
+              <w:t>Final pregnancy-candidate pool</w:t>
+            </w:r>
+          </w:p>
+        </w:tc>
+      </w:tr>
+      <w:tr>
+        <w:trPr>
+          <w:cantSplit/>
+        </w:trPr>
+        <w:tc>
+          <w:tcPr>
+            <w:tcW w:type="dxa" w:w="2600"/>
+            <w:vAlign w:val="center"/>
+          </w:tcPr>
+          <w:p>
+            <w:pPr>
+              <w:pStyle w:val="ExampleTableText"/>
+              <w:spacing w:before="40" w:after="40"/>
+            </w:pPr>
+            <w:r>
+              <w:t>t_delivery_event_member_map_v3</w:t>
+            </w:r>
+          </w:p>
+        </w:tc>
+        <w:tc>
+          <w:tcPr>
+            <w:tcW w:type="dxa" w:w="1640"/>
+            <w:vAlign w:val="center"/>
+          </w:tcPr>
+          <w:p>
+            <w:pPr>
+              <w:pStyle w:val="ExampleTableText"/>
+              <w:spacing w:before="40" w:after="40"/>
+            </w:pPr>
+            <w:r>
+              <w:t>One row per source delivery report</w:t>
+            </w:r>
+          </w:p>
+        </w:tc>
+        <w:tc>
+          <w:tcPr>
+            <w:tcW w:type="dxa" w:w="3420"/>
+            <w:vAlign w:val="center"/>
+          </w:tcPr>
+          <w:p>
+            <w:pPr>
+              <w:pStyle w:val="ExampleTableText"/>
+              <w:spacing w:before="40" w:after="40"/>
+            </w:pPr>
+            <w:r>
+              <w:t>Final lineage map from source event to preliminary delivery event, final post-link delivery event and pregnancy episode. It also records collision status.</w:t>
+            </w:r>
+          </w:p>
+        </w:tc>
+        <w:tc>
+          <w:tcPr>
+            <w:tcW w:type="dxa" w:w="1700"/>
+            <w:vAlign w:val="center"/>
+          </w:tcPr>
+          <w:p>
+            <w:pPr>
+              <w:pStyle w:val="ExampleTableText"/>
+              <w:spacing w:before="40" w:after="40"/>
+            </w:pPr>
+            <w:r>
+              <w:t>Final delivery master, audits, weight and source analysis</w:t>
+            </w:r>
+          </w:p>
+        </w:tc>
+      </w:tr>
+      <w:tr>
+        <w:trPr>
+          <w:cantSplit/>
+        </w:trPr>
+        <w:tc>
+          <w:tcPr>
+            <w:tcW w:type="dxa" w:w="2600"/>
+            <w:vAlign w:val="center"/>
+          </w:tcPr>
+          <w:p>
+            <w:pPr>
+              <w:pStyle w:val="ExampleTableText"/>
+              <w:spacing w:before="40" w:after="40"/>
+            </w:pPr>
+            <w:r>
+              <w:t>t_delivery_event_master_v3</w:t>
+            </w:r>
+          </w:p>
+        </w:tc>
+        <w:tc>
+          <w:tcPr>
+            <w:tcW w:type="dxa" w:w="1640"/>
+            <w:vAlign w:val="center"/>
+          </w:tcPr>
+          <w:p>
+            <w:pPr>
+              <w:pStyle w:val="ExampleTableText"/>
+              <w:spacing w:before="40" w:after="40"/>
+            </w:pPr>
+            <w:r>
+              <w:t>One row per final canonical delivery</w:t>
+            </w:r>
+          </w:p>
+        </w:tc>
+        <w:tc>
+          <w:tcPr>
+            <w:tcW w:type="dxa" w:w="3420"/>
+            <w:vAlign w:val="center"/>
+          </w:tcPr>
+          <w:p>
+            <w:pPr>
+              <w:pStyle w:val="ExampleTableText"/>
+              <w:spacing w:before="40" w:after="40"/>
+            </w:pPr>
+            <w:r>
+              <w:t>Final delivery table after pregnancy linkage and collision handling. Selects canonical date by source consensus, consolidates identity and outcomes, and exposes ANC-link status and QA diagnostics.</w:t>
+            </w:r>
+          </w:p>
+        </w:tc>
+        <w:tc>
+          <w:tcPr>
+            <w:tcW w:type="dxa" w:w="1700"/>
+            <w:vAlign w:val="center"/>
+          </w:tcPr>
+          <w:p>
+            <w:pPr>
+              <w:pStyle w:val="ExampleTableText"/>
+              <w:spacing w:before="40" w:after="40"/>
+            </w:pPr>
+            <w:r>
+              <w:t>Validated delivery and integrated reporting views</w:t>
+            </w:r>
+          </w:p>
+        </w:tc>
+      </w:tr>
+    </w:tbl>
+    <w:p>
+      <w:pPr>
+        <w:pStyle w:val="CaptionText"/>
+        <w:pageBreakBefore w:val="0"/>
+        <w:spacing w:after="20"/>
+      </w:pPr>
+    </w:p>
+    <w:p>
+      <w:pPr>
+        <w:pStyle w:val="Heading3"/>
+        <w:pageBreakBefore w:val="0"/>
+      </w:pPr>
+      <w:r>
+        <w:t>How to interpret the names</w:t>
+      </w:r>
+    </w:p>
+    <w:tbl>
+      <w:tblPr>
+        <w:tblStyle w:val="TableGrid"/>
+        <w:tblW w:type="dxa" w:w="9360"/>
+        <w:tblLayout w:type="fixed"/>
+        <w:tblLook w:firstColumn="1" w:firstRow="1" w:lastColumn="0" w:lastRow="0" w:noHBand="0" w:noVBand="1" w:val="04A0"/>
+        <w:tblInd w:w="120" w:type="dxa"/>
+        <w:tblCellMar>
+          <w:top w:w="85" w:type="dxa"/>
+          <w:bottom w:w="85" w:type="dxa"/>
+          <w:left w:w="120" w:type="dxa"/>
+          <w:right w:w="120" w:type="dxa"/>
+        </w:tblCellMar>
+      </w:tblPr>
+      <w:tblGrid>
+        <w:gridCol w:w="2600"/>
+        <w:gridCol w:w="6760"/>
+      </w:tblGrid>
+      <w:tr>
+        <w:trPr>
+          <w:cantSplit/>
+          <w:tblHeader/>
+        </w:trPr>
+        <w:tc>
+          <w:tcPr>
+            <w:tcW w:type="dxa" w:w="2600"/>
+            <w:vAlign w:val="center"/>
+            <w:shd w:fill="E8EFF8"/>
+          </w:tcPr>
+          <w:p>
+            <w:pPr>
+              <w:pStyle w:val="ExampleTableText"/>
+              <w:spacing w:before="40" w:after="40"/>
+            </w:pPr>
+            <w:r>
+              <w:rPr>
+                <w:b/>
+              </w:rPr>
+              <w:t>Name pattern</w:t>
+            </w:r>
+          </w:p>
+        </w:tc>
+        <w:tc>
+          <w:tcPr>
+            <w:tcW w:type="dxa" w:w="6760"/>
+            <w:vAlign w:val="center"/>
+            <w:shd w:fill="E8EFF8"/>
+          </w:tcPr>
+          <w:p>
+            <w:pPr>
+              <w:pStyle w:val="ExampleTableText"/>
+              <w:spacing w:before="40" w:after="40"/>
+            </w:pPr>
+            <w:r>
+              <w:rPr>
+                <w:b/>
+              </w:rPr>
+              <w:t>Meaning</w:t>
+            </w:r>
+          </w:p>
+        </w:tc>
+      </w:tr>
+      <w:tr>
+        <w:trPr>
+          <w:cantSplit/>
+        </w:trPr>
+        <w:tc>
+          <w:tcPr>
+            <w:tcW w:type="dxa" w:w="2600"/>
+            <w:vAlign w:val="center"/>
+          </w:tcPr>
+          <w:p>
+            <w:pPr>
+              <w:pStyle w:val="ExampleTableText"/>
+              <w:spacing w:before="40" w:after="40"/>
+            </w:pPr>
+            <w:r>
+              <w:t>canonical_map</w:t>
+            </w:r>
+          </w:p>
+        </w:tc>
+        <w:tc>
+          <w:tcPr>
+            <w:tcW w:type="dxa" w:w="6760"/>
+            <w:vAlign w:val="center"/>
+          </w:tcPr>
+          <w:p>
+            <w:pPr>
+              <w:pStyle w:val="ExampleTableText"/>
+              <w:spacing w:before="40" w:after="40"/>
+            </w:pPr>
+            <w:r>
+              <w:t>Crosswalk showing which original or preliminary record belongs to which canonical record.</w:t>
+            </w:r>
+          </w:p>
+        </w:tc>
+      </w:tr>
+      <w:tr>
+        <w:trPr>
+          <w:cantSplit/>
+        </w:trPr>
+        <w:tc>
+          <w:tcPr>
+            <w:tcW w:type="dxa" w:w="2600"/>
+            <w:vAlign w:val="center"/>
+          </w:tcPr>
+          <w:p>
+            <w:pPr>
+              <w:pStyle w:val="ExampleTableText"/>
+              <w:spacing w:before="40" w:after="40"/>
+            </w:pPr>
+            <w:r>
+              <w:t>member_map</w:t>
+            </w:r>
+          </w:p>
+        </w:tc>
+        <w:tc>
+          <w:tcPr>
+            <w:tcW w:type="dxa" w:w="6760"/>
+            <w:vAlign w:val="center"/>
+          </w:tcPr>
+          <w:p>
+            <w:pPr>
+              <w:pStyle w:val="ExampleTableText"/>
+              <w:spacing w:before="40" w:after="40"/>
+            </w:pPr>
+            <w:r>
+              <w:t>Lineage showing which source delivery reports contribute to a canonical delivery event.</w:t>
+            </w:r>
+          </w:p>
+        </w:tc>
+      </w:tr>
+      <w:tr>
+        <w:trPr>
+          <w:cantSplit/>
+        </w:trPr>
+        <w:tc>
+          <w:tcPr>
+            <w:tcW w:type="dxa" w:w="2600"/>
+            <w:vAlign w:val="center"/>
+          </w:tcPr>
+          <w:p>
+            <w:pPr>
+              <w:pStyle w:val="ExampleTableText"/>
+              <w:spacing w:before="40" w:after="40"/>
+            </w:pPr>
+            <w:r>
+              <w:t>master_unlinked</w:t>
+            </w:r>
+          </w:p>
+        </w:tc>
+        <w:tc>
+          <w:tcPr>
+            <w:tcW w:type="dxa" w:w="6760"/>
+            <w:vAlign w:val="center"/>
+          </w:tcPr>
+          <w:p>
+            <w:pPr>
+              <w:pStyle w:val="ExampleTableText"/>
+              <w:spacing w:before="40" w:after="40"/>
+            </w:pPr>
+            <w:r>
+              <w:t>Canonical delivery before a pregnancy or ANC link has been accepted.</w:t>
+            </w:r>
+          </w:p>
+        </w:tc>
+      </w:tr>
+      <w:tr>
+        <w:trPr>
+          <w:cantSplit/>
+        </w:trPr>
+        <w:tc>
+          <w:tcPr>
+            <w:tcW w:type="dxa" w:w="2600"/>
+            <w:vAlign w:val="center"/>
+          </w:tcPr>
+          <w:p>
+            <w:pPr>
+              <w:pStyle w:val="ExampleTableText"/>
+              <w:spacing w:before="40" w:after="40"/>
+            </w:pPr>
+            <w:r>
+              <w:t>master_v3</w:t>
+            </w:r>
+          </w:p>
+        </w:tc>
+        <w:tc>
+          <w:tcPr>
+            <w:tcW w:type="dxa" w:w="6760"/>
+            <w:vAlign w:val="center"/>
+          </w:tcPr>
+          <w:p>
+            <w:pPr>
+              <w:pStyle w:val="ExampleTableText"/>
+              <w:spacing w:before="40" w:after="40"/>
+            </w:pPr>
+            <w:r>
+              <w:t>Final delivery after linkage, post-link consolidation and collision handling.</w:t>
+            </w:r>
+          </w:p>
+        </w:tc>
+      </w:tr>
+      <w:tr>
+        <w:trPr>
+          <w:cantSplit/>
+        </w:trPr>
+        <w:tc>
+          <w:tcPr>
+            <w:tcW w:type="dxa" w:w="2600"/>
+            <w:vAlign w:val="center"/>
+          </w:tcPr>
+          <w:p>
+            <w:pPr>
+              <w:pStyle w:val="ExampleTableText"/>
+              <w:spacing w:before="40" w:after="40"/>
+            </w:pPr>
+            <w:r>
+              <w:t>spine_v3_3</w:t>
+            </w:r>
+          </w:p>
+        </w:tc>
+        <w:tc>
+          <w:tcPr>
+            <w:tcW w:type="dxa" w:w="6760"/>
+            <w:vAlign w:val="center"/>
+          </w:tcPr>
+          <w:p>
+            <w:pPr>
+              <w:pStyle w:val="ExampleTableText"/>
+              <w:spacing w:before="40" w:after="40"/>
+            </w:pPr>
+            <w:r>
+              <w:t>Final integrated pregnancy population used by downstream processing and reporting.</w:t>
+            </w:r>
+          </w:p>
+        </w:tc>
+      </w:tr>
+      <w:tr>
+        <w:trPr>
+          <w:cantSplit/>
+        </w:trPr>
+        <w:tc>
+          <w:tcPr>
+            <w:tcW w:type="dxa" w:w="2600"/>
+            <w:vAlign w:val="center"/>
+          </w:tcPr>
+          <w:p>
+            <w:pPr>
+              <w:pStyle w:val="ExampleTableText"/>
+              <w:spacing w:before="40" w:after="40"/>
+            </w:pPr>
+            <w:r>
+              <w:t>rescue_v3</w:t>
+            </w:r>
+          </w:p>
+        </w:tc>
+        <w:tc>
+          <w:tcPr>
+            <w:tcW w:type="dxa" w:w="6760"/>
+            <w:vAlign w:val="center"/>
+          </w:tcPr>
+          <w:p>
+            <w:pPr>
+              <w:pStyle w:val="ExampleTableText"/>
+              <w:spacing w:before="40" w:after="40"/>
+            </w:pPr>
+            <w:r>
+              <w:t>Narrow helper output for valid cases that the ordinary candidate route did not reach.</w:t>
+            </w:r>
+          </w:p>
+        </w:tc>
+      </w:tr>
+    </w:tbl>
+    <w:p>
+      <w:pPr>
+        <w:pStyle w:val="CaptionText"/>
+        <w:pageBreakBefore w:val="0"/>
+        <w:spacing w:after="20"/>
+      </w:pPr>
+    </w:p>
+    <w:p>
+      <w:pPr>
+        <w:pStyle w:val="CaptionText"/>
+        <w:pageBreakBefore w:val="0"/>
+      </w:pPr>
+      <w:r>
+        <w:t>Primary analytical tables: t_pregnancy_episode_spine_v3_3 for pregnancies and t_delivery_event_master_v3 for deliveries. Maps, bases and rescue tables primarily support processing, lineage and QA.</w:t>
+      </w:r>
+    </w:p>
+    <w:p>
+      <w:pPr>
+        <w:pStyle w:val="Heading2"/>
+        <w:pageBreakBefore/>
+      </w:pPr>
+      <w:r>
+        <w:t>Appendix: reporting views and direct inputs</w:t>
       </w:r>
     </w:p>
     <w:p>
@@ -9020,7 +10969,7 @@
         <w:pageBreakBefore/>
       </w:pPr>
       <w:r>
-        <w:t>Appendix: dating, timing and weight dependencies</w:t>
+        <w:t>Appendix: dating and weight dependencies</w:t>
       </w:r>
     </w:p>
     <w:tbl>
@@ -9916,7 +11865,7 @@
         <w:pageBreakBefore/>
       </w:pPr>
       <w:r>
-        <w:t>Appendix: deploying and scheduling the deletion update</w:t>
+        <w:t>Appendix: scheduling the deletion update</w:t>
       </w:r>
     </w:p>
     <w:p>
@@ -10399,7 +12348,7 @@
         <w:pageBreakBefore/>
       </w:pPr>
       <w:r>
-        <w:t>Appendix: exact raw-source and entry-view pairs</w:t>
+        <w:t>Appendix: raw sources and entry views</w:t>
       </w:r>
     </w:p>
     <w:p>

</xml_diff>